<commit_message>
fix: sync adoption status filter when navigating from homepage to adoption center
- Homepage: fetch only status=1 animals (fix bug where adopted animals appeared in '待领养' sections)
- Homepage: pass status=1 in '查看全部' links to adoption center
- AnimalList: read route.query.status to initialize status filter
</commit_message>
<xml_diff>
--- a/浙江工业大学本科毕业论文-孔泽宇.docx
+++ b/浙江工业大学本科毕业论文-孔泽宇.docx
@@ -119,7 +119,7 @@
           </mc:Choice>
           <mc:Fallback>
             <w:pict>
-              <v:group id="_x0000_s1026" o:spid="_x0000_s1026" o:spt="203" style="height:60.75pt;width:322.5pt;" coordorigin="2520,2025" coordsize="6450,1215" o:gfxdata="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">
+              <v:group id="_x0000_s1026" o:spid="_x0000_s1026" o:spt="203" style="height:60.75pt;width:322.5pt;" coordorigin="2520,2025" coordsize="6450,1215" o:gfxdata="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">
                 <o:lock v:ext="edit" aspectratio="f"/>
                 <v:shape id="Picture 6" o:spid="_x0000_s1026" o:spt="75" type="#_x0000_t75" style="position:absolute;left:3960;top:2181;height:810;width:5010;" filled="f" o:preferrelative="t" stroked="f" coordsize="21600,21600" o:gfxdata="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">
                   <v:fill on="f" focussize="0,0"/>
@@ -950,9 +950,9 @@
           <w:lang w:eastAsia="zh-CN"/>
         </w:rPr>
       </w:pPr>
-      <w:bookmarkStart w:id="0" w:name="_Toc15325"/>
+      <w:bookmarkStart w:id="0" w:name="_Toc21219"/>
       <w:bookmarkStart w:id="1" w:name="_Toc5450"/>
-      <w:bookmarkStart w:id="2" w:name="_Toc21219"/>
+      <w:bookmarkStart w:id="2" w:name="_Toc15325"/>
       <w:r>
         <w:rPr>
           <w:rFonts w:hint="eastAsia"/>
@@ -1156,8 +1156,8 @@
           <w:lang w:val="en-US" w:eastAsia="zh-CN"/>
         </w:rPr>
       </w:pPr>
-      <w:bookmarkStart w:id="3" w:name="_Toc8581"/>
-      <w:bookmarkStart w:id="4" w:name="_Toc8317"/>
+      <w:bookmarkStart w:id="3" w:name="_Toc8317"/>
+      <w:bookmarkStart w:id="4" w:name="_Toc8581"/>
       <w:bookmarkStart w:id="5" w:name="_Toc22304"/>
       <w:r>
         <w:rPr>
@@ -1393,9 +1393,9 @@
           <w:lang w:val="en-US" w:eastAsia="zh-CN"/>
         </w:rPr>
       </w:pPr>
-      <w:bookmarkStart w:id="6" w:name="_Toc27770"/>
-      <w:bookmarkStart w:id="7" w:name="_Toc9015"/>
-      <w:bookmarkStart w:id="8" w:name="_Toc7567"/>
+      <w:bookmarkStart w:id="6" w:name="_Toc9015"/>
+      <w:bookmarkStart w:id="7" w:name="_Toc7567"/>
+      <w:bookmarkStart w:id="8" w:name="_Toc27770"/>
       <w:r>
         <w:rPr>
           <w:rFonts w:hint="eastAsia"/>
@@ -4977,8 +4977,8 @@
           <w:rFonts w:hint="default"/>
         </w:rPr>
       </w:pPr>
-      <w:bookmarkStart w:id="10" w:name="_Toc3612"/>
-      <w:bookmarkStart w:id="11" w:name="_Toc27630"/>
+      <w:bookmarkStart w:id="10" w:name="_Toc27630"/>
+      <w:bookmarkStart w:id="11" w:name="_Toc3612"/>
       <w:r>
         <w:rPr>
           <w:rFonts w:hint="eastAsia"/>
@@ -5005,8 +5005,8 @@
           <w:lang w:eastAsia="zh-Hans"/>
         </w:rPr>
       </w:pPr>
-      <w:bookmarkStart w:id="12" w:name="_Toc14089"/>
-      <w:bookmarkStart w:id="13" w:name="_Toc31201"/>
+      <w:bookmarkStart w:id="12" w:name="_Toc31201"/>
+      <w:bookmarkStart w:id="13" w:name="_Toc14089"/>
       <w:r>
         <w:rPr>
           <w:rFonts w:hint="default"/>
@@ -8066,8 +8066,8 @@
           <w:rFonts w:hint="default"/>
         </w:rPr>
       </w:pPr>
-      <w:bookmarkStart w:id="37" w:name="_Toc31788"/>
-      <w:bookmarkStart w:id="38" w:name="_Toc5220"/>
+      <w:bookmarkStart w:id="37" w:name="_Toc5220"/>
+      <w:bookmarkStart w:id="38" w:name="_Toc31788"/>
       <w:r>
         <w:rPr>
           <w:rFonts w:hint="default"/>
@@ -8158,8 +8158,8 @@
           <w:rFonts w:hint="default"/>
         </w:rPr>
       </w:pPr>
-      <w:bookmarkStart w:id="39" w:name="_Toc12446"/>
-      <w:bookmarkStart w:id="40" w:name="_Toc24540"/>
+      <w:bookmarkStart w:id="39" w:name="_Toc24540"/>
+      <w:bookmarkStart w:id="40" w:name="_Toc12446"/>
       <w:bookmarkStart w:id="41" w:name="_Toc24821"/>
       <w:r>
         <w:rPr>
@@ -8483,8 +8483,8 @@
           <w:rFonts w:hint="default"/>
         </w:rPr>
       </w:pPr>
-      <w:bookmarkStart w:id="44" w:name="_Toc24632"/>
-      <w:bookmarkStart w:id="45" w:name="_Toc3742"/>
+      <w:bookmarkStart w:id="44" w:name="_Toc3742"/>
+      <w:bookmarkStart w:id="45" w:name="_Toc24632"/>
       <w:r>
         <w:rPr>
           <w:rFonts w:hint="default"/>
@@ -8516,8 +8516,8 @@
           <w:rFonts w:hint="default"/>
         </w:rPr>
       </w:pPr>
-      <w:bookmarkStart w:id="46" w:name="_Toc20680"/>
-      <w:bookmarkStart w:id="47" w:name="_Toc28569"/>
+      <w:bookmarkStart w:id="46" w:name="_Toc28569"/>
+      <w:bookmarkStart w:id="47" w:name="_Toc20680"/>
       <w:r>
         <w:rPr>
           <w:rFonts w:hint="default"/>
@@ -8633,8 +8633,8 @@
           <w:rFonts w:hint="default"/>
         </w:rPr>
       </w:pPr>
-      <w:bookmarkStart w:id="48" w:name="_Toc21335"/>
-      <w:bookmarkStart w:id="49" w:name="_Toc14640"/>
+      <w:bookmarkStart w:id="48" w:name="_Toc14640"/>
+      <w:bookmarkStart w:id="49" w:name="_Toc21335"/>
       <w:r>
         <w:rPr>
           <w:rFonts w:hint="default"/>
@@ -10636,7 +10636,6 @@
             <w:insideH w:val="single" w:color="auto" w:sz="4" w:space="0"/>
             <w:insideV w:val="none" w:color="auto" w:sz="0" w:space="0"/>
           </w:tblBorders>
-          <w:shd w:val="clear" w:color="auto" w:fill="auto"/>
           <w:tblCellMar>
             <w:top w:w="0" w:type="dxa"/>
             <w:left w:w="108" w:type="dxa"/>
@@ -11494,8 +11493,8 @@
           <w:rFonts w:hint="default"/>
         </w:rPr>
       </w:pPr>
-      <w:bookmarkStart w:id="52" w:name="_Toc11000"/>
-      <w:bookmarkStart w:id="53" w:name="_Toc6945"/>
+      <w:bookmarkStart w:id="52" w:name="_Toc6945"/>
+      <w:bookmarkStart w:id="53" w:name="_Toc11000"/>
       <w:r>
         <w:rPr>
           <w:rFonts w:hint="default"/>
@@ -11779,9 +11778,9 @@
           <w:rFonts w:hint="eastAsia"/>
         </w:rPr>
       </w:pPr>
-      <w:bookmarkStart w:id="62" w:name="_Toc167"/>
+      <w:bookmarkStart w:id="62" w:name="_Toc5739"/>
       <w:bookmarkStart w:id="63" w:name="_Toc11937"/>
-      <w:bookmarkStart w:id="64" w:name="_Toc5739"/>
+      <w:bookmarkStart w:id="64" w:name="_Toc167"/>
       <w:r>
         <w:rPr>
           <w:rFonts w:hint="eastAsia"/>
@@ -12107,8 +12106,8 @@
           <w:rFonts w:hint="default"/>
         </w:rPr>
       </w:pPr>
-      <w:bookmarkStart w:id="67" w:name="_Toc13627"/>
-      <w:bookmarkStart w:id="68" w:name="_Toc20246"/>
+      <w:bookmarkStart w:id="67" w:name="_Toc20246"/>
+      <w:bookmarkStart w:id="68" w:name="_Toc13627"/>
       <w:r>
         <w:rPr>
           <w:rFonts w:hint="default"/>
@@ -12266,8 +12265,8 @@
           <w:rFonts w:hint="default"/>
         </w:rPr>
       </w:pPr>
-      <w:bookmarkStart w:id="69" w:name="_Toc12527"/>
-      <w:bookmarkStart w:id="70" w:name="_Toc29520"/>
+      <w:bookmarkStart w:id="69" w:name="_Toc29520"/>
+      <w:bookmarkStart w:id="70" w:name="_Toc12527"/>
       <w:r>
         <w:rPr>
           <w:rFonts w:hint="default"/>
@@ -12750,8 +12749,8 @@
           <w:rFonts w:hint="default"/>
         </w:rPr>
       </w:pPr>
-      <w:bookmarkStart w:id="73" w:name="_Toc11595"/>
-      <w:bookmarkStart w:id="74" w:name="_Toc15028"/>
+      <w:bookmarkStart w:id="73" w:name="_Toc15028"/>
+      <w:bookmarkStart w:id="74" w:name="_Toc11595"/>
       <w:r>
         <w:rPr>
           <w:rFonts w:hint="default"/>
@@ -13157,8 +13156,8 @@
           <w:rFonts w:hint="default"/>
         </w:rPr>
       </w:pPr>
-      <w:bookmarkStart w:id="79" w:name="_Toc16869"/>
-      <w:bookmarkStart w:id="80" w:name="_Toc25746"/>
+      <w:bookmarkStart w:id="79" w:name="_Toc25746"/>
+      <w:bookmarkStart w:id="80" w:name="_Toc16869"/>
       <w:r>
         <w:rPr>
           <w:rFonts w:hint="default"/>
@@ -13295,8 +13294,8 @@
           <w:lang w:val="en-US" w:eastAsia="zh-Hans"/>
         </w:rPr>
       </w:pPr>
-      <w:bookmarkStart w:id="84" w:name="_Toc17253"/>
-      <w:bookmarkStart w:id="85" w:name="_Toc2855"/>
+      <w:bookmarkStart w:id="84" w:name="_Toc2855"/>
+      <w:bookmarkStart w:id="85" w:name="_Toc17253"/>
       <w:r>
         <w:rPr>
           <w:rFonts w:hint="default"/>
@@ -13496,12 +13495,6 @@
             <w:insideH w:val="none" w:color="auto" w:sz="0" w:space="0"/>
             <w:insideV w:val="none" w:color="auto" w:sz="0" w:space="0"/>
           </w:tblBorders>
-          <w:tblCellMar>
-            <w:top w:w="0" w:type="dxa"/>
-            <w:left w:w="10" w:type="dxa"/>
-            <w:bottom w:w="0" w:type="dxa"/>
-            <w:right w:w="10" w:type="dxa"/>
-          </w:tblCellMar>
         </w:tblPrEx>
         <w:trPr>
           <w:trHeight w:val="0" w:hRule="atLeast"/>
@@ -14324,8 +14317,8 @@
           <w:lang w:val="en-US" w:eastAsia="zh-CN"/>
         </w:rPr>
       </w:pPr>
-      <w:bookmarkStart w:id="88" w:name="_Toc22150"/>
-      <w:bookmarkStart w:id="89" w:name="_Toc31623"/>
+      <w:bookmarkStart w:id="88" w:name="_Toc31623"/>
+      <w:bookmarkStart w:id="89" w:name="_Toc22150"/>
       <w:r>
         <w:rPr>
           <w:rFonts w:hint="default"/>
@@ -14505,8 +14498,8 @@
           <w:lang w:val="en-US" w:eastAsia="zh-Hans"/>
         </w:rPr>
       </w:pPr>
-      <w:bookmarkStart w:id="90" w:name="_Toc23951"/>
-      <w:bookmarkStart w:id="91" w:name="_Toc11140"/>
+      <w:bookmarkStart w:id="90" w:name="_Toc11140"/>
+      <w:bookmarkStart w:id="91" w:name="_Toc23951"/>
       <w:r>
         <w:rPr>
           <w:rFonts w:hint="default"/>
@@ -14685,8 +14678,8 @@
           <w:lang w:val="en-US" w:eastAsia="zh-CN"/>
         </w:rPr>
       </w:pPr>
-      <w:bookmarkStart w:id="94" w:name="_Toc17370"/>
-      <w:bookmarkStart w:id="95" w:name="_Toc22200"/>
+      <w:bookmarkStart w:id="94" w:name="_Toc22200"/>
+      <w:bookmarkStart w:id="95" w:name="_Toc17370"/>
       <w:r>
         <w:rPr>
           <w:rFonts w:hint="default"/>
@@ -14826,8 +14819,6 @@
         </w:rPr>
         <w:t>动物档案创建页面如下图5-3所示。</w:t>
       </w:r>
-      <w:bookmarkStart w:id="168" w:name="_GoBack"/>
-      <w:bookmarkEnd w:id="168"/>
     </w:p>
     <w:p>
       <w:pPr>
@@ -17998,8 +17989,8 @@
           <w:lang w:val="en-US" w:eastAsia="zh-CN"/>
         </w:rPr>
       </w:pPr>
-      <w:bookmarkStart w:id="114" w:name="_Toc23815"/>
-      <w:bookmarkStart w:id="115" w:name="_Toc16541"/>
+      <w:bookmarkStart w:id="114" w:name="_Toc16541"/>
+      <w:bookmarkStart w:id="115" w:name="_Toc23815"/>
       <w:r>
         <w:rPr>
           <w:rFonts w:hint="default"/>
@@ -18092,8 +18083,8 @@
           <w:lang w:val="en-US" w:eastAsia="zh-CN"/>
         </w:rPr>
       </w:pPr>
-      <w:bookmarkStart w:id="118" w:name="_Toc6379"/>
-      <w:bookmarkStart w:id="119" w:name="_Toc31611"/>
+      <w:bookmarkStart w:id="118" w:name="_Toc31611"/>
+      <w:bookmarkStart w:id="119" w:name="_Toc6379"/>
       <w:r>
         <w:rPr>
           <w:rFonts w:hint="default"/>
@@ -18680,8 +18671,8 @@
           <w:lang w:val="en-US" w:eastAsia="zh-CN"/>
         </w:rPr>
       </w:pPr>
-      <w:bookmarkStart w:id="120" w:name="_Toc23736"/>
-      <w:bookmarkStart w:id="121" w:name="_Toc27958"/>
+      <w:bookmarkStart w:id="120" w:name="_Toc27958"/>
+      <w:bookmarkStart w:id="121" w:name="_Toc23736"/>
       <w:r>
         <w:rPr>
           <w:rFonts w:hint="default"/>
@@ -18894,8 +18885,8 @@
           <w:lang w:val="en-US" w:eastAsia="zh-CN"/>
         </w:rPr>
       </w:pPr>
-      <w:bookmarkStart w:id="128" w:name="_Toc9547"/>
-      <w:bookmarkStart w:id="129" w:name="_Toc5467"/>
+      <w:bookmarkStart w:id="128" w:name="_Toc5467"/>
+      <w:bookmarkStart w:id="129" w:name="_Toc9547"/>
       <w:r>
         <w:rPr>
           <w:rFonts w:hint="default"/>
@@ -19150,8 +19141,8 @@
           <w:lang w:val="en-US" w:eastAsia="zh-CN"/>
         </w:rPr>
       </w:pPr>
-      <w:bookmarkStart w:id="132" w:name="_Toc379"/>
-      <w:bookmarkStart w:id="133" w:name="_Toc18703"/>
+      <w:bookmarkStart w:id="132" w:name="_Toc18703"/>
+      <w:bookmarkStart w:id="133" w:name="_Toc379"/>
       <w:r>
         <w:rPr>
           <w:rFonts w:hint="default"/>
@@ -19830,8 +19821,8 @@
           <w:lang w:val="en-US" w:eastAsia="zh-Hans"/>
         </w:rPr>
       </w:pPr>
-      <w:bookmarkStart w:id="136" w:name="_Toc29582"/>
-      <w:bookmarkStart w:id="137" w:name="_Toc28528"/>
+      <w:bookmarkStart w:id="136" w:name="_Toc28528"/>
+      <w:bookmarkStart w:id="137" w:name="_Toc29582"/>
       <w:r>
         <w:rPr>
           <w:rFonts w:hint="default"/>
@@ -20060,8 +20051,8 @@
           <w:lang w:val="en-US" w:eastAsia="zh-Hans"/>
         </w:rPr>
       </w:pPr>
-      <w:bookmarkStart w:id="141" w:name="_Toc21961"/>
-      <w:bookmarkStart w:id="142" w:name="_Toc30482"/>
+      <w:bookmarkStart w:id="141" w:name="_Toc30482"/>
+      <w:bookmarkStart w:id="142" w:name="_Toc21961"/>
       <w:r>
         <w:rPr>
           <w:rFonts w:hint="default"/>
@@ -20211,8 +20202,8 @@
           <w:lang w:val="en-US" w:eastAsia="zh-Hans"/>
         </w:rPr>
       </w:pPr>
-      <w:bookmarkStart w:id="143" w:name="_Toc23208"/>
-      <w:bookmarkStart w:id="144" w:name="_Toc9776"/>
+      <w:bookmarkStart w:id="143" w:name="_Toc9776"/>
+      <w:bookmarkStart w:id="144" w:name="_Toc23208"/>
       <w:r>
         <w:rPr>
           <w:rFonts w:hint="default"/>
@@ -21130,8 +21121,8 @@
           <w:lang w:val="en-US" w:eastAsia="zh-Hans"/>
         </w:rPr>
       </w:pPr>
-      <w:bookmarkStart w:id="145" w:name="_Toc19539"/>
-      <w:bookmarkStart w:id="146" w:name="_Toc13911"/>
+      <w:bookmarkStart w:id="145" w:name="_Toc13911"/>
+      <w:bookmarkStart w:id="146" w:name="_Toc19539"/>
       <w:r>
         <w:rPr>
           <w:rFonts w:hint="eastAsia"/>
@@ -26281,6 +26272,12 @@
             <w:insideH w:val="single" w:color="auto" w:sz="4" w:space="0"/>
             <w:insideV w:val="single" w:color="auto" w:sz="4" w:space="0"/>
           </w:tblBorders>
+          <w:tblCellMar>
+            <w:top w:w="0" w:type="dxa"/>
+            <w:left w:w="10" w:type="dxa"/>
+            <w:bottom w:w="0" w:type="dxa"/>
+            <w:right w:w="10" w:type="dxa"/>
+          </w:tblCellMar>
         </w:tblPrEx>
         <w:tc>
           <w:tcPr>
@@ -27766,8 +27763,8 @@
           <w:lang w:val="en-US" w:eastAsia="zh-Hans"/>
         </w:rPr>
       </w:pPr>
-      <w:bookmarkStart w:id="147" w:name="_Toc6330"/>
-      <w:bookmarkStart w:id="148" w:name="_Toc27134"/>
+      <w:bookmarkStart w:id="147" w:name="_Toc27134"/>
+      <w:bookmarkStart w:id="148" w:name="_Toc6330"/>
       <w:r>
         <w:rPr>
           <w:rFonts w:hint="eastAsia"/>
@@ -27935,8 +27932,8 @@
           <w:rFonts w:hint="default"/>
         </w:rPr>
       </w:pPr>
-      <w:bookmarkStart w:id="152" w:name="_Toc14500"/>
-      <w:bookmarkStart w:id="153" w:name="_Toc510"/>
+      <w:bookmarkStart w:id="152" w:name="_Toc510"/>
+      <w:bookmarkStart w:id="153" w:name="_Toc14500"/>
       <w:r>
         <w:rPr>
           <w:rFonts w:hint="eastAsia"/>
@@ -28261,9 +28258,9 @@
           <w:rFonts w:hint="eastAsia"/>
         </w:rPr>
       </w:pPr>
-      <w:bookmarkStart w:id="156" w:name="_Toc30715"/>
-      <w:bookmarkStart w:id="157" w:name="_Toc9452"/>
-      <w:bookmarkStart w:id="158" w:name="_Toc9844"/>
+      <w:bookmarkStart w:id="156" w:name="_Toc9844"/>
+      <w:bookmarkStart w:id="157" w:name="_Toc30715"/>
+      <w:bookmarkStart w:id="158" w:name="_Toc9452"/>
       <w:r>
         <w:rPr>
           <w:rFonts w:hint="eastAsia"/>
@@ -28454,7 +28451,72 @@
           <w:szCs w:val="21"/>
           <w:lang w:val="en-US" w:eastAsia="zh-CN"/>
         </w:rPr>
-        <w:t>CHUA D, RAND J, MORTON J. Stray and owner-relinquished cats in Australia—Estimation of numbers entering municipal pounds, shelters and rescue groups and their outcomes[J]. Animals, 2023, 13(11).</w:t>
+        <w:t>C</w:t>
+      </w:r>
+      <w:r>
+        <w:rPr>
+          <w:rFonts w:hint="eastAsia" w:cs="Times New Roman"/>
+          <w:sz w:val="21"/>
+          <w:szCs w:val="21"/>
+          <w:lang w:val="en-US" w:eastAsia="zh-CN"/>
+        </w:rPr>
+        <w:t>hua</w:t>
+      </w:r>
+      <w:r>
+        <w:rPr>
+          <w:rFonts w:hint="default" w:ascii="Times New Roman" w:hAnsi="Times New Roman" w:cs="Times New Roman"/>
+          <w:sz w:val="21"/>
+          <w:szCs w:val="21"/>
+          <w:lang w:val="en-US" w:eastAsia="zh-CN"/>
+        </w:rPr>
+        <w:t xml:space="preserve"> D, R</w:t>
+      </w:r>
+      <w:r>
+        <w:rPr>
+          <w:rFonts w:hint="eastAsia" w:cs="Times New Roman"/>
+          <w:sz w:val="21"/>
+          <w:szCs w:val="21"/>
+          <w:lang w:val="en-US" w:eastAsia="zh-CN"/>
+        </w:rPr>
+        <w:t>and</w:t>
+      </w:r>
+      <w:r>
+        <w:rPr>
+          <w:rFonts w:hint="default" w:ascii="Times New Roman" w:hAnsi="Times New Roman" w:cs="Times New Roman"/>
+          <w:sz w:val="21"/>
+          <w:szCs w:val="21"/>
+          <w:lang w:val="en-US" w:eastAsia="zh-CN"/>
+        </w:rPr>
+        <w:t xml:space="preserve"> J, M</w:t>
+      </w:r>
+      <w:r>
+        <w:rPr>
+          <w:rFonts w:hint="eastAsia" w:cs="Times New Roman"/>
+          <w:sz w:val="21"/>
+          <w:szCs w:val="21"/>
+          <w:lang w:val="en-US" w:eastAsia="zh-CN"/>
+        </w:rPr>
+        <w:t>orton</w:t>
+      </w:r>
+      <w:r>
+        <w:rPr>
+          <w:rFonts w:hint="default" w:ascii="Times New Roman" w:hAnsi="Times New Roman" w:cs="Times New Roman"/>
+          <w:sz w:val="21"/>
+          <w:szCs w:val="21"/>
+          <w:lang w:val="en-US" w:eastAsia="zh-CN"/>
+        </w:rPr>
+        <w:t xml:space="preserve"> J. Stray </w:t>
+      </w:r>
+      <w:bookmarkStart w:id="168" w:name="_GoBack"/>
+      <w:bookmarkEnd w:id="168"/>
+      <w:r>
+        <w:rPr>
+          <w:rFonts w:hint="default" w:ascii="Times New Roman" w:hAnsi="Times New Roman" w:cs="Times New Roman"/>
+          <w:sz w:val="21"/>
+          <w:szCs w:val="21"/>
+          <w:lang w:val="en-US" w:eastAsia="zh-CN"/>
+        </w:rPr>
+        <w:t>and owner-relinquished cats in Australia—Estimation of numbers entering municipal pounds, shelters and rescue groups and their outcomes[J]. Animals, 2023, 13(11).</w:t>
       </w:r>
     </w:p>
     <w:p>
@@ -28499,7 +28561,61 @@
           <w:szCs w:val="21"/>
           <w:lang w:val="en-US" w:eastAsia="zh-CN"/>
         </w:rPr>
-        <w:t>CHUA D, RAND J, MORTON J. Surrendered and stray dogs in Australia—Estimation of numbers entering municipal pounds, shelters and rescue groups and their outcomes[J]. Animals, 2017, 7(7).</w:t>
+        <w:t>C</w:t>
+      </w:r>
+      <w:r>
+        <w:rPr>
+          <w:rFonts w:hint="eastAsia" w:cs="Times New Roman"/>
+          <w:sz w:val="21"/>
+          <w:szCs w:val="21"/>
+          <w:lang w:val="en-US" w:eastAsia="zh-CN"/>
+        </w:rPr>
+        <w:t>hua</w:t>
+      </w:r>
+      <w:r>
+        <w:rPr>
+          <w:rFonts w:hint="default" w:ascii="Times New Roman" w:hAnsi="Times New Roman" w:cs="Times New Roman"/>
+          <w:sz w:val="21"/>
+          <w:szCs w:val="21"/>
+          <w:lang w:val="en-US" w:eastAsia="zh-CN"/>
+        </w:rPr>
+        <w:t xml:space="preserve"> D, R</w:t>
+      </w:r>
+      <w:r>
+        <w:rPr>
+          <w:rFonts w:hint="eastAsia" w:cs="Times New Roman"/>
+          <w:sz w:val="21"/>
+          <w:szCs w:val="21"/>
+          <w:lang w:val="en-US" w:eastAsia="zh-CN"/>
+        </w:rPr>
+        <w:t>and</w:t>
+      </w:r>
+      <w:r>
+        <w:rPr>
+          <w:rFonts w:hint="default" w:ascii="Times New Roman" w:hAnsi="Times New Roman" w:cs="Times New Roman"/>
+          <w:sz w:val="21"/>
+          <w:szCs w:val="21"/>
+          <w:lang w:val="en-US" w:eastAsia="zh-CN"/>
+        </w:rPr>
+        <w:t xml:space="preserve"> J, M</w:t>
+      </w:r>
+      <w:r>
+        <w:rPr>
+          <w:rFonts w:hint="eastAsia" w:cs="Times New Roman"/>
+          <w:sz w:val="21"/>
+          <w:szCs w:val="21"/>
+          <w:lang w:val="en-US" w:eastAsia="zh-CN"/>
+        </w:rPr>
+        <w:t>orton</w:t>
+      </w:r>
+      <w:r>
+        <w:rPr>
+          <w:rFonts w:hint="default" w:ascii="Times New Roman" w:hAnsi="Times New Roman" w:cs="Times New Roman"/>
+          <w:sz w:val="21"/>
+          <w:szCs w:val="21"/>
+          <w:lang w:val="en-US" w:eastAsia="zh-CN"/>
+        </w:rPr>
+        <w:t xml:space="preserve"> J. Surrendered and stray dogs in Australia—Estimation of numbers entering municipal pounds, shelters and rescue groups and their outcomes[J]. Animals, 2017, 7(7).</w:t>
       </w:r>
     </w:p>
     <w:p>
@@ -28672,7 +28788,61 @@
           <w:szCs w:val="21"/>
           <w:lang w:val="en-US" w:eastAsia="zh-CN"/>
         </w:rPr>
-        <w:t>RODRIGUEZ K S R, GALINDO J D A, JUAN J T, et al. Secure development methodology for full stack web applications: Proof of the methodology applied to Vue.js, Spring Boot and MySQL[J]. Computers, Materials &amp; Continua, 2025, 85(1).</w:t>
+        <w:t>R</w:t>
+      </w:r>
+      <w:r>
+        <w:rPr>
+          <w:rFonts w:hint="eastAsia" w:cs="Times New Roman"/>
+          <w:sz w:val="21"/>
+          <w:szCs w:val="21"/>
+          <w:lang w:val="en-US" w:eastAsia="zh-CN"/>
+        </w:rPr>
+        <w:t>odriguez</w:t>
+      </w:r>
+      <w:r>
+        <w:rPr>
+          <w:rFonts w:hint="default" w:ascii="Times New Roman" w:hAnsi="Times New Roman" w:cs="Times New Roman"/>
+          <w:sz w:val="21"/>
+          <w:szCs w:val="21"/>
+          <w:lang w:val="en-US" w:eastAsia="zh-CN"/>
+        </w:rPr>
+        <w:t xml:space="preserve"> K S R, G</w:t>
+      </w:r>
+      <w:r>
+        <w:rPr>
+          <w:rFonts w:hint="eastAsia" w:cs="Times New Roman"/>
+          <w:sz w:val="21"/>
+          <w:szCs w:val="21"/>
+          <w:lang w:val="en-US" w:eastAsia="zh-CN"/>
+        </w:rPr>
+        <w:t>alindo</w:t>
+      </w:r>
+      <w:r>
+        <w:rPr>
+          <w:rFonts w:hint="default" w:ascii="Times New Roman" w:hAnsi="Times New Roman" w:cs="Times New Roman"/>
+          <w:sz w:val="21"/>
+          <w:szCs w:val="21"/>
+          <w:lang w:val="en-US" w:eastAsia="zh-CN"/>
+        </w:rPr>
+        <w:t xml:space="preserve"> J D A, J</w:t>
+      </w:r>
+      <w:r>
+        <w:rPr>
+          <w:rFonts w:hint="eastAsia" w:cs="Times New Roman"/>
+          <w:sz w:val="21"/>
+          <w:szCs w:val="21"/>
+          <w:lang w:val="en-US" w:eastAsia="zh-CN"/>
+        </w:rPr>
+        <w:t>uan</w:t>
+      </w:r>
+      <w:r>
+        <w:rPr>
+          <w:rFonts w:hint="default" w:ascii="Times New Roman" w:hAnsi="Times New Roman" w:cs="Times New Roman"/>
+          <w:sz w:val="21"/>
+          <w:szCs w:val="21"/>
+          <w:lang w:val="en-US" w:eastAsia="zh-CN"/>
+        </w:rPr>
+        <w:t xml:space="preserve"> J T, et al. Secure development methodology for full stack web applications: Proof of the methodology applied to Vue.js, Spring Boot and MySQL[J]. Computers, Materials &amp; Continua, 2025, 85(1).</w:t>
       </w:r>
     </w:p>
     <w:p>
@@ -28755,7 +28925,79 @@
           <w:szCs w:val="21"/>
           <w:lang w:val="en-US" w:eastAsia="zh-CN"/>
         </w:rPr>
-        <w:t>SUN Y, ZOU Y, GENG A, ZHANG H. Design and implementation of sports social information management system based on Spring Boot[J]. Journal of Electronic Research and Application, 2025, 9(3).</w:t>
+        <w:t>S</w:t>
+      </w:r>
+      <w:r>
+        <w:rPr>
+          <w:rFonts w:hint="eastAsia" w:cs="Times New Roman"/>
+          <w:sz w:val="21"/>
+          <w:szCs w:val="21"/>
+          <w:lang w:val="en-US" w:eastAsia="zh-CN"/>
+        </w:rPr>
+        <w:t>un</w:t>
+      </w:r>
+      <w:r>
+        <w:rPr>
+          <w:rFonts w:hint="default" w:ascii="Times New Roman" w:hAnsi="Times New Roman" w:cs="Times New Roman"/>
+          <w:sz w:val="21"/>
+          <w:szCs w:val="21"/>
+          <w:lang w:val="en-US" w:eastAsia="zh-CN"/>
+        </w:rPr>
+        <w:t xml:space="preserve"> Y, Z</w:t>
+      </w:r>
+      <w:r>
+        <w:rPr>
+          <w:rFonts w:hint="eastAsia" w:cs="Times New Roman"/>
+          <w:sz w:val="21"/>
+          <w:szCs w:val="21"/>
+          <w:lang w:val="en-US" w:eastAsia="zh-CN"/>
+        </w:rPr>
+        <w:t>ou</w:t>
+      </w:r>
+      <w:r>
+        <w:rPr>
+          <w:rFonts w:hint="default" w:ascii="Times New Roman" w:hAnsi="Times New Roman" w:cs="Times New Roman"/>
+          <w:sz w:val="21"/>
+          <w:szCs w:val="21"/>
+          <w:lang w:val="en-US" w:eastAsia="zh-CN"/>
+        </w:rPr>
+        <w:t xml:space="preserve"> Y, G</w:t>
+      </w:r>
+      <w:r>
+        <w:rPr>
+          <w:rFonts w:hint="eastAsia" w:cs="Times New Roman"/>
+          <w:sz w:val="21"/>
+          <w:szCs w:val="21"/>
+          <w:lang w:val="en-US" w:eastAsia="zh-CN"/>
+        </w:rPr>
+        <w:t>eng</w:t>
+      </w:r>
+      <w:r>
+        <w:rPr>
+          <w:rFonts w:hint="default" w:ascii="Times New Roman" w:hAnsi="Times New Roman" w:cs="Times New Roman"/>
+          <w:sz w:val="21"/>
+          <w:szCs w:val="21"/>
+          <w:lang w:val="en-US" w:eastAsia="zh-CN"/>
+        </w:rPr>
+        <w:t xml:space="preserve"> A, Z</w:t>
+      </w:r>
+      <w:r>
+        <w:rPr>
+          <w:rFonts w:hint="eastAsia" w:cs="Times New Roman"/>
+          <w:sz w:val="21"/>
+          <w:szCs w:val="21"/>
+          <w:lang w:val="en-US" w:eastAsia="zh-CN"/>
+        </w:rPr>
+        <w:t>hang</w:t>
+      </w:r>
+      <w:r>
+        <w:rPr>
+          <w:rFonts w:hint="default" w:ascii="Times New Roman" w:hAnsi="Times New Roman" w:cs="Times New Roman"/>
+          <w:sz w:val="21"/>
+          <w:szCs w:val="21"/>
+          <w:lang w:val="en-US" w:eastAsia="zh-CN"/>
+        </w:rPr>
+        <w:t xml:space="preserve"> H. Design and implementation of sports social information management system based on Spring Boot[J]. Journal of Electronic Research and Application, 2025, 9(3).</w:t>
       </w:r>
     </w:p>
     <w:p>
@@ -29445,9 +29687,9 @@
           <w:lang w:eastAsia="zh-CN"/>
         </w:rPr>
       </w:pPr>
-      <w:bookmarkStart w:id="165" w:name="_Toc5532"/>
-      <w:bookmarkStart w:id="166" w:name="_Toc17853"/>
-      <w:bookmarkStart w:id="167" w:name="_Toc20181"/>
+      <w:bookmarkStart w:id="165" w:name="_Toc20181"/>
+      <w:bookmarkStart w:id="166" w:name="_Toc5532"/>
+      <w:bookmarkStart w:id="167" w:name="_Toc17853"/>
       <w:r>
         <w:rPr>
           <w:rFonts w:hint="eastAsia"/>

</xml_diff>

<commit_message>
feat: add 透明公示 nav button between 捐赠 and 小常识
</commit_message>
<xml_diff>
--- a/浙江工业大学本科毕业论文-孔泽宇.docx
+++ b/浙江工业大学本科毕业论文-孔泽宇.docx
@@ -9529,12 +9529,6 @@
             <w:insideH w:val="none" w:color="auto" w:sz="4" w:space="0"/>
             <w:insideV w:val="none" w:color="auto" w:sz="4" w:space="0"/>
           </w:tblBorders>
-          <w:tblCellMar>
-            <w:top w:w="0" w:type="dxa"/>
-            <w:left w:w="108" w:type="dxa"/>
-            <w:bottom w:w="0" w:type="dxa"/>
-            <w:right w:w="108" w:type="dxa"/>
-          </w:tblCellMar>
         </w:tblPrEx>
         <w:trPr>
           <w:trHeight w:val="397" w:hRule="atLeast"/>
@@ -13495,6 +13489,12 @@
             <w:insideH w:val="none" w:color="auto" w:sz="0" w:space="0"/>
             <w:insideV w:val="none" w:color="auto" w:sz="0" w:space="0"/>
           </w:tblBorders>
+          <w:tblCellMar>
+            <w:top w:w="0" w:type="dxa"/>
+            <w:left w:w="10" w:type="dxa"/>
+            <w:bottom w:w="0" w:type="dxa"/>
+            <w:right w:w="10" w:type="dxa"/>
+          </w:tblCellMar>
         </w:tblPrEx>
         <w:trPr>
           <w:trHeight w:val="0" w:hRule="atLeast"/>
@@ -14134,13 +14134,6 @@
         <w:spacing w:line="300" w:lineRule="auto"/>
         <w:ind w:left="0" w:leftChars="0" w:firstLine="0" w:firstLineChars="0"/>
         <w:jc w:val="both"/>
-        <w:rPr>
-          <w:rFonts w:hint="default" w:cstheme="minorBidi"/>
-          <w:kern w:val="2"/>
-          <w:sz w:val="24"/>
-          <w:szCs w:val="22"/>
-          <w:lang w:val="en-US" w:eastAsia="zh-CN" w:bidi="ar-SA"/>
-        </w:rPr>
       </w:pPr>
       <w:r>
         <w:drawing>
@@ -14189,6 +14182,26 @@
     <w:p>
       <w:pPr>
         <w:widowControl w:val="0"/>
+        <w:bidi w:val="0"/>
+        <w:spacing w:line="300" w:lineRule="auto"/>
+        <w:ind w:left="0" w:leftChars="0" w:firstLine="0" w:firstLineChars="0"/>
+        <w:jc w:val="both"/>
+        <w:rPr>
+          <w:rFonts w:hint="default" w:eastAsia="宋体"/>
+          <w:lang w:val="en-US" w:eastAsia="zh-CN"/>
+        </w:rPr>
+      </w:pPr>
+      <w:r>
+        <w:rPr>
+          <w:rFonts w:hint="eastAsia"/>
+          <w:lang w:val="en-US" w:eastAsia="zh-CN"/>
+        </w:rPr>
+        <w:t>图5-2 用户注册界面</w:t>
+      </w:r>
+    </w:p>
+    <w:p>
+      <w:pPr>
+        <w:widowControl w:val="0"/>
         <w:spacing w:line="300" w:lineRule="auto"/>
         <w:ind w:firstLine="422" w:firstLineChars="200"/>
         <w:jc w:val="center"/>
@@ -14776,22 +14789,32 @@
         <w:ind w:leftChars="0" w:firstLine="480" w:firstLineChars="200"/>
         <w:jc w:val="both"/>
         <w:rPr>
+          <w:rFonts w:hint="eastAsia" w:cstheme="minorBidi"/>
+          <w:kern w:val="2"/>
+          <w:sz w:val="24"/>
+          <w:szCs w:val="22"/>
+          <w:lang w:val="en-US" w:eastAsia="zh-CN" w:bidi="ar-SA"/>
+        </w:rPr>
+      </w:pPr>
+      <w:r>
+        <w:rPr>
           <w:rFonts w:hint="eastAsia" w:ascii="Times New Roman" w:hAnsi="Times New Roman" w:eastAsia="宋体" w:cstheme="minorBidi"/>
           <w:kern w:val="2"/>
           <w:sz w:val="24"/>
           <w:szCs w:val="22"/>
           <w:lang w:val="en-US" w:eastAsia="zh-CN" w:bidi="ar-SA"/>
         </w:rPr>
-      </w:pPr>
-      <w:r>
-        <w:rPr>
-          <w:rFonts w:hint="eastAsia" w:ascii="Times New Roman" w:hAnsi="Times New Roman" w:eastAsia="宋体" w:cstheme="minorBidi"/>
+        <w:t>动物档案后台分页查询接口（/api/animals/admin）为管理员提供了带关键词搜索和条件筛选的分页列表。该接口支持按 page 和 pageSize 进行分页控制，按 keyword 在动物名称、编号、活动范围和地点字段中进行模糊搜索（使用 LIKE 查询），同时支持按类别和状态进行精准筛选。查询结果按更新时间倒序排列，返回包含 records（当前页记录列表）和 total（总记录数）的分页数据结构。</w:t>
+      </w:r>
+      <w:r>
+        <w:rPr>
+          <w:rFonts w:hint="eastAsia" w:cstheme="minorBidi"/>
           <w:kern w:val="2"/>
           <w:sz w:val="24"/>
           <w:szCs w:val="22"/>
           <w:lang w:val="en-US" w:eastAsia="zh-CN" w:bidi="ar-SA"/>
         </w:rPr>
-        <w:t>动物档案后台分页查询接口（/api/animals/admin）为管理员提供了带关键词搜索和条件筛选的分页列表。该接口支持按 page 和 pageSize 进行分页控制，按 keyword 在动物名称、编号、活动范围和地点字段中进行模糊搜索（使用 LIKE 查询），同时支持按类别和状态进行精准筛选。查询结果按更新时间倒序排列，返回包含 records（当前页记录列表）和 total（总记录数）的分页数据结构。</w:t>
+        <w:t>领养中心页面如图5-3所示。</w:t>
       </w:r>
     </w:p>
     <w:p>
@@ -14802,7 +14825,7 @@
         <w:ind w:leftChars="0" w:firstLine="480" w:firstLineChars="200"/>
         <w:jc w:val="both"/>
         <w:rPr>
-          <w:rFonts w:hint="default" w:ascii="Times New Roman" w:hAnsi="Times New Roman" w:eastAsia="宋体" w:cstheme="minorBidi"/>
+          <w:rFonts w:hint="default" w:cstheme="minorBidi"/>
           <w:kern w:val="2"/>
           <w:sz w:val="24"/>
           <w:szCs w:val="22"/>
@@ -14810,14 +14833,47 @@
         </w:rPr>
       </w:pPr>
       <w:r>
-        <w:rPr>
-          <w:rFonts w:hint="eastAsia" w:cstheme="minorBidi"/>
-          <w:kern w:val="2"/>
-          <w:sz w:val="24"/>
-          <w:szCs w:val="22"/>
-          <w:lang w:val="en-US" w:eastAsia="zh-CN" w:bidi="ar-SA"/>
-        </w:rPr>
-        <w:t>动物档案创建页面如下图5-3所示。</w:t>
+        <w:drawing>
+          <wp:inline distT="0" distB="0" distL="114300" distR="114300">
+            <wp:extent cx="5266690" cy="2608580"/>
+            <wp:effectExtent l="0" t="0" r="10160" b="1270"/>
+            <wp:docPr id="3" name="图片 3"/>
+            <wp:cNvGraphicFramePr>
+              <a:graphicFrameLocks xmlns:a="http://schemas.openxmlformats.org/drawingml/2006/main" noChangeAspect="1"/>
+            </wp:cNvGraphicFramePr>
+            <a:graphic xmlns:a="http://schemas.openxmlformats.org/drawingml/2006/main">
+              <a:graphicData uri="http://schemas.openxmlformats.org/drawingml/2006/picture">
+                <pic:pic xmlns:pic="http://schemas.openxmlformats.org/drawingml/2006/picture">
+                  <pic:nvPicPr>
+                    <pic:cNvPr id="3" name="图片 3"/>
+                    <pic:cNvPicPr>
+                      <a:picLocks noChangeAspect="1"/>
+                    </pic:cNvPicPr>
+                  </pic:nvPicPr>
+                  <pic:blipFill>
+                    <a:blip r:embed="rId13"/>
+                    <a:stretch>
+                      <a:fillRect/>
+                    </a:stretch>
+                  </pic:blipFill>
+                  <pic:spPr>
+                    <a:xfrm>
+                      <a:off x="0" y="0"/>
+                      <a:ext cx="5266690" cy="2608580"/>
+                    </a:xfrm>
+                    <a:prstGeom prst="rect">
+                      <a:avLst/>
+                    </a:prstGeom>
+                    <a:noFill/>
+                    <a:ln>
+                      <a:noFill/>
+                    </a:ln>
+                  </pic:spPr>
+                </pic:pic>
+              </a:graphicData>
+            </a:graphic>
+          </wp:inline>
+        </w:drawing>
       </w:r>
     </w:p>
     <w:p>
@@ -14958,7 +15014,7 @@
           <w:szCs w:val="22"/>
           <w:lang w:val="en-US" w:eastAsia="zh-CN" w:bidi="ar-SA"/>
         </w:rPr>
-        <w:t>领养申请提交接口为登录用户提供了在线提交领养申请的功能。领养申请提交接口详细信息见表 5-8。</w:t>
+        <w:t>领养申请提交接口为登录用户提供了在线提交领养申请的功能。</w:t>
       </w:r>
     </w:p>
     <w:p>
@@ -14969,515 +15025,33 @@
         <w:ind w:leftChars="0" w:firstLine="480" w:firstLineChars="200"/>
         <w:jc w:val="both"/>
         <w:rPr>
+          <w:rFonts w:hint="eastAsia" w:cstheme="minorBidi"/>
+          <w:kern w:val="2"/>
+          <w:sz w:val="24"/>
+          <w:szCs w:val="22"/>
+          <w:lang w:val="en-US" w:eastAsia="zh-CN" w:bidi="ar-SA"/>
+        </w:rPr>
+      </w:pPr>
+      <w:r>
+        <w:rPr>
           <w:rFonts w:hint="eastAsia" w:ascii="Times New Roman" w:hAnsi="Times New Roman" w:eastAsia="宋体" w:cstheme="minorBidi"/>
           <w:kern w:val="2"/>
           <w:sz w:val="24"/>
           <w:szCs w:val="22"/>
           <w:lang w:val="en-US" w:eastAsia="zh-CN" w:bidi="ar-SA"/>
         </w:rPr>
-      </w:pPr>
-    </w:p>
-    <w:p>
-      <w:pPr>
-        <w:widowControl w:val="0"/>
-        <w:spacing w:line="300" w:lineRule="auto"/>
-        <w:ind w:firstLine="422" w:firstLineChars="200"/>
-        <w:jc w:val="center"/>
-        <w:rPr>
-          <w:rFonts w:hint="default" w:ascii="Times New Roman" w:hAnsi="Times New Roman" w:eastAsia="宋体" w:cs="Times New Roman"/>
-          <w:b/>
-          <w:bCs/>
-          <w:kern w:val="2"/>
-          <w:sz w:val="21"/>
-          <w:szCs w:val="21"/>
-          <w:lang w:val="en-US" w:eastAsia="zh-CN" w:bidi="ar-SA"/>
-        </w:rPr>
-      </w:pPr>
-      <w:r>
-        <w:rPr>
-          <w:rFonts w:hint="default" w:ascii="Times New Roman" w:hAnsi="Times New Roman" w:eastAsia="宋体" w:cs="Times New Roman"/>
-          <w:b/>
-          <w:bCs/>
-          <w:kern w:val="2"/>
-          <w:sz w:val="21"/>
-          <w:szCs w:val="21"/>
-          <w:lang w:val="en-US" w:eastAsia="zh-CN" w:bidi="ar-SA"/>
-        </w:rPr>
-        <w:t>表 5-8 领养申请提交接口</w:t>
-      </w:r>
-    </w:p>
-    <w:p>
-      <w:pPr>
-        <w:widowControl w:val="0"/>
-        <w:spacing w:line="300" w:lineRule="auto"/>
-        <w:ind w:firstLine="422" w:firstLineChars="200"/>
-        <w:jc w:val="center"/>
-        <w:rPr>
-          <w:rFonts w:hint="default" w:ascii="Times New Roman" w:hAnsi="Times New Roman" w:eastAsia="宋体" w:cs="Times New Roman"/>
-          <w:b/>
-          <w:bCs/>
-          <w:kern w:val="2"/>
-          <w:sz w:val="21"/>
-          <w:szCs w:val="21"/>
-          <w:lang w:val="en-US" w:eastAsia="zh-CN" w:bidi="ar-SA"/>
-        </w:rPr>
-      </w:pPr>
-      <w:r>
-        <w:rPr>
-          <w:rFonts w:hint="default" w:ascii="Times New Roman" w:hAnsi="Times New Roman" w:eastAsia="宋体" w:cs="Times New Roman"/>
-          <w:b/>
-          <w:bCs/>
-          <w:kern w:val="2"/>
-          <w:sz w:val="21"/>
-          <w:szCs w:val="21"/>
-          <w:lang w:val="en-US" w:eastAsia="zh-CN" w:bidi="ar-SA"/>
-        </w:rPr>
-        <w:t>Table 5-8 Adoption Application Submission Interface</w:t>
-      </w:r>
-    </w:p>
-    <w:tbl>
-      <w:tblPr>
-        <w:tblStyle w:val="19"/>
-        <w:tblW w:w="8660" w:type="dxa"/>
-        <w:jc w:val="center"/>
-        <w:tblBorders>
-          <w:top w:val="none" w:color="auto" w:sz="0" w:space="0"/>
-          <w:left w:val="none" w:color="auto" w:sz="0" w:space="0"/>
-          <w:bottom w:val="none" w:color="auto" w:sz="0" w:space="0"/>
-          <w:right w:val="none" w:color="auto" w:sz="0" w:space="0"/>
-          <w:insideH w:val="none" w:color="auto" w:sz="0" w:space="0"/>
-          <w:insideV w:val="none" w:color="auto" w:sz="0" w:space="0"/>
-        </w:tblBorders>
-        <w:tblLayout w:type="autofit"/>
-        <w:tblCellMar>
-          <w:top w:w="0" w:type="dxa"/>
-          <w:left w:w="10" w:type="dxa"/>
-          <w:bottom w:w="0" w:type="dxa"/>
-          <w:right w:w="10" w:type="dxa"/>
-        </w:tblCellMar>
-      </w:tblPr>
-      <w:tblGrid>
-        <w:gridCol w:w="2016"/>
-        <w:gridCol w:w="6644"/>
-      </w:tblGrid>
-      <w:tr>
-        <w:tblPrEx>
-          <w:tblBorders>
-            <w:top w:val="none" w:color="auto" w:sz="0" w:space="0"/>
-            <w:left w:val="none" w:color="auto" w:sz="0" w:space="0"/>
-            <w:bottom w:val="none" w:color="auto" w:sz="0" w:space="0"/>
-            <w:right w:val="none" w:color="auto" w:sz="0" w:space="0"/>
-            <w:insideH w:val="none" w:color="auto" w:sz="0" w:space="0"/>
-            <w:insideV w:val="none" w:color="auto" w:sz="0" w:space="0"/>
-          </w:tblBorders>
-          <w:tblCellMar>
-            <w:top w:w="0" w:type="dxa"/>
-            <w:left w:w="10" w:type="dxa"/>
-            <w:bottom w:w="0" w:type="dxa"/>
-            <w:right w:w="10" w:type="dxa"/>
-          </w:tblCellMar>
-        </w:tblPrEx>
-        <w:trPr>
-          <w:trHeight w:val="0" w:hRule="atLeast"/>
-          <w:tblHeader/>
-          <w:jc w:val="center"/>
-        </w:trPr>
-        <w:tc>
-          <w:tcPr>
-            <w:tcW w:w="2016" w:type="dxa"/>
-            <w:tcBorders>
-              <w:top w:val="single" w:color="auto" w:sz="12" w:space="0"/>
-              <w:left w:val="nil"/>
-              <w:bottom w:val="nil"/>
-              <w:right w:val="nil"/>
-            </w:tcBorders>
-            <w:shd w:val="clear" w:color="F2F2F2" w:fill="auto"/>
-            <w:noWrap w:val="0"/>
-            <w:tcMar>
-              <w:top w:w="-1" w:type="dxa"/>
-              <w:left w:w="-1" w:type="dxa"/>
-              <w:bottom w:w="-1" w:type="dxa"/>
-              <w:right w:w="-1" w:type="dxa"/>
-            </w:tcMar>
-            <w:vAlign w:val="center"/>
-          </w:tcPr>
-          <w:p>
-            <w:pPr>
-              <w:pStyle w:val="28"/>
-              <w:bidi w:val="0"/>
-            </w:pPr>
-            <w:r>
-              <w:t>接口名称</w:t>
-            </w:r>
-          </w:p>
-        </w:tc>
-        <w:tc>
-          <w:tcPr>
-            <w:tcW w:w="6644" w:type="dxa"/>
-            <w:tcBorders>
-              <w:top w:val="single" w:color="auto" w:sz="12" w:space="0"/>
-              <w:left w:val="nil"/>
-              <w:bottom w:val="nil"/>
-              <w:right w:val="nil"/>
-            </w:tcBorders>
-            <w:noWrap w:val="0"/>
-            <w:tcMar>
-              <w:top w:w="-1" w:type="dxa"/>
-              <w:left w:w="-1" w:type="dxa"/>
-              <w:bottom w:w="-1" w:type="dxa"/>
-              <w:right w:w="-1" w:type="dxa"/>
-            </w:tcMar>
-            <w:vAlign w:val="center"/>
-          </w:tcPr>
-          <w:p>
-            <w:pPr>
-              <w:pStyle w:val="28"/>
-              <w:bidi w:val="0"/>
-            </w:pPr>
-            <w:r>
-              <w:t>领养申请提交</w:t>
-            </w:r>
-          </w:p>
-        </w:tc>
-      </w:tr>
-      <w:tr>
-        <w:tblPrEx>
-          <w:tblBorders>
-            <w:top w:val="none" w:color="auto" w:sz="0" w:space="0"/>
-            <w:left w:val="none" w:color="auto" w:sz="0" w:space="0"/>
-            <w:bottom w:val="none" w:color="auto" w:sz="0" w:space="0"/>
-            <w:right w:val="none" w:color="auto" w:sz="0" w:space="0"/>
-            <w:insideH w:val="none" w:color="auto" w:sz="0" w:space="0"/>
-            <w:insideV w:val="none" w:color="auto" w:sz="0" w:space="0"/>
-          </w:tblBorders>
-          <w:tblCellMar>
-            <w:top w:w="0" w:type="dxa"/>
-            <w:left w:w="10" w:type="dxa"/>
-            <w:bottom w:w="0" w:type="dxa"/>
-            <w:right w:w="10" w:type="dxa"/>
-          </w:tblCellMar>
-        </w:tblPrEx>
-        <w:trPr>
-          <w:trHeight w:val="0" w:hRule="atLeast"/>
-          <w:tblHeader/>
-          <w:jc w:val="center"/>
-        </w:trPr>
-        <w:tc>
-          <w:tcPr>
-            <w:tcW w:w="2016" w:type="dxa"/>
-            <w:tcBorders>
-              <w:top w:val="single" w:color="auto" w:sz="4" w:space="0"/>
-              <w:left w:val="nil"/>
-              <w:bottom w:val="nil"/>
-              <w:right w:val="nil"/>
-            </w:tcBorders>
-            <w:shd w:val="clear" w:color="F2F2F2" w:fill="auto"/>
-            <w:noWrap w:val="0"/>
-            <w:tcMar>
-              <w:top w:w="-1" w:type="dxa"/>
-              <w:left w:w="-1" w:type="dxa"/>
-              <w:bottom w:w="-1" w:type="dxa"/>
-              <w:right w:w="-1" w:type="dxa"/>
-            </w:tcMar>
-            <w:vAlign w:val="center"/>
-          </w:tcPr>
-          <w:p>
-            <w:pPr>
-              <w:pStyle w:val="28"/>
-              <w:bidi w:val="0"/>
-            </w:pPr>
-            <w:r>
-              <w:t>接口 URL</w:t>
-            </w:r>
-          </w:p>
-        </w:tc>
-        <w:tc>
-          <w:tcPr>
-            <w:tcW w:w="6644" w:type="dxa"/>
-            <w:tcBorders>
-              <w:top w:val="single" w:color="auto" w:sz="4" w:space="0"/>
-              <w:left w:val="nil"/>
-              <w:bottom w:val="nil"/>
-              <w:right w:val="nil"/>
-            </w:tcBorders>
-            <w:noWrap w:val="0"/>
-            <w:tcMar>
-              <w:top w:w="-1" w:type="dxa"/>
-              <w:left w:w="-1" w:type="dxa"/>
-              <w:bottom w:w="-1" w:type="dxa"/>
-              <w:right w:w="-1" w:type="dxa"/>
-            </w:tcMar>
-            <w:vAlign w:val="center"/>
-          </w:tcPr>
-          <w:p>
-            <w:pPr>
-              <w:pStyle w:val="27"/>
-              <w:bidi w:val="0"/>
-            </w:pPr>
-            <w:r>
-              <w:t>/api/adoption-applications</w:t>
-            </w:r>
-          </w:p>
-        </w:tc>
-      </w:tr>
-      <w:tr>
-        <w:tblPrEx>
-          <w:tblBorders>
-            <w:top w:val="none" w:color="auto" w:sz="0" w:space="0"/>
-            <w:left w:val="none" w:color="auto" w:sz="0" w:space="0"/>
-            <w:bottom w:val="none" w:color="auto" w:sz="0" w:space="0"/>
-            <w:right w:val="none" w:color="auto" w:sz="0" w:space="0"/>
-            <w:insideH w:val="none" w:color="auto" w:sz="0" w:space="0"/>
-            <w:insideV w:val="none" w:color="auto" w:sz="0" w:space="0"/>
-          </w:tblBorders>
-          <w:tblCellMar>
-            <w:top w:w="0" w:type="dxa"/>
-            <w:left w:w="10" w:type="dxa"/>
-            <w:bottom w:w="0" w:type="dxa"/>
-            <w:right w:w="10" w:type="dxa"/>
-          </w:tblCellMar>
-        </w:tblPrEx>
-        <w:trPr>
-          <w:trHeight w:val="0" w:hRule="atLeast"/>
-          <w:tblHeader/>
-          <w:jc w:val="center"/>
-        </w:trPr>
-        <w:tc>
-          <w:tcPr>
-            <w:tcW w:w="2016" w:type="dxa"/>
-            <w:tcBorders>
-              <w:top w:val="nil"/>
-              <w:left w:val="nil"/>
-              <w:bottom w:val="nil"/>
-              <w:right w:val="nil"/>
-            </w:tcBorders>
-            <w:shd w:val="clear" w:color="F2F2F2" w:fill="auto"/>
-            <w:noWrap w:val="0"/>
-            <w:tcMar>
-              <w:top w:w="-1" w:type="dxa"/>
-              <w:left w:w="-1" w:type="dxa"/>
-              <w:bottom w:w="-1" w:type="dxa"/>
-              <w:right w:w="-1" w:type="dxa"/>
-            </w:tcMar>
-            <w:vAlign w:val="center"/>
-          </w:tcPr>
-          <w:p>
-            <w:pPr>
-              <w:pStyle w:val="28"/>
-              <w:bidi w:val="0"/>
-            </w:pPr>
-            <w:r>
-              <w:t>请求方式</w:t>
-            </w:r>
-          </w:p>
-        </w:tc>
-        <w:tc>
-          <w:tcPr>
-            <w:tcW w:w="6644" w:type="dxa"/>
-            <w:tcBorders>
-              <w:top w:val="nil"/>
-              <w:left w:val="nil"/>
-              <w:bottom w:val="nil"/>
-              <w:right w:val="nil"/>
-            </w:tcBorders>
-            <w:noWrap w:val="0"/>
-            <w:tcMar>
-              <w:top w:w="-1" w:type="dxa"/>
-              <w:left w:w="-1" w:type="dxa"/>
-              <w:bottom w:w="-1" w:type="dxa"/>
-              <w:right w:w="-1" w:type="dxa"/>
-            </w:tcMar>
-            <w:vAlign w:val="center"/>
-          </w:tcPr>
-          <w:p>
-            <w:pPr>
-              <w:pStyle w:val="27"/>
-              <w:bidi w:val="0"/>
-            </w:pPr>
-            <w:r>
-              <w:t>POST</w:t>
-            </w:r>
-          </w:p>
-        </w:tc>
-      </w:tr>
-      <w:tr>
-        <w:tblPrEx>
-          <w:tblBorders>
-            <w:top w:val="none" w:color="auto" w:sz="0" w:space="0"/>
-            <w:left w:val="none" w:color="auto" w:sz="0" w:space="0"/>
-            <w:bottom w:val="none" w:color="auto" w:sz="0" w:space="0"/>
-            <w:right w:val="none" w:color="auto" w:sz="0" w:space="0"/>
-            <w:insideH w:val="none" w:color="auto" w:sz="0" w:space="0"/>
-            <w:insideV w:val="none" w:color="auto" w:sz="0" w:space="0"/>
-          </w:tblBorders>
-          <w:tblCellMar>
-            <w:top w:w="0" w:type="dxa"/>
-            <w:left w:w="10" w:type="dxa"/>
-            <w:bottom w:w="0" w:type="dxa"/>
-            <w:right w:w="10" w:type="dxa"/>
-          </w:tblCellMar>
-        </w:tblPrEx>
-        <w:trPr>
-          <w:trHeight w:val="0" w:hRule="atLeast"/>
-          <w:tblHeader/>
-          <w:jc w:val="center"/>
-        </w:trPr>
-        <w:tc>
-          <w:tcPr>
-            <w:tcW w:w="2016" w:type="dxa"/>
-            <w:tcBorders>
-              <w:top w:val="nil"/>
-              <w:left w:val="nil"/>
-              <w:bottom w:val="nil"/>
-              <w:right w:val="nil"/>
-            </w:tcBorders>
-            <w:shd w:val="clear" w:color="F2F2F2" w:fill="auto"/>
-            <w:noWrap w:val="0"/>
-            <w:tcMar>
-              <w:top w:w="-1" w:type="dxa"/>
-              <w:left w:w="-1" w:type="dxa"/>
-              <w:bottom w:w="-1" w:type="dxa"/>
-              <w:right w:w="-1" w:type="dxa"/>
-            </w:tcMar>
-            <w:vAlign w:val="center"/>
-          </w:tcPr>
-          <w:p>
-            <w:pPr>
-              <w:pStyle w:val="28"/>
-              <w:bidi w:val="0"/>
-            </w:pPr>
-            <w:r>
-              <w:t>请求参数及主要字段</w:t>
-            </w:r>
-          </w:p>
-        </w:tc>
-        <w:tc>
-          <w:tcPr>
-            <w:tcW w:w="6644" w:type="dxa"/>
-            <w:tcBorders>
-              <w:top w:val="nil"/>
-              <w:left w:val="nil"/>
-              <w:bottom w:val="nil"/>
-              <w:right w:val="nil"/>
-            </w:tcBorders>
-            <w:noWrap w:val="0"/>
-            <w:tcMar>
-              <w:top w:w="-1" w:type="dxa"/>
-              <w:left w:w="-1" w:type="dxa"/>
-              <w:bottom w:w="-1" w:type="dxa"/>
-              <w:right w:w="-1" w:type="dxa"/>
-            </w:tcMar>
-            <w:vAlign w:val="center"/>
-          </w:tcPr>
-          <w:p>
-            <w:pPr>
-              <w:pStyle w:val="27"/>
-              <w:bidi w:val="0"/>
-            </w:pPr>
-            <w:r>
-              <w:t>animalId（动物 ID），Long 类型
-applicantName（申请人姓名），String 类型
-age（年龄），Integer 类型
-job（职业），String 类型
-income（收入水平），String 类型
-address（地址），String 类型
-phone（电话），String 类型
-wechat（微信），String 类型
-housing（住房类型），String 类型
-experience（养宠经验），String 类型
-familyMembers（家庭成员），String 类型
-reason（申请理由），String 类型</w:t>
-            </w:r>
-          </w:p>
-        </w:tc>
-      </w:tr>
-      <w:tr>
-        <w:tblPrEx>
-          <w:tblBorders>
-            <w:top w:val="none" w:color="auto" w:sz="0" w:space="0"/>
-            <w:left w:val="none" w:color="auto" w:sz="0" w:space="0"/>
-            <w:bottom w:val="none" w:color="auto" w:sz="0" w:space="0"/>
-            <w:right w:val="none" w:color="auto" w:sz="0" w:space="0"/>
-            <w:insideH w:val="none" w:color="auto" w:sz="0" w:space="0"/>
-            <w:insideV w:val="none" w:color="auto" w:sz="0" w:space="0"/>
-          </w:tblBorders>
-          <w:tblCellMar>
-            <w:top w:w="0" w:type="dxa"/>
-            <w:left w:w="10" w:type="dxa"/>
-            <w:bottom w:w="0" w:type="dxa"/>
-            <w:right w:w="10" w:type="dxa"/>
-          </w:tblCellMar>
-        </w:tblPrEx>
-        <w:trPr>
-          <w:trHeight w:val="0" w:hRule="atLeast"/>
-          <w:tblHeader/>
-          <w:jc w:val="center"/>
-        </w:trPr>
-        <w:tc>
-          <w:tcPr>
-            <w:tcW w:w="2016" w:type="dxa"/>
-            <w:tcBorders>
-              <w:top w:val="nil"/>
-              <w:left w:val="nil"/>
-              <w:bottom w:val="single" w:color="auto" w:sz="12" w:space="0"/>
-              <w:right w:val="nil"/>
-            </w:tcBorders>
-            <w:shd w:val="clear" w:color="F2F2F2" w:fill="auto"/>
-            <w:noWrap w:val="0"/>
-            <w:tcMar>
-              <w:top w:w="-1" w:type="dxa"/>
-              <w:left w:w="-1" w:type="dxa"/>
-              <w:bottom w:w="-1" w:type="dxa"/>
-              <w:right w:w="-1" w:type="dxa"/>
-            </w:tcMar>
-            <w:vAlign w:val="center"/>
-          </w:tcPr>
-          <w:p>
-            <w:pPr>
-              <w:pStyle w:val="28"/>
-              <w:bidi w:val="0"/>
-            </w:pPr>
-            <w:r>
-              <w:t>返回参数及主要字段</w:t>
-            </w:r>
-          </w:p>
-        </w:tc>
-        <w:tc>
-          <w:tcPr>
-            <w:tcW w:w="6644" w:type="dxa"/>
-            <w:tcBorders>
-              <w:top w:val="nil"/>
-              <w:left w:val="nil"/>
-              <w:bottom w:val="single" w:color="auto" w:sz="12" w:space="0"/>
-              <w:right w:val="nil"/>
-            </w:tcBorders>
-            <w:noWrap w:val="0"/>
-            <w:tcMar>
-              <w:top w:w="-1" w:type="dxa"/>
-              <w:left w:w="-1" w:type="dxa"/>
-              <w:bottom w:w="-1" w:type="dxa"/>
-              <w:right w:w="-1" w:type="dxa"/>
-            </w:tcMar>
-            <w:vAlign w:val="center"/>
-          </w:tcPr>
-          <w:p>
-            <w:pPr>
-              <w:pStyle w:val="27"/>
-              <w:bidi w:val="0"/>
-            </w:pPr>
-            <w:r>
-              <w:t>code（响应代码），整数类型
-msg（返回信息），String 类型
-data（操作结果），Boolean 类型</w:t>
-            </w:r>
-          </w:p>
-        </w:tc>
-      </w:tr>
-    </w:tbl>
-    <w:p>
-      <w:pPr>
-        <w:spacing w:before="60"/>
-      </w:pPr>
+        <w:t>领养申请提交接口的实现流程如下：首先，在 Controller 层通过 HttpSession 获取当前登录用户的信息，将用户 ID 自动填充到领养申请对象的 userId 字段中，无需前端显式传递。然后，将申请的初始状态设置为 0（待审核）。这种设计确保了申请人身份的真实性和可追溯性，避免了冒名提交的风险。最后，调用 MyBatis-Plus 的 save 方法将申请信息持久化到数据库中。</w:t>
+      </w:r>
+      <w:r>
+        <w:rPr>
+          <w:rFonts w:hint="eastAsia" w:cstheme="minorBidi"/>
+          <w:kern w:val="2"/>
+          <w:sz w:val="24"/>
+          <w:szCs w:val="22"/>
+          <w:lang w:val="en-US" w:eastAsia="zh-CN" w:bidi="ar-SA"/>
+        </w:rPr>
+        <w:t>领养申请界面如图5-4所示。</w:t>
+      </w:r>
     </w:p>
     <w:p>
       <w:pPr>
@@ -15487,7 +15061,7 @@
         <w:ind w:leftChars="0" w:firstLine="480" w:firstLineChars="200"/>
         <w:jc w:val="both"/>
         <w:rPr>
-          <w:rFonts w:hint="eastAsia" w:ascii="Times New Roman" w:hAnsi="Times New Roman" w:eastAsia="宋体" w:cstheme="minorBidi"/>
+          <w:rFonts w:hint="default" w:cstheme="minorBidi"/>
           <w:kern w:val="2"/>
           <w:sz w:val="24"/>
           <w:szCs w:val="22"/>
@@ -15495,524 +15069,48 @@
         </w:rPr>
       </w:pPr>
       <w:r>
-        <w:rPr>
-          <w:rFonts w:hint="eastAsia" w:ascii="Times New Roman" w:hAnsi="Times New Roman" w:eastAsia="宋体" w:cstheme="minorBidi"/>
-          <w:kern w:val="2"/>
-          <w:sz w:val="24"/>
-          <w:szCs w:val="22"/>
-          <w:lang w:val="en-US" w:eastAsia="zh-CN" w:bidi="ar-SA"/>
-        </w:rPr>
-        <w:t>领养申请提交接口的实现流程如下：首先，在 Controller 层通过 HttpSession 获取当前登录用户的信息，将用户 ID 自动填充到领养申请对象的 userId 字段中，无需前端显式传递。然后，将申请的初始状态设置为 0（待审核）。这种设计确保了申请人身份的真实性和可追溯性，避免了冒名提交的风险。最后，调用 MyBatis-Plus 的 save 方法将申请信息持久化到数据库中。</w:t>
-      </w:r>
-    </w:p>
-    <w:p>
-      <w:pPr>
-        <w:widowControl w:val="0"/>
-        <w:spacing w:line="300" w:lineRule="auto"/>
-        <w:ind w:firstLine="422" w:firstLineChars="200"/>
-        <w:jc w:val="center"/>
-        <w:rPr>
-          <w:rFonts w:hint="default" w:ascii="Times New Roman" w:hAnsi="Times New Roman" w:eastAsia="宋体" w:cs="Times New Roman"/>
-          <w:b/>
-          <w:bCs/>
-          <w:kern w:val="2"/>
-          <w:sz w:val="21"/>
-          <w:szCs w:val="21"/>
-          <w:lang w:val="en-US" w:eastAsia="zh-CN" w:bidi="ar-SA"/>
-        </w:rPr>
-      </w:pPr>
-    </w:p>
-    <w:p>
-      <w:pPr>
-        <w:widowControl w:val="0"/>
-        <w:spacing w:line="300" w:lineRule="auto"/>
-        <w:ind w:firstLine="422" w:firstLineChars="200"/>
-        <w:jc w:val="center"/>
-        <w:rPr>
-          <w:rFonts w:hint="default" w:ascii="Times New Roman" w:hAnsi="Times New Roman" w:eastAsia="宋体" w:cs="Times New Roman"/>
-          <w:b/>
-          <w:bCs/>
-          <w:kern w:val="2"/>
-          <w:sz w:val="21"/>
-          <w:szCs w:val="21"/>
-          <w:lang w:val="en-US" w:eastAsia="zh-CN" w:bidi="ar-SA"/>
-        </w:rPr>
-      </w:pPr>
-      <w:r>
-        <w:rPr>
-          <w:rFonts w:hint="default" w:ascii="Times New Roman" w:hAnsi="Times New Roman" w:eastAsia="宋体" w:cs="Times New Roman"/>
-          <w:b/>
-          <w:bCs/>
-          <w:kern w:val="2"/>
-          <w:sz w:val="21"/>
-          <w:szCs w:val="21"/>
-          <w:lang w:val="en-US" w:eastAsia="zh-CN" w:bidi="ar-SA"/>
-        </w:rPr>
-        <w:t>表 5-9 领养审批接口</w:t>
-      </w:r>
-    </w:p>
-    <w:p>
-      <w:pPr>
-        <w:widowControl w:val="0"/>
-        <w:spacing w:line="300" w:lineRule="auto"/>
-        <w:ind w:firstLine="422" w:firstLineChars="200"/>
-        <w:jc w:val="center"/>
-        <w:rPr>
-          <w:rFonts w:hint="default" w:ascii="Times New Roman" w:hAnsi="Times New Roman" w:eastAsia="宋体" w:cs="Times New Roman"/>
-          <w:b/>
-          <w:bCs/>
-          <w:kern w:val="2"/>
-          <w:sz w:val="21"/>
-          <w:szCs w:val="21"/>
-          <w:lang w:val="en-US" w:eastAsia="zh-CN" w:bidi="ar-SA"/>
-        </w:rPr>
-      </w:pPr>
-      <w:r>
-        <w:rPr>
-          <w:rFonts w:hint="default" w:ascii="Times New Roman" w:hAnsi="Times New Roman" w:eastAsia="宋体" w:cs="Times New Roman"/>
-          <w:b/>
-          <w:bCs/>
-          <w:kern w:val="2"/>
-          <w:sz w:val="21"/>
-          <w:szCs w:val="21"/>
-          <w:lang w:val="en-US" w:eastAsia="zh-CN" w:bidi="ar-SA"/>
-        </w:rPr>
-        <w:t>Table 5-9 Adoption Approval Interface</w:t>
-      </w:r>
-    </w:p>
-    <w:tbl>
-      <w:tblPr>
-        <w:tblStyle w:val="19"/>
-        <w:tblW w:w="8660" w:type="dxa"/>
-        <w:jc w:val="center"/>
-        <w:tblBorders>
-          <w:top w:val="none" w:color="auto" w:sz="0" w:space="0"/>
-          <w:left w:val="none" w:color="auto" w:sz="0" w:space="0"/>
-          <w:bottom w:val="none" w:color="auto" w:sz="0" w:space="0"/>
-          <w:right w:val="none" w:color="auto" w:sz="0" w:space="0"/>
-          <w:insideH w:val="none" w:color="auto" w:sz="0" w:space="0"/>
-          <w:insideV w:val="none" w:color="auto" w:sz="0" w:space="0"/>
-        </w:tblBorders>
-        <w:tblLayout w:type="autofit"/>
-        <w:tblCellMar>
-          <w:top w:w="0" w:type="dxa"/>
-          <w:left w:w="10" w:type="dxa"/>
-          <w:bottom w:w="0" w:type="dxa"/>
-          <w:right w:w="10" w:type="dxa"/>
-        </w:tblCellMar>
-      </w:tblPr>
-      <w:tblGrid>
-        <w:gridCol w:w="1481"/>
-        <w:gridCol w:w="7179"/>
-      </w:tblGrid>
-      <w:tr>
-        <w:tblPrEx>
-          <w:tblBorders>
-            <w:top w:val="none" w:color="auto" w:sz="0" w:space="0"/>
-            <w:left w:val="none" w:color="auto" w:sz="0" w:space="0"/>
-            <w:bottom w:val="none" w:color="auto" w:sz="0" w:space="0"/>
-            <w:right w:val="none" w:color="auto" w:sz="0" w:space="0"/>
-            <w:insideH w:val="none" w:color="auto" w:sz="0" w:space="0"/>
-            <w:insideV w:val="none" w:color="auto" w:sz="0" w:space="0"/>
-          </w:tblBorders>
-          <w:tblCellMar>
-            <w:top w:w="0" w:type="dxa"/>
-            <w:left w:w="10" w:type="dxa"/>
-            <w:bottom w:w="0" w:type="dxa"/>
-            <w:right w:w="10" w:type="dxa"/>
-          </w:tblCellMar>
-        </w:tblPrEx>
-        <w:trPr>
-          <w:trHeight w:val="0" w:hRule="atLeast"/>
-          <w:tblHeader/>
-          <w:jc w:val="center"/>
-        </w:trPr>
-        <w:tc>
-          <w:tcPr>
-            <w:tcW w:w="0" w:type="auto"/>
-            <w:tcBorders>
-              <w:top w:val="single" w:color="auto" w:sz="12" w:space="0"/>
-              <w:left w:val="nil"/>
-              <w:bottom w:val="nil"/>
-              <w:right w:val="nil"/>
-            </w:tcBorders>
-            <w:shd w:val="clear" w:color="F2F2F2" w:fill="auto"/>
-            <w:noWrap w:val="0"/>
-            <w:tcMar>
-              <w:top w:w="-1" w:type="dxa"/>
-              <w:left w:w="-1" w:type="dxa"/>
-              <w:bottom w:w="-1" w:type="dxa"/>
-              <w:right w:w="-1" w:type="dxa"/>
-            </w:tcMar>
-            <w:vAlign w:val="center"/>
-          </w:tcPr>
-          <w:p>
-            <w:pPr>
-              <w:pStyle w:val="28"/>
-              <w:bidi w:val="0"/>
-            </w:pPr>
-            <w:r>
-              <w:t>接口名称</w:t>
-            </w:r>
-          </w:p>
-        </w:tc>
-        <w:tc>
-          <w:tcPr>
-            <w:tcW w:w="7179" w:type="dxa"/>
-            <w:tcBorders>
-              <w:top w:val="single" w:color="auto" w:sz="12" w:space="0"/>
-              <w:left w:val="nil"/>
-              <w:bottom w:val="nil"/>
-              <w:right w:val="nil"/>
-            </w:tcBorders>
-            <w:noWrap w:val="0"/>
-            <w:tcMar>
-              <w:top w:w="-1" w:type="dxa"/>
-              <w:left w:w="-1" w:type="dxa"/>
-              <w:bottom w:w="-1" w:type="dxa"/>
-              <w:right w:w="-1" w:type="dxa"/>
-            </w:tcMar>
-            <w:vAlign w:val="center"/>
-          </w:tcPr>
-          <w:p>
-            <w:pPr>
-              <w:pStyle w:val="28"/>
-              <w:bidi w:val="0"/>
-            </w:pPr>
-            <w:r>
-              <w:t>领养审批</w:t>
-            </w:r>
-          </w:p>
-        </w:tc>
-      </w:tr>
-      <w:tr>
-        <w:tblPrEx>
-          <w:tblBorders>
-            <w:top w:val="none" w:color="auto" w:sz="0" w:space="0"/>
-            <w:left w:val="none" w:color="auto" w:sz="0" w:space="0"/>
-            <w:bottom w:val="none" w:color="auto" w:sz="0" w:space="0"/>
-            <w:right w:val="none" w:color="auto" w:sz="0" w:space="0"/>
-            <w:insideH w:val="none" w:color="auto" w:sz="0" w:space="0"/>
-            <w:insideV w:val="none" w:color="auto" w:sz="0" w:space="0"/>
-          </w:tblBorders>
-          <w:tblCellMar>
-            <w:top w:w="0" w:type="dxa"/>
-            <w:left w:w="10" w:type="dxa"/>
-            <w:bottom w:w="0" w:type="dxa"/>
-            <w:right w:w="10" w:type="dxa"/>
-          </w:tblCellMar>
-        </w:tblPrEx>
-        <w:trPr>
-          <w:trHeight w:val="0" w:hRule="atLeast"/>
-          <w:tblHeader/>
-          <w:jc w:val="center"/>
-        </w:trPr>
-        <w:tc>
-          <w:tcPr>
-            <w:tcW w:w="0" w:type="auto"/>
-            <w:tcBorders>
-              <w:top w:val="single" w:color="auto" w:sz="4" w:space="0"/>
-              <w:left w:val="nil"/>
-              <w:bottom w:val="nil"/>
-              <w:right w:val="nil"/>
-            </w:tcBorders>
-            <w:shd w:val="clear" w:color="F2F2F2" w:fill="auto"/>
-            <w:noWrap w:val="0"/>
-            <w:tcMar>
-              <w:top w:w="-1" w:type="dxa"/>
-              <w:left w:w="-1" w:type="dxa"/>
-              <w:bottom w:w="-1" w:type="dxa"/>
-              <w:right w:w="-1" w:type="dxa"/>
-            </w:tcMar>
-            <w:vAlign w:val="center"/>
-          </w:tcPr>
-          <w:p>
-            <w:pPr>
-              <w:pStyle w:val="28"/>
-              <w:bidi w:val="0"/>
-            </w:pPr>
-            <w:r>
-              <w:t>接口 URL</w:t>
-            </w:r>
-          </w:p>
-        </w:tc>
-        <w:tc>
-          <w:tcPr>
-            <w:tcW w:w="7179" w:type="dxa"/>
-            <w:tcBorders>
-              <w:top w:val="single" w:color="auto" w:sz="4" w:space="0"/>
-              <w:left w:val="nil"/>
-              <w:bottom w:val="nil"/>
-              <w:right w:val="nil"/>
-            </w:tcBorders>
-            <w:noWrap w:val="0"/>
-            <w:tcMar>
-              <w:top w:w="-1" w:type="dxa"/>
-              <w:left w:w="-1" w:type="dxa"/>
-              <w:bottom w:w="-1" w:type="dxa"/>
-              <w:right w:w="-1" w:type="dxa"/>
-            </w:tcMar>
-            <w:vAlign w:val="center"/>
-          </w:tcPr>
-          <w:p>
-            <w:pPr>
-              <w:pStyle w:val="27"/>
-              <w:bidi w:val="0"/>
-            </w:pPr>
-            <w:r>
-              <w:t>/api/admin/adoption-applications/{id}/status</w:t>
-            </w:r>
-          </w:p>
-        </w:tc>
-      </w:tr>
-      <w:tr>
-        <w:tblPrEx>
-          <w:tblBorders>
-            <w:top w:val="none" w:color="auto" w:sz="0" w:space="0"/>
-            <w:left w:val="none" w:color="auto" w:sz="0" w:space="0"/>
-            <w:bottom w:val="none" w:color="auto" w:sz="0" w:space="0"/>
-            <w:right w:val="none" w:color="auto" w:sz="0" w:space="0"/>
-            <w:insideH w:val="none" w:color="auto" w:sz="0" w:space="0"/>
-            <w:insideV w:val="none" w:color="auto" w:sz="0" w:space="0"/>
-          </w:tblBorders>
-          <w:tblCellMar>
-            <w:top w:w="0" w:type="dxa"/>
-            <w:left w:w="10" w:type="dxa"/>
-            <w:bottom w:w="0" w:type="dxa"/>
-            <w:right w:w="10" w:type="dxa"/>
-          </w:tblCellMar>
-        </w:tblPrEx>
-        <w:trPr>
-          <w:trHeight w:val="0" w:hRule="atLeast"/>
-          <w:tblHeader/>
-          <w:jc w:val="center"/>
-        </w:trPr>
-        <w:tc>
-          <w:tcPr>
-            <w:tcW w:w="0" w:type="auto"/>
-            <w:tcBorders>
-              <w:top w:val="nil"/>
-              <w:left w:val="nil"/>
-              <w:bottom w:val="nil"/>
-              <w:right w:val="nil"/>
-            </w:tcBorders>
-            <w:shd w:val="clear" w:color="F2F2F2" w:fill="auto"/>
-            <w:noWrap w:val="0"/>
-            <w:tcMar>
-              <w:top w:w="-1" w:type="dxa"/>
-              <w:left w:w="-1" w:type="dxa"/>
-              <w:bottom w:w="-1" w:type="dxa"/>
-              <w:right w:w="-1" w:type="dxa"/>
-            </w:tcMar>
-            <w:vAlign w:val="center"/>
-          </w:tcPr>
-          <w:p>
-            <w:pPr>
-              <w:pStyle w:val="28"/>
-              <w:bidi w:val="0"/>
-            </w:pPr>
-            <w:r>
-              <w:t>请求方式</w:t>
-            </w:r>
-          </w:p>
-        </w:tc>
-        <w:tc>
-          <w:tcPr>
-            <w:tcW w:w="7179" w:type="dxa"/>
-            <w:tcBorders>
-              <w:top w:val="nil"/>
-              <w:left w:val="nil"/>
-              <w:bottom w:val="nil"/>
-              <w:right w:val="nil"/>
-            </w:tcBorders>
-            <w:noWrap w:val="0"/>
-            <w:tcMar>
-              <w:top w:w="-1" w:type="dxa"/>
-              <w:left w:w="-1" w:type="dxa"/>
-              <w:bottom w:w="-1" w:type="dxa"/>
-              <w:right w:w="-1" w:type="dxa"/>
-            </w:tcMar>
-            <w:vAlign w:val="center"/>
-          </w:tcPr>
-          <w:p>
-            <w:pPr>
-              <w:pStyle w:val="27"/>
-              <w:bidi w:val="0"/>
-            </w:pPr>
-            <w:r>
-              <w:t>PUT</w:t>
-            </w:r>
-          </w:p>
-        </w:tc>
-      </w:tr>
-      <w:tr>
-        <w:tblPrEx>
-          <w:tblBorders>
-            <w:top w:val="none" w:color="auto" w:sz="0" w:space="0"/>
-            <w:left w:val="none" w:color="auto" w:sz="0" w:space="0"/>
-            <w:bottom w:val="none" w:color="auto" w:sz="0" w:space="0"/>
-            <w:right w:val="none" w:color="auto" w:sz="0" w:space="0"/>
-            <w:insideH w:val="none" w:color="auto" w:sz="0" w:space="0"/>
-            <w:insideV w:val="none" w:color="auto" w:sz="0" w:space="0"/>
-          </w:tblBorders>
-          <w:tblCellMar>
-            <w:top w:w="0" w:type="dxa"/>
-            <w:left w:w="10" w:type="dxa"/>
-            <w:bottom w:w="0" w:type="dxa"/>
-            <w:right w:w="10" w:type="dxa"/>
-          </w:tblCellMar>
-        </w:tblPrEx>
-        <w:trPr>
-          <w:trHeight w:val="0" w:hRule="atLeast"/>
-          <w:tblHeader/>
-          <w:jc w:val="center"/>
-        </w:trPr>
-        <w:tc>
-          <w:tcPr>
-            <w:tcW w:w="0" w:type="auto"/>
-            <w:tcBorders>
-              <w:top w:val="nil"/>
-              <w:left w:val="nil"/>
-              <w:bottom w:val="nil"/>
-              <w:right w:val="nil"/>
-            </w:tcBorders>
-            <w:shd w:val="clear" w:color="F2F2F2" w:fill="auto"/>
-            <w:noWrap w:val="0"/>
-            <w:tcMar>
-              <w:top w:w="-1" w:type="dxa"/>
-              <w:left w:w="-1" w:type="dxa"/>
-              <w:bottom w:w="-1" w:type="dxa"/>
-              <w:right w:w="-1" w:type="dxa"/>
-            </w:tcMar>
-            <w:vAlign w:val="center"/>
-          </w:tcPr>
-          <w:p>
-            <w:pPr>
-              <w:pStyle w:val="28"/>
-              <w:bidi w:val="0"/>
-            </w:pPr>
-            <w:r>
-              <w:t>请求参数及主要字段</w:t>
-            </w:r>
-          </w:p>
-        </w:tc>
-        <w:tc>
-          <w:tcPr>
-            <w:tcW w:w="7179" w:type="dxa"/>
-            <w:tcBorders>
-              <w:top w:val="nil"/>
-              <w:left w:val="nil"/>
-              <w:bottom w:val="nil"/>
-              <w:right w:val="nil"/>
-            </w:tcBorders>
-            <w:noWrap w:val="0"/>
-            <w:tcMar>
-              <w:top w:w="-1" w:type="dxa"/>
-              <w:left w:w="-1" w:type="dxa"/>
-              <w:bottom w:w="-1" w:type="dxa"/>
-              <w:right w:w="-1" w:type="dxa"/>
-            </w:tcMar>
-            <w:vAlign w:val="center"/>
-          </w:tcPr>
-          <w:p>
-            <w:pPr>
-              <w:pStyle w:val="27"/>
-              <w:bidi w:val="0"/>
-            </w:pPr>
-            <w:r>
-              <w:t>status（审核结果），Integer 类型，1 为通过，2 为拒绝
-reviewNote（审核备注），String 类型，可选</w:t>
-            </w:r>
-          </w:p>
-        </w:tc>
-      </w:tr>
-      <w:tr>
-        <w:tblPrEx>
-          <w:tblBorders>
-            <w:top w:val="none" w:color="auto" w:sz="0" w:space="0"/>
-            <w:left w:val="none" w:color="auto" w:sz="0" w:space="0"/>
-            <w:bottom w:val="none" w:color="auto" w:sz="0" w:space="0"/>
-            <w:right w:val="none" w:color="auto" w:sz="0" w:space="0"/>
-            <w:insideH w:val="none" w:color="auto" w:sz="0" w:space="0"/>
-            <w:insideV w:val="none" w:color="auto" w:sz="0" w:space="0"/>
-          </w:tblBorders>
-          <w:tblCellMar>
-            <w:top w:w="0" w:type="dxa"/>
-            <w:left w:w="10" w:type="dxa"/>
-            <w:bottom w:w="0" w:type="dxa"/>
-            <w:right w:w="10" w:type="dxa"/>
-          </w:tblCellMar>
-        </w:tblPrEx>
-        <w:trPr>
-          <w:trHeight w:val="0" w:hRule="atLeast"/>
-          <w:tblHeader/>
-          <w:jc w:val="center"/>
-        </w:trPr>
-        <w:tc>
-          <w:tcPr>
-            <w:tcW w:w="1481" w:type="dxa"/>
-            <w:tcBorders>
-              <w:top w:val="nil"/>
-              <w:left w:val="nil"/>
-              <w:bottom w:val="single" w:color="auto" w:sz="12" w:space="0"/>
-              <w:right w:val="nil"/>
-            </w:tcBorders>
-            <w:shd w:val="clear" w:color="F2F2F2" w:fill="auto"/>
-            <w:noWrap w:val="0"/>
-            <w:tcMar>
-              <w:top w:w="-1" w:type="dxa"/>
-              <w:left w:w="-1" w:type="dxa"/>
-              <w:bottom w:w="-1" w:type="dxa"/>
-              <w:right w:w="-1" w:type="dxa"/>
-            </w:tcMar>
-            <w:vAlign w:val="center"/>
-          </w:tcPr>
-          <w:p>
-            <w:pPr>
-              <w:pStyle w:val="28"/>
-              <w:bidi w:val="0"/>
-            </w:pPr>
-            <w:r>
-              <w:t>返回参数及主要字段</w:t>
-            </w:r>
-          </w:p>
-        </w:tc>
-        <w:tc>
-          <w:tcPr>
-            <w:tcW w:w="7179" w:type="dxa"/>
-            <w:tcBorders>
-              <w:top w:val="nil"/>
-              <w:left w:val="nil"/>
-              <w:bottom w:val="single" w:color="auto" w:sz="12" w:space="0"/>
-              <w:right w:val="nil"/>
-            </w:tcBorders>
-            <w:noWrap w:val="0"/>
-            <w:tcMar>
-              <w:top w:w="-1" w:type="dxa"/>
-              <w:left w:w="-1" w:type="dxa"/>
-              <w:bottom w:w="-1" w:type="dxa"/>
-              <w:right w:w="-1" w:type="dxa"/>
-            </w:tcMar>
-            <w:vAlign w:val="center"/>
-          </w:tcPr>
-          <w:p>
-            <w:pPr>
-              <w:pStyle w:val="27"/>
-              <w:bidi w:val="0"/>
-            </w:pPr>
-            <w:r>
-              <w:t>code（响应代码），整数类型
-msg（返回信息），String 类型
-data（操作结果），Boolean 类型</w:t>
-            </w:r>
-          </w:p>
-        </w:tc>
-      </w:tr>
-    </w:tbl>
-    <w:p>
-      <w:pPr>
-        <w:spacing w:before="60"/>
-      </w:pPr>
+        <w:drawing>
+          <wp:inline distT="0" distB="0" distL="114300" distR="114300">
+            <wp:extent cx="5484495" cy="2719705"/>
+            <wp:effectExtent l="0" t="0" r="1905" b="4445"/>
+            <wp:docPr id="9" name="图片 1"/>
+            <wp:cNvGraphicFramePr>
+              <a:graphicFrameLocks xmlns:a="http://schemas.openxmlformats.org/drawingml/2006/main" noChangeAspect="1"/>
+            </wp:cNvGraphicFramePr>
+            <a:graphic xmlns:a="http://schemas.openxmlformats.org/drawingml/2006/main">
+              <a:graphicData uri="http://schemas.openxmlformats.org/drawingml/2006/picture">
+                <pic:pic xmlns:pic="http://schemas.openxmlformats.org/drawingml/2006/picture">
+                  <pic:nvPicPr>
+                    <pic:cNvPr id="9" name="图片 1"/>
+                    <pic:cNvPicPr>
+                      <a:picLocks noChangeAspect="1"/>
+                    </pic:cNvPicPr>
+                  </pic:nvPicPr>
+                  <pic:blipFill>
+                    <a:blip r:embed="rId14"/>
+                    <a:stretch>
+                      <a:fillRect/>
+                    </a:stretch>
+                  </pic:blipFill>
+                  <pic:spPr>
+                    <a:xfrm>
+                      <a:off x="0" y="0"/>
+                      <a:ext cx="5484495" cy="2719705"/>
+                    </a:xfrm>
+                    <a:prstGeom prst="rect">
+                      <a:avLst/>
+                    </a:prstGeom>
+                    <a:noFill/>
+                    <a:ln>
+                      <a:noFill/>
+                    </a:ln>
+                  </pic:spPr>
+                </pic:pic>
+              </a:graphicData>
+            </a:graphic>
+          </wp:inline>
+        </w:drawing>
+      </w:r>
     </w:p>
     <w:p>
       <w:pPr>
@@ -16022,44 +15120,33 @@
         <w:ind w:leftChars="0" w:firstLine="480" w:firstLineChars="200"/>
         <w:jc w:val="both"/>
         <w:rPr>
+          <w:rFonts w:hint="eastAsia" w:cstheme="minorBidi"/>
+          <w:kern w:val="2"/>
+          <w:sz w:val="24"/>
+          <w:szCs w:val="22"/>
+          <w:lang w:val="en-US" w:eastAsia="zh-CN" w:bidi="ar-SA"/>
+        </w:rPr>
+      </w:pPr>
+      <w:r>
+        <w:rPr>
           <w:rFonts w:hint="eastAsia" w:ascii="Times New Roman" w:hAnsi="Times New Roman" w:eastAsia="宋体" w:cstheme="minorBidi"/>
           <w:kern w:val="2"/>
           <w:sz w:val="24"/>
           <w:szCs w:val="22"/>
           <w:lang w:val="en-US" w:eastAsia="zh-CN" w:bidi="ar-SA"/>
         </w:rPr>
-      </w:pPr>
-      <w:r>
-        <w:rPr>
-          <w:rFonts w:hint="eastAsia" w:ascii="Times New Roman" w:hAnsi="Times New Roman" w:eastAsia="宋体" w:cstheme="minorBidi"/>
+        <w:t>领养审批接口的实现流程如下：在 Controller 层，系统从请求路径中提取申请 ID，从请求体中解析审核状态和审核备注。由于请求体中的状态值可能为 Integer 或 String 类型，系统进行了兼容性处理——如果状态值为 Number 类型则直接转换为 int，否则通过 Integer.parseInt 方法进行字符串解析。审核完成后，系统更新对应申请记录的 status 和 reviewNote 字段。管理员后台领养申请列表接口支持按审核状态和关键词（匹配申请人姓名、电话、地址）进行筛选，并按创建时间倒序分页展示，便于管理员高效处理待审核申请。管理员还可通过 DELETE 接口删除无效或测试申请记录。</w:t>
+      </w:r>
+      <w:r>
+        <w:rPr>
+          <w:rFonts w:hint="eastAsia" w:cstheme="minorBidi"/>
           <w:kern w:val="2"/>
           <w:sz w:val="24"/>
           <w:szCs w:val="22"/>
           <w:lang w:val="en-US" w:eastAsia="zh-CN" w:bidi="ar-SA"/>
         </w:rPr>
-        <w:t>领养审批接口的实现流程如下：在 Controller 层，系统从请求路径中提取申请 ID，从请求体中解析审核状态和审核备注。由于请求体中的状态值可能为 Integer 或 String 类型，系统进行了兼容性处理——如果状态值为 Number 类型则直接转换为 int，否则通过 Integer.parseInt 方法进行字符串解析。审核完成后，系统更新对应申请记录的 status 和 reviewNote 字段。管理员后台领养申请列表接口支持按审核状态和关键词（匹配申请人姓名、电话、地址）进行筛选，并按创建时间倒序分页展示，便于管理员高效处理待审核申请。管理员还可通过 DELETE 接口删除无效或测试申请记录。</w:t>
-      </w:r>
-    </w:p>
-    <w:p>
-      <w:pPr>
-        <w:pStyle w:val="3"/>
-        <w:bidi w:val="0"/>
-        <w:rPr>
-          <w:rFonts w:hint="default"/>
-          <w:lang w:val="en-US" w:eastAsia="zh-Hans"/>
-        </w:rPr>
-      </w:pPr>
-      <w:bookmarkStart w:id="102" w:name="_Toc15310"/>
-      <w:bookmarkStart w:id="103" w:name="_Toc16902"/>
-      <w:r>
-        <w:rPr>
-          <w:rFonts w:hint="default"/>
-          <w:lang w:val="en-US" w:eastAsia="zh-Hans"/>
-        </w:rPr>
-        <w:t>5.4 社区互动模块设计与实现</w:t>
-      </w:r>
-      <w:bookmarkEnd w:id="102"/>
-      <w:bookmarkEnd w:id="103"/>
+        <w:t>领养审核界面如图5-5所示。</w:t>
+      </w:r>
     </w:p>
     <w:p>
       <w:pPr>
@@ -16069,7 +15156,7 @@
         <w:ind w:leftChars="0" w:firstLine="480" w:firstLineChars="200"/>
         <w:jc w:val="both"/>
         <w:rPr>
-          <w:rFonts w:hint="default" w:ascii="Times New Roman" w:hAnsi="Times New Roman" w:eastAsia="宋体" w:cstheme="minorBidi"/>
+          <w:rFonts w:hint="default" w:cstheme="minorBidi"/>
           <w:kern w:val="2"/>
           <w:sz w:val="24"/>
           <w:szCs w:val="22"/>
@@ -16077,36 +15164,69 @@
         </w:rPr>
       </w:pPr>
       <w:r>
-        <w:rPr>
-          <w:rFonts w:hint="default" w:ascii="Times New Roman" w:hAnsi="Times New Roman" w:eastAsia="宋体" w:cstheme="minorBidi"/>
-          <w:kern w:val="2"/>
-          <w:sz w:val="24"/>
-          <w:szCs w:val="22"/>
-          <w:lang w:val="en-US" w:eastAsia="zh-CN" w:bidi="ar-SA"/>
-        </w:rPr>
-        <w:t>社区互动模块为系统用户提供了一个交流分享的平台。用户可以在社区中发布帖子，分享救助故事、领养心得或求助信息；也可以浏览他人发布的帖子并进行评论互动。管理员可以对帖子及评论进行内容审核，对违规内容执行隐藏或删除操作。本小节将分别对帖子管理和评论管理两个子模块的设计与实现进行详细阐述。</w:t>
-      </w:r>
-    </w:p>
-    <w:p>
-      <w:pPr>
-        <w:pStyle w:val="4"/>
-        <w:bidi w:val="0"/>
-        <w:rPr>
-          <w:rFonts w:hint="default"/>
-          <w:lang w:val="en-US" w:eastAsia="zh-CN"/>
-        </w:rPr>
-      </w:pPr>
-      <w:bookmarkStart w:id="104" w:name="_Toc28379"/>
-      <w:bookmarkStart w:id="105" w:name="_Toc31690"/>
-      <w:r>
-        <w:rPr>
-          <w:rFonts w:hint="default"/>
-          <w:lang w:val="en-US" w:eastAsia="zh-CN"/>
-        </w:rPr>
-        <w:t>5.4.1 社区帖子管理模块设计与实现</w:t>
-      </w:r>
-      <w:bookmarkEnd w:id="104"/>
-      <w:bookmarkEnd w:id="105"/>
+        <w:drawing>
+          <wp:inline distT="0" distB="0" distL="114300" distR="114300">
+            <wp:extent cx="5469255" cy="2707005"/>
+            <wp:effectExtent l="0" t="0" r="17145" b="17145"/>
+            <wp:docPr id="10" name="图片 2"/>
+            <wp:cNvGraphicFramePr>
+              <a:graphicFrameLocks xmlns:a="http://schemas.openxmlformats.org/drawingml/2006/main" noChangeAspect="1"/>
+            </wp:cNvGraphicFramePr>
+            <a:graphic xmlns:a="http://schemas.openxmlformats.org/drawingml/2006/main">
+              <a:graphicData uri="http://schemas.openxmlformats.org/drawingml/2006/picture">
+                <pic:pic xmlns:pic="http://schemas.openxmlformats.org/drawingml/2006/picture">
+                  <pic:nvPicPr>
+                    <pic:cNvPr id="10" name="图片 2"/>
+                    <pic:cNvPicPr>
+                      <a:picLocks noChangeAspect="1"/>
+                    </pic:cNvPicPr>
+                  </pic:nvPicPr>
+                  <pic:blipFill>
+                    <a:blip r:embed="rId15"/>
+                    <a:stretch>
+                      <a:fillRect/>
+                    </a:stretch>
+                  </pic:blipFill>
+                  <pic:spPr>
+                    <a:xfrm>
+                      <a:off x="0" y="0"/>
+                      <a:ext cx="5469255" cy="2707005"/>
+                    </a:xfrm>
+                    <a:prstGeom prst="rect">
+                      <a:avLst/>
+                    </a:prstGeom>
+                    <a:noFill/>
+                    <a:ln>
+                      <a:noFill/>
+                    </a:ln>
+                  </pic:spPr>
+                </pic:pic>
+              </a:graphicData>
+            </a:graphic>
+          </wp:inline>
+        </w:drawing>
+      </w:r>
+    </w:p>
+    <w:p>
+      <w:pPr>
+        <w:pStyle w:val="3"/>
+        <w:bidi w:val="0"/>
+        <w:rPr>
+          <w:rFonts w:hint="default"/>
+          <w:lang w:val="en-US" w:eastAsia="zh-Hans"/>
+        </w:rPr>
+      </w:pPr>
+      <w:bookmarkStart w:id="102" w:name="_Toc15310"/>
+      <w:bookmarkStart w:id="103" w:name="_Toc16902"/>
+      <w:r>
+        <w:rPr>
+          <w:rFonts w:hint="default"/>
+          <w:lang w:val="en-US" w:eastAsia="zh-Hans"/>
+        </w:rPr>
+        <w:t>5.4 社区互动模块设计与实现</w:t>
+      </w:r>
+      <w:bookmarkEnd w:id="102"/>
+      <w:bookmarkEnd w:id="103"/>
     </w:p>
     <w:p>
       <w:pPr>
@@ -16116,539 +15236,59 @@
         <w:ind w:leftChars="0" w:firstLine="480" w:firstLineChars="200"/>
         <w:jc w:val="both"/>
         <w:rPr>
+          <w:rFonts w:hint="default" w:ascii="Times New Roman" w:hAnsi="Times New Roman" w:eastAsia="宋体" w:cstheme="minorBidi"/>
+          <w:kern w:val="2"/>
+          <w:sz w:val="24"/>
+          <w:szCs w:val="22"/>
+          <w:lang w:val="en-US" w:eastAsia="zh-CN" w:bidi="ar-SA"/>
+        </w:rPr>
+      </w:pPr>
+      <w:r>
+        <w:rPr>
+          <w:rFonts w:hint="default" w:ascii="Times New Roman" w:hAnsi="Times New Roman" w:eastAsia="宋体" w:cstheme="minorBidi"/>
+          <w:kern w:val="2"/>
+          <w:sz w:val="24"/>
+          <w:szCs w:val="22"/>
+          <w:lang w:val="en-US" w:eastAsia="zh-CN" w:bidi="ar-SA"/>
+        </w:rPr>
+        <w:t>社区互动模块为系统用户提供了一个交流分享的平台。用户可以在社区中发布帖子，分享救助故事、领养心得或求助信息；也可以浏览他人发布的帖子并进行评论互动。管理员可以对帖子及评论进行内容审核，对违规内容执行隐藏或删除操作。本小节将分别对帖子管理和评论管理两个子模块的设计与实现进行详细阐述。</w:t>
+      </w:r>
+    </w:p>
+    <w:p>
+      <w:pPr>
+        <w:pStyle w:val="4"/>
+        <w:bidi w:val="0"/>
+        <w:rPr>
+          <w:rFonts w:hint="default"/>
+          <w:lang w:val="en-US" w:eastAsia="zh-CN"/>
+        </w:rPr>
+      </w:pPr>
+      <w:bookmarkStart w:id="104" w:name="_Toc28379"/>
+      <w:bookmarkStart w:id="105" w:name="_Toc31690"/>
+      <w:r>
+        <w:rPr>
+          <w:rFonts w:hint="default"/>
+          <w:lang w:val="en-US" w:eastAsia="zh-CN"/>
+        </w:rPr>
+        <w:t>5.4.1 社区帖子管理模块设计与实现</w:t>
+      </w:r>
+      <w:bookmarkEnd w:id="104"/>
+      <w:bookmarkEnd w:id="105"/>
+    </w:p>
+    <w:p>
+      <w:pPr>
+        <w:spacing w:before="60"/>
+      </w:pPr>
+      <w:r>
+        <w:rPr>
           <w:rFonts w:hint="eastAsia" w:ascii="Times New Roman" w:hAnsi="Times New Roman" w:eastAsia="宋体" w:cstheme="minorBidi"/>
           <w:kern w:val="2"/>
           <w:sz w:val="24"/>
           <w:szCs w:val="22"/>
           <w:lang w:val="en-US" w:eastAsia="zh-CN" w:bidi="ar-SA"/>
         </w:rPr>
-      </w:pPr>
-      <w:r>
-        <w:rPr>
-          <w:rFonts w:hint="eastAsia" w:ascii="Times New Roman" w:hAnsi="Times New Roman" w:eastAsia="宋体" w:cstheme="minorBidi"/>
-          <w:kern w:val="2"/>
-          <w:sz w:val="24"/>
-          <w:szCs w:val="22"/>
-          <w:lang w:val="en-US" w:eastAsia="zh-CN" w:bidi="ar-SA"/>
-        </w:rPr>
-        <w:t>社区帖子数据存储在 post 表中，包含帖子标题（title）、正文内容（content）、图片列表（images，JSON 格式存储）、发布地点（location）、经纬度坐标（latitude/longitude）、发布用户 ID（user_id）以及显示状态（status，0 隐藏/1 正常）。帖子查询时通过 SQL JOIN 关联 sys_user 表获取发布用户的用户名、昵称和头像信息。帖子管理相关接口详细信息见表 5-10。</w:t>
-      </w:r>
-    </w:p>
-    <w:p>
-      <w:pPr>
-        <w:widowControl w:val="0"/>
-        <w:spacing w:line="300" w:lineRule="auto"/>
-        <w:ind w:firstLine="422" w:firstLineChars="200"/>
-        <w:jc w:val="center"/>
-        <w:rPr>
-          <w:rFonts w:hint="default" w:ascii="Times New Roman" w:hAnsi="Times New Roman" w:eastAsia="宋体" w:cs="Times New Roman"/>
-          <w:b/>
-          <w:bCs/>
-          <w:kern w:val="2"/>
-          <w:sz w:val="21"/>
-          <w:szCs w:val="21"/>
-          <w:lang w:val="en-US" w:eastAsia="zh-CN" w:bidi="ar-SA"/>
-        </w:rPr>
-      </w:pPr>
-    </w:p>
-    <w:p>
-      <w:pPr>
-        <w:widowControl w:val="0"/>
-        <w:spacing w:line="300" w:lineRule="auto"/>
-        <w:ind w:firstLine="422" w:firstLineChars="200"/>
-        <w:jc w:val="center"/>
-        <w:rPr>
-          <w:rFonts w:hint="default" w:ascii="Times New Roman" w:hAnsi="Times New Roman" w:eastAsia="宋体" w:cs="Times New Roman"/>
-          <w:b/>
-          <w:bCs/>
-          <w:kern w:val="2"/>
-          <w:sz w:val="21"/>
-          <w:szCs w:val="21"/>
-          <w:lang w:val="en-US" w:eastAsia="zh-CN" w:bidi="ar-SA"/>
-        </w:rPr>
-      </w:pPr>
-      <w:r>
-        <w:rPr>
-          <w:rFonts w:hint="default" w:ascii="Times New Roman" w:hAnsi="Times New Roman" w:eastAsia="宋体" w:cs="Times New Roman"/>
-          <w:b/>
-          <w:bCs/>
-          <w:kern w:val="2"/>
-          <w:sz w:val="21"/>
-          <w:szCs w:val="21"/>
-          <w:lang w:val="en-US" w:eastAsia="zh-CN" w:bidi="ar-SA"/>
-        </w:rPr>
-        <w:t>表 5-10 社区帖子管理接口</w:t>
-      </w:r>
-    </w:p>
-    <w:p>
-      <w:pPr>
-        <w:widowControl w:val="0"/>
-        <w:spacing w:line="300" w:lineRule="auto"/>
-        <w:ind w:firstLine="422" w:firstLineChars="200"/>
-        <w:jc w:val="center"/>
-        <w:rPr>
-          <w:rFonts w:hint="default" w:ascii="Times New Roman" w:hAnsi="Times New Roman" w:eastAsia="宋体" w:cs="Times New Roman"/>
-          <w:b/>
-          <w:bCs/>
-          <w:kern w:val="2"/>
-          <w:sz w:val="21"/>
-          <w:szCs w:val="21"/>
-          <w:lang w:val="en-US" w:eastAsia="zh-CN" w:bidi="ar-SA"/>
-        </w:rPr>
-      </w:pPr>
-      <w:r>
-        <w:rPr>
-          <w:rFonts w:hint="default" w:ascii="Times New Roman" w:hAnsi="Times New Roman" w:eastAsia="宋体" w:cs="Times New Roman"/>
-          <w:b/>
-          <w:bCs/>
-          <w:kern w:val="2"/>
-          <w:sz w:val="21"/>
-          <w:szCs w:val="21"/>
-          <w:lang w:val="en-US" w:eastAsia="zh-CN" w:bidi="ar-SA"/>
-        </w:rPr>
-        <w:t>Table 5-10 Community Post Management Interface</w:t>
-      </w:r>
-    </w:p>
-    <w:tbl>
-      <w:tblPr>
-        <w:tblStyle w:val="19"/>
-        <w:tblW w:w="8660" w:type="dxa"/>
-        <w:jc w:val="center"/>
-        <w:tblBorders>
-          <w:top w:val="none" w:color="auto" w:sz="0" w:space="0"/>
-          <w:left w:val="none" w:color="auto" w:sz="0" w:space="0"/>
-          <w:bottom w:val="none" w:color="auto" w:sz="0" w:space="0"/>
-          <w:right w:val="none" w:color="auto" w:sz="0" w:space="0"/>
-          <w:insideH w:val="none" w:color="auto" w:sz="0" w:space="0"/>
-          <w:insideV w:val="none" w:color="auto" w:sz="0" w:space="0"/>
-        </w:tblBorders>
-        <w:tblLayout w:type="autofit"/>
-        <w:tblCellMar>
-          <w:top w:w="0" w:type="dxa"/>
-          <w:left w:w="10" w:type="dxa"/>
-          <w:bottom w:w="0" w:type="dxa"/>
-          <w:right w:w="10" w:type="dxa"/>
-        </w:tblCellMar>
-      </w:tblPr>
-      <w:tblGrid>
-        <w:gridCol w:w="2398"/>
-        <w:gridCol w:w="6262"/>
-      </w:tblGrid>
-      <w:tr>
-        <w:tblPrEx>
-          <w:tblBorders>
-            <w:top w:val="none" w:color="auto" w:sz="0" w:space="0"/>
-            <w:left w:val="none" w:color="auto" w:sz="0" w:space="0"/>
-            <w:bottom w:val="none" w:color="auto" w:sz="0" w:space="0"/>
-            <w:right w:val="none" w:color="auto" w:sz="0" w:space="0"/>
-            <w:insideH w:val="none" w:color="auto" w:sz="0" w:space="0"/>
-            <w:insideV w:val="none" w:color="auto" w:sz="0" w:space="0"/>
-          </w:tblBorders>
-          <w:tblCellMar>
-            <w:top w:w="0" w:type="dxa"/>
-            <w:left w:w="10" w:type="dxa"/>
-            <w:bottom w:w="0" w:type="dxa"/>
-            <w:right w:w="10" w:type="dxa"/>
-          </w:tblCellMar>
-        </w:tblPrEx>
-        <w:trPr>
-          <w:trHeight w:val="0" w:hRule="atLeast"/>
-          <w:tblHeader/>
-          <w:jc w:val="center"/>
-        </w:trPr>
-        <w:tc>
-          <w:tcPr>
-            <w:tcW w:w="2398" w:type="dxa"/>
-            <w:tcBorders>
-              <w:top w:val="single" w:color="auto" w:sz="12" w:space="0"/>
-              <w:left w:val="nil"/>
-              <w:bottom w:val="nil"/>
-              <w:right w:val="nil"/>
-            </w:tcBorders>
-            <w:shd w:val="clear" w:color="F2F2F2" w:fill="auto"/>
-            <w:noWrap w:val="0"/>
-            <w:tcMar>
-              <w:top w:w="-1" w:type="dxa"/>
-              <w:left w:w="-1" w:type="dxa"/>
-              <w:bottom w:w="-1" w:type="dxa"/>
-              <w:right w:w="-1" w:type="dxa"/>
-            </w:tcMar>
-            <w:vAlign w:val="center"/>
-          </w:tcPr>
-          <w:p>
-            <w:pPr>
-              <w:pStyle w:val="28"/>
-              <w:bidi w:val="0"/>
-            </w:pPr>
-            <w:r>
-              <w:t>接口名称</w:t>
-            </w:r>
-          </w:p>
-        </w:tc>
-        <w:tc>
-          <w:tcPr>
-            <w:tcW w:w="6262" w:type="dxa"/>
-            <w:tcBorders>
-              <w:top w:val="single" w:color="auto" w:sz="12" w:space="0"/>
-              <w:left w:val="nil"/>
-              <w:bottom w:val="nil"/>
-              <w:right w:val="nil"/>
-            </w:tcBorders>
-            <w:noWrap w:val="0"/>
-            <w:tcMar>
-              <w:top w:w="-1" w:type="dxa"/>
-              <w:left w:w="-1" w:type="dxa"/>
-              <w:bottom w:w="-1" w:type="dxa"/>
-              <w:right w:w="-1" w:type="dxa"/>
-            </w:tcMar>
-            <w:vAlign w:val="center"/>
-          </w:tcPr>
-          <w:p>
-            <w:pPr>
-              <w:pStyle w:val="28"/>
-              <w:bidi w:val="0"/>
-            </w:pPr>
-            <w:r>
-              <w:t>社区帖子查询与发布</w:t>
-            </w:r>
-          </w:p>
-        </w:tc>
-      </w:tr>
-      <w:tr>
-        <w:tblPrEx>
-          <w:tblBorders>
-            <w:top w:val="none" w:color="auto" w:sz="0" w:space="0"/>
-            <w:left w:val="none" w:color="auto" w:sz="0" w:space="0"/>
-            <w:bottom w:val="none" w:color="auto" w:sz="0" w:space="0"/>
-            <w:right w:val="none" w:color="auto" w:sz="0" w:space="0"/>
-            <w:insideH w:val="none" w:color="auto" w:sz="0" w:space="0"/>
-            <w:insideV w:val="none" w:color="auto" w:sz="0" w:space="0"/>
-          </w:tblBorders>
-          <w:tblCellMar>
-            <w:top w:w="0" w:type="dxa"/>
-            <w:left w:w="10" w:type="dxa"/>
-            <w:bottom w:w="0" w:type="dxa"/>
-            <w:right w:w="10" w:type="dxa"/>
-          </w:tblCellMar>
-        </w:tblPrEx>
-        <w:trPr>
-          <w:trHeight w:val="0" w:hRule="atLeast"/>
-          <w:tblHeader/>
-          <w:jc w:val="center"/>
-        </w:trPr>
-        <w:tc>
-          <w:tcPr>
-            <w:tcW w:w="2398" w:type="dxa"/>
-            <w:tcBorders>
-              <w:top w:val="single" w:color="auto" w:sz="4" w:space="0"/>
-              <w:left w:val="nil"/>
-              <w:bottom w:val="nil"/>
-              <w:right w:val="nil"/>
-            </w:tcBorders>
-            <w:shd w:val="clear" w:color="F2F2F2" w:fill="auto"/>
-            <w:noWrap w:val="0"/>
-            <w:tcMar>
-              <w:top w:w="-1" w:type="dxa"/>
-              <w:left w:w="-1" w:type="dxa"/>
-              <w:bottom w:w="-1" w:type="dxa"/>
-              <w:right w:w="-1" w:type="dxa"/>
-            </w:tcMar>
-            <w:vAlign w:val="center"/>
-          </w:tcPr>
-          <w:p>
-            <w:pPr>
-              <w:pStyle w:val="28"/>
-              <w:bidi w:val="0"/>
-            </w:pPr>
-            <w:r>
-              <w:t>接口 URL</w:t>
-            </w:r>
-          </w:p>
-        </w:tc>
-        <w:tc>
-          <w:tcPr>
-            <w:tcW w:w="6262" w:type="dxa"/>
-            <w:tcBorders>
-              <w:top w:val="single" w:color="auto" w:sz="4" w:space="0"/>
-              <w:left w:val="nil"/>
-              <w:bottom w:val="nil"/>
-              <w:right w:val="nil"/>
-            </w:tcBorders>
-            <w:noWrap w:val="0"/>
-            <w:tcMar>
-              <w:top w:w="-1" w:type="dxa"/>
-              <w:left w:w="-1" w:type="dxa"/>
-              <w:bottom w:w="-1" w:type="dxa"/>
-              <w:right w:w="-1" w:type="dxa"/>
-            </w:tcMar>
-            <w:vAlign w:val="center"/>
-          </w:tcPr>
-          <w:p>
-            <w:pPr>
-              <w:pStyle w:val="27"/>
-              <w:bidi w:val="0"/>
-            </w:pPr>
-            <w:r>
-              <w:t>/api/community/posts（GET 查询 / POST 发布）
-/api/admin/posts（GET 管理员查询全部）
-/api/community/posts/{id}（DELETE 删除）
-/api/community/posts/{id}/status（PUT 状态变更）</w:t>
-            </w:r>
-          </w:p>
-        </w:tc>
-      </w:tr>
-      <w:tr>
-        <w:tblPrEx>
-          <w:tblBorders>
-            <w:top w:val="none" w:color="auto" w:sz="0" w:space="0"/>
-            <w:left w:val="none" w:color="auto" w:sz="0" w:space="0"/>
-            <w:bottom w:val="none" w:color="auto" w:sz="0" w:space="0"/>
-            <w:right w:val="none" w:color="auto" w:sz="0" w:space="0"/>
-            <w:insideH w:val="none" w:color="auto" w:sz="0" w:space="0"/>
-            <w:insideV w:val="none" w:color="auto" w:sz="0" w:space="0"/>
-          </w:tblBorders>
-          <w:tblCellMar>
-            <w:top w:w="0" w:type="dxa"/>
-            <w:left w:w="10" w:type="dxa"/>
-            <w:bottom w:w="0" w:type="dxa"/>
-            <w:right w:w="10" w:type="dxa"/>
-          </w:tblCellMar>
-        </w:tblPrEx>
-        <w:trPr>
-          <w:trHeight w:val="0" w:hRule="atLeast"/>
-          <w:tblHeader/>
-          <w:jc w:val="center"/>
-        </w:trPr>
-        <w:tc>
-          <w:tcPr>
-            <w:tcW w:w="2398" w:type="dxa"/>
-            <w:tcBorders>
-              <w:top w:val="nil"/>
-              <w:left w:val="nil"/>
-              <w:bottom w:val="nil"/>
-              <w:right w:val="nil"/>
-            </w:tcBorders>
-            <w:shd w:val="clear" w:color="F2F2F2" w:fill="auto"/>
-            <w:noWrap w:val="0"/>
-            <w:tcMar>
-              <w:top w:w="-1" w:type="dxa"/>
-              <w:left w:w="-1" w:type="dxa"/>
-              <w:bottom w:w="-1" w:type="dxa"/>
-              <w:right w:w="-1" w:type="dxa"/>
-            </w:tcMar>
-            <w:vAlign w:val="center"/>
-          </w:tcPr>
-          <w:p>
-            <w:pPr>
-              <w:pStyle w:val="28"/>
-              <w:bidi w:val="0"/>
-            </w:pPr>
-            <w:r>
-              <w:t>请求方式</w:t>
-            </w:r>
-          </w:p>
-        </w:tc>
-        <w:tc>
-          <w:tcPr>
-            <w:tcW w:w="6262" w:type="dxa"/>
-            <w:tcBorders>
-              <w:top w:val="nil"/>
-              <w:left w:val="nil"/>
-              <w:bottom w:val="nil"/>
-              <w:right w:val="nil"/>
-            </w:tcBorders>
-            <w:noWrap w:val="0"/>
-            <w:tcMar>
-              <w:top w:w="-1" w:type="dxa"/>
-              <w:left w:w="-1" w:type="dxa"/>
-              <w:bottom w:w="-1" w:type="dxa"/>
-              <w:right w:w="-1" w:type="dxa"/>
-            </w:tcMar>
-            <w:vAlign w:val="center"/>
-          </w:tcPr>
-          <w:p>
-            <w:pPr>
-              <w:pStyle w:val="27"/>
-              <w:bidi w:val="0"/>
-            </w:pPr>
-            <w:r>
-              <w:t>GET / POST / DELETE / PUT</w:t>
-            </w:r>
-          </w:p>
-        </w:tc>
-      </w:tr>
-      <w:tr>
-        <w:tblPrEx>
-          <w:tblBorders>
-            <w:top w:val="none" w:color="auto" w:sz="0" w:space="0"/>
-            <w:left w:val="none" w:color="auto" w:sz="0" w:space="0"/>
-            <w:bottom w:val="none" w:color="auto" w:sz="0" w:space="0"/>
-            <w:right w:val="none" w:color="auto" w:sz="0" w:space="0"/>
-            <w:insideH w:val="none" w:color="auto" w:sz="0" w:space="0"/>
-            <w:insideV w:val="none" w:color="auto" w:sz="0" w:space="0"/>
-          </w:tblBorders>
-          <w:tblCellMar>
-            <w:top w:w="0" w:type="dxa"/>
-            <w:left w:w="10" w:type="dxa"/>
-            <w:bottom w:w="0" w:type="dxa"/>
-            <w:right w:w="10" w:type="dxa"/>
-          </w:tblCellMar>
-        </w:tblPrEx>
-        <w:trPr>
-          <w:trHeight w:val="0" w:hRule="atLeast"/>
-          <w:tblHeader/>
-          <w:jc w:val="center"/>
-        </w:trPr>
-        <w:tc>
-          <w:tcPr>
-            <w:tcW w:w="2398" w:type="dxa"/>
-            <w:tcBorders>
-              <w:top w:val="nil"/>
-              <w:left w:val="nil"/>
-              <w:bottom w:val="nil"/>
-              <w:right w:val="nil"/>
-            </w:tcBorders>
-            <w:shd w:val="clear" w:color="F2F2F2" w:fill="auto"/>
-            <w:noWrap w:val="0"/>
-            <w:tcMar>
-              <w:top w:w="-1" w:type="dxa"/>
-              <w:left w:w="-1" w:type="dxa"/>
-              <w:bottom w:w="-1" w:type="dxa"/>
-              <w:right w:w="-1" w:type="dxa"/>
-            </w:tcMar>
-            <w:vAlign w:val="center"/>
-          </w:tcPr>
-          <w:p>
-            <w:pPr>
-              <w:pStyle w:val="28"/>
-              <w:bidi w:val="0"/>
-            </w:pPr>
-            <w:r>
-              <w:t>请求参数及主要字段（发布）</w:t>
-            </w:r>
-          </w:p>
-        </w:tc>
-        <w:tc>
-          <w:tcPr>
-            <w:tcW w:w="6262" w:type="dxa"/>
-            <w:tcBorders>
-              <w:top w:val="nil"/>
-              <w:left w:val="nil"/>
-              <w:bottom w:val="nil"/>
-              <w:right w:val="nil"/>
-            </w:tcBorders>
-            <w:noWrap w:val="0"/>
-            <w:tcMar>
-              <w:top w:w="-1" w:type="dxa"/>
-              <w:left w:w="-1" w:type="dxa"/>
-              <w:bottom w:w="-1" w:type="dxa"/>
-              <w:right w:w="-1" w:type="dxa"/>
-            </w:tcMar>
-            <w:vAlign w:val="center"/>
-          </w:tcPr>
-          <w:p>
-            <w:pPr>
-              <w:pStyle w:val="27"/>
-              <w:bidi w:val="0"/>
-            </w:pPr>
-            <w:r>
-              <w:t>title（标题），String 类型
-content（正文），String 类型
-images（图片列表），String 类型（JSON）
-location（地点），String 类型
-latitude（纬度），BigDecimal 类型
-longitude（经度），BigDecimal 类型</w:t>
-            </w:r>
-          </w:p>
-        </w:tc>
-      </w:tr>
-      <w:tr>
-        <w:tblPrEx>
-          <w:tblBorders>
-            <w:top w:val="none" w:color="auto" w:sz="0" w:space="0"/>
-            <w:left w:val="none" w:color="auto" w:sz="0" w:space="0"/>
-            <w:bottom w:val="none" w:color="auto" w:sz="0" w:space="0"/>
-            <w:right w:val="none" w:color="auto" w:sz="0" w:space="0"/>
-            <w:insideH w:val="none" w:color="auto" w:sz="0" w:space="0"/>
-            <w:insideV w:val="none" w:color="auto" w:sz="0" w:space="0"/>
-          </w:tblBorders>
-          <w:tblCellMar>
-            <w:top w:w="0" w:type="dxa"/>
-            <w:left w:w="10" w:type="dxa"/>
-            <w:bottom w:w="0" w:type="dxa"/>
-            <w:right w:w="10" w:type="dxa"/>
-          </w:tblCellMar>
-        </w:tblPrEx>
-        <w:trPr>
-          <w:trHeight w:val="0" w:hRule="atLeast"/>
-          <w:tblHeader/>
-          <w:jc w:val="center"/>
-        </w:trPr>
-        <w:tc>
-          <w:tcPr>
-            <w:tcW w:w="2398" w:type="dxa"/>
-            <w:tcBorders>
-              <w:top w:val="nil"/>
-              <w:left w:val="nil"/>
-              <w:bottom w:val="single" w:color="auto" w:sz="12" w:space="0"/>
-              <w:right w:val="nil"/>
-            </w:tcBorders>
-            <w:shd w:val="clear" w:color="F2F2F2" w:fill="auto"/>
-            <w:noWrap w:val="0"/>
-            <w:tcMar>
-              <w:top w:w="-1" w:type="dxa"/>
-              <w:left w:w="-1" w:type="dxa"/>
-              <w:bottom w:w="-1" w:type="dxa"/>
-              <w:right w:w="-1" w:type="dxa"/>
-            </w:tcMar>
-            <w:vAlign w:val="center"/>
-          </w:tcPr>
-          <w:p>
-            <w:pPr>
-              <w:pStyle w:val="28"/>
-              <w:bidi w:val="0"/>
-            </w:pPr>
-            <w:r>
-              <w:t>返回参数及主要字段</w:t>
-            </w:r>
-          </w:p>
-        </w:tc>
-        <w:tc>
-          <w:tcPr>
-            <w:tcW w:w="6262" w:type="dxa"/>
-            <w:tcBorders>
-              <w:top w:val="nil"/>
-              <w:left w:val="nil"/>
-              <w:bottom w:val="single" w:color="auto" w:sz="12" w:space="0"/>
-              <w:right w:val="nil"/>
-            </w:tcBorders>
-            <w:noWrap w:val="0"/>
-            <w:tcMar>
-              <w:top w:w="-1" w:type="dxa"/>
-              <w:left w:w="-1" w:type="dxa"/>
-              <w:bottom w:w="-1" w:type="dxa"/>
-              <w:right w:w="-1" w:type="dxa"/>
-            </w:tcMar>
-            <w:vAlign w:val="center"/>
-          </w:tcPr>
-          <w:p>
-            <w:pPr>
-              <w:pStyle w:val="27"/>
-              <w:bidi w:val="0"/>
-            </w:pPr>
-            <w:r>
-              <w:t>code（响应代码），整数类型
-msg（返回信息），String 类型
-data（帖子列表），List&lt;Post&gt;类型，每个帖子包含发布用户信息（username、nickname、avatar）及评论列表</w:t>
-            </w:r>
-          </w:p>
-        </w:tc>
-      </w:tr>
-    </w:tbl>
-    <w:p>
-      <w:pPr>
-        <w:spacing w:before="60"/>
-      </w:pPr>
+        <w:t>社区帖子数据存储在 post 表中，包含帖子标题（title）、正文内容（content）、图片列表（images，JSON 格式存储）、发布地点（location）、经纬度坐标（latitude/longitude）、发布用户 ID（user_id）以及显示状态（status，0 隐藏/1 正常）。帖子查询时通过 SQL JOIN 关联 sys_user 表获取发布用户的用户名、昵称和头像信息。</w:t>
+      </w:r>
     </w:p>
     <w:p>
       <w:pPr>
@@ -16658,44 +15298,33 @@
         <w:ind w:leftChars="0" w:firstLine="480" w:firstLineChars="200"/>
         <w:jc w:val="both"/>
         <w:rPr>
+          <w:rFonts w:hint="eastAsia" w:cstheme="minorBidi"/>
+          <w:kern w:val="2"/>
+          <w:sz w:val="24"/>
+          <w:szCs w:val="22"/>
+          <w:lang w:val="en-US" w:eastAsia="zh-CN" w:bidi="ar-SA"/>
+        </w:rPr>
+      </w:pPr>
+      <w:r>
+        <w:rPr>
           <w:rFonts w:hint="eastAsia" w:ascii="Times New Roman" w:hAnsi="Times New Roman" w:eastAsia="宋体" w:cstheme="minorBidi"/>
           <w:kern w:val="2"/>
           <w:sz w:val="24"/>
           <w:szCs w:val="22"/>
           <w:lang w:val="en-US" w:eastAsia="zh-CN" w:bidi="ar-SA"/>
         </w:rPr>
-      </w:pPr>
-      <w:r>
-        <w:rPr>
-          <w:rFonts w:hint="eastAsia" w:ascii="Times New Roman" w:hAnsi="Times New Roman" w:eastAsia="宋体" w:cstheme="minorBidi"/>
+        <w:t>帖子查询接口的实现流程如下：前台用户调用 GET /api/community/posts 接口时，系统通过 PostMapper 中自定义的 selectListWithUser 方法执行 SQL JOIN 查询，关联 post 表与 sys_user 表，并在查询条件中过滤 status=1（仅显示正常状态的帖子）。查询结果返回后，系统遍历每个帖子，通过 CommentMapper 的自定义查询方法加载该帖子下的评论列表（同样仅显示 status=1 的评论），并填充到 Post 对象的 comments 属性中。管理员调用 /api/admin/posts 接口时，系统使用 selectAdminListWithUser 方法，不过滤 status 字段，展示包括已隐藏帖子在内的全部内容，便于管理员进行全面的内容管理。帖子发布接口通过 HttpSession 获取当前登录用户的 ID 自动填充到 userId 字段，并将 status 默认设置为 1（正常显示）。帖子的删除和状态变更操作仅限管理员执行，管理员可将违规帖子设为隐藏（status=0）或直接删除。</w:t>
+      </w:r>
+      <w:r>
+        <w:rPr>
+          <w:rFonts w:hint="eastAsia" w:cstheme="minorBidi"/>
           <w:kern w:val="2"/>
           <w:sz w:val="24"/>
           <w:szCs w:val="22"/>
           <w:lang w:val="en-US" w:eastAsia="zh-CN" w:bidi="ar-SA"/>
         </w:rPr>
-        <w:t>帖子查询接口的实现流程如下：前台用户调用 GET /api/community/posts 接口时，系统通过 PostMapper 中自定义的 selectListWithUser 方法执行 SQL JOIN 查询，关联 post 表与 sys_user 表，并在查询条件中过滤 status=1（仅显示正常状态的帖子）。查询结果返回后，系统遍历每个帖子，通过 CommentMapper 的自定义查询方法加载该帖子下的评论列表（同样仅显示 status=1 的评论），并填充到 Post 对象的 comments 属性中。管理员调用 /api/admin/posts 接口时，系统使用 selectAdminListWithUser 方法，不过滤 status 字段，展示包括已隐藏帖子在内的全部内容，便于管理员进行全面的内容管理。帖子发布接口通过 HttpSession 获取当前登录用户的 ID 自动填充到 userId 字段，并将 status 默认设置为 1（正常显示）。帖子的删除和状态变更操作仅限管理员执行，管理员可将违规帖子设为隐藏（status=0）或直接删除。</w:t>
-      </w:r>
-    </w:p>
-    <w:p>
-      <w:pPr>
-        <w:pStyle w:val="4"/>
-        <w:bidi w:val="0"/>
-        <w:rPr>
-          <w:rFonts w:hint="default"/>
-          <w:lang w:val="en-US" w:eastAsia="zh-CN"/>
-        </w:rPr>
-      </w:pPr>
-      <w:bookmarkStart w:id="106" w:name="_Toc5986"/>
-      <w:bookmarkStart w:id="107" w:name="_Toc31"/>
-      <w:r>
-        <w:rPr>
-          <w:rFonts w:hint="default"/>
-          <w:lang w:val="en-US" w:eastAsia="zh-CN"/>
-        </w:rPr>
-        <w:t>5.4.2 社区评论管理模块设计与实现</w:t>
-      </w:r>
-      <w:bookmarkEnd w:id="106"/>
-      <w:bookmarkEnd w:id="107"/>
+        <w:t>社区中心页面如图5-6所示。</w:t>
+      </w:r>
     </w:p>
     <w:p>
       <w:pPr>
@@ -16705,7 +15334,7 @@
         <w:ind w:leftChars="0" w:firstLine="480" w:firstLineChars="200"/>
         <w:jc w:val="both"/>
         <w:rPr>
-          <w:rFonts w:hint="eastAsia" w:ascii="Times New Roman" w:hAnsi="Times New Roman" w:eastAsia="宋体" w:cstheme="minorBidi"/>
+          <w:rFonts w:hint="default" w:ascii="Times New Roman" w:hAnsi="Times New Roman" w:eastAsia="宋体" w:cstheme="minorBidi"/>
           <w:kern w:val="2"/>
           <w:sz w:val="24"/>
           <w:szCs w:val="22"/>
@@ -16713,531 +15342,69 @@
         </w:rPr>
       </w:pPr>
       <w:r>
-        <w:rPr>
-          <w:rFonts w:hint="eastAsia" w:ascii="Times New Roman" w:hAnsi="Times New Roman" w:eastAsia="宋体" w:cstheme="minorBidi"/>
-          <w:kern w:val="2"/>
-          <w:sz w:val="24"/>
-          <w:szCs w:val="22"/>
-          <w:lang w:val="en-US" w:eastAsia="zh-CN" w:bidi="ar-SA"/>
-        </w:rPr>
-        <w:t>评论数据存储在 comment 表中，包含关联的帖子 ID（post_id，设置了 ON DELETE CASCADE 外键约束，删除帖子时自动级联删除评论）、评论用户 ID（user_id）、评论内容（content）、评论图片（image）、父评论 ID（parent_id，支持评论回复的多级嵌套结构）以及显示状态（status）。评论查询时同样通过 SQL JOIN 关联 sys_user 表获取评论用户的用户名、昵称和头像信息。评论管理相关接口详细信息见表 5-11。</w:t>
-      </w:r>
-    </w:p>
-    <w:p>
-      <w:pPr>
-        <w:keepNext/>
-        <w:widowControl w:val="0"/>
-        <w:spacing w:line="300" w:lineRule="auto"/>
-        <w:ind w:firstLine="422" w:firstLineChars="200"/>
-        <w:jc w:val="center"/>
-        <w:rPr>
-          <w:rFonts w:hint="default" w:ascii="Times New Roman" w:hAnsi="Times New Roman" w:eastAsia="宋体" w:cs="Times New Roman"/>
-          <w:b/>
-          <w:bCs/>
-          <w:kern w:val="2"/>
-          <w:sz w:val="21"/>
-          <w:szCs w:val="21"/>
-          <w:lang w:val="en-US" w:eastAsia="zh-CN" w:bidi="ar-SA"/>
-        </w:rPr>
-      </w:pPr>
-    </w:p>
-    <w:p>
-      <w:pPr>
-        <w:keepNext/>
-        <w:widowControl w:val="0"/>
-        <w:spacing w:line="300" w:lineRule="auto"/>
-        <w:ind w:firstLine="422" w:firstLineChars="200"/>
-        <w:jc w:val="center"/>
-        <w:rPr>
-          <w:rFonts w:hint="default" w:ascii="Times New Roman" w:hAnsi="Times New Roman" w:eastAsia="宋体" w:cs="Times New Roman"/>
-          <w:b/>
-          <w:bCs/>
-          <w:kern w:val="2"/>
-          <w:sz w:val="21"/>
-          <w:szCs w:val="21"/>
-          <w:lang w:val="en-US" w:eastAsia="zh-CN" w:bidi="ar-SA"/>
-        </w:rPr>
-      </w:pPr>
-      <w:r>
-        <w:rPr>
-          <w:rFonts w:hint="default" w:ascii="Times New Roman" w:hAnsi="Times New Roman" w:eastAsia="宋体" w:cs="Times New Roman"/>
-          <w:b/>
-          <w:bCs/>
-          <w:kern w:val="2"/>
-          <w:sz w:val="21"/>
-          <w:szCs w:val="21"/>
-          <w:lang w:val="en-US" w:eastAsia="zh-CN" w:bidi="ar-SA"/>
-        </w:rPr>
-        <w:t>表 5-11 社区评论管理接口</w:t>
-      </w:r>
-    </w:p>
-    <w:p>
-      <w:pPr>
-        <w:keepNext/>
-        <w:widowControl w:val="0"/>
-        <w:spacing w:line="300" w:lineRule="auto"/>
-        <w:ind w:firstLine="422" w:firstLineChars="200"/>
-        <w:jc w:val="center"/>
-        <w:rPr>
-          <w:rFonts w:hint="default" w:ascii="Times New Roman" w:hAnsi="Times New Roman" w:eastAsia="宋体" w:cs="Times New Roman"/>
-          <w:b/>
-          <w:bCs/>
-          <w:kern w:val="2"/>
-          <w:sz w:val="21"/>
-          <w:szCs w:val="21"/>
-          <w:lang w:val="en-US" w:eastAsia="zh-CN" w:bidi="ar-SA"/>
-        </w:rPr>
-      </w:pPr>
-      <w:r>
-        <w:rPr>
-          <w:rFonts w:hint="default" w:ascii="Times New Roman" w:hAnsi="Times New Roman" w:eastAsia="宋体" w:cs="Times New Roman"/>
-          <w:b/>
-          <w:bCs/>
-          <w:kern w:val="2"/>
-          <w:sz w:val="21"/>
-          <w:szCs w:val="21"/>
-          <w:lang w:val="en-US" w:eastAsia="zh-CN" w:bidi="ar-SA"/>
-        </w:rPr>
-        <w:t>Table 5-11 Community Comment Management Interface</w:t>
-      </w:r>
-    </w:p>
-    <w:tbl>
-      <w:tblPr>
-        <w:tblStyle w:val="19"/>
-        <w:tblW w:w="8660" w:type="dxa"/>
-        <w:jc w:val="center"/>
-        <w:tblBorders>
-          <w:top w:val="none" w:color="auto" w:sz="0" w:space="0"/>
-          <w:left w:val="none" w:color="auto" w:sz="0" w:space="0"/>
-          <w:bottom w:val="none" w:color="auto" w:sz="0" w:space="0"/>
-          <w:right w:val="none" w:color="auto" w:sz="0" w:space="0"/>
-          <w:insideH w:val="none" w:color="auto" w:sz="0" w:space="0"/>
-          <w:insideV w:val="none" w:color="auto" w:sz="0" w:space="0"/>
-        </w:tblBorders>
-        <w:tblLayout w:type="autofit"/>
-        <w:tblCellMar>
-          <w:top w:w="0" w:type="dxa"/>
-          <w:left w:w="10" w:type="dxa"/>
-          <w:bottom w:w="0" w:type="dxa"/>
-          <w:right w:w="10" w:type="dxa"/>
-        </w:tblCellMar>
-      </w:tblPr>
-      <w:tblGrid>
-        <w:gridCol w:w="1564"/>
-        <w:gridCol w:w="7096"/>
-      </w:tblGrid>
-      <w:tr>
-        <w:tblPrEx>
-          <w:tblBorders>
-            <w:top w:val="none" w:color="auto" w:sz="0" w:space="0"/>
-            <w:left w:val="none" w:color="auto" w:sz="0" w:space="0"/>
-            <w:bottom w:val="none" w:color="auto" w:sz="0" w:space="0"/>
-            <w:right w:val="none" w:color="auto" w:sz="0" w:space="0"/>
-            <w:insideH w:val="none" w:color="auto" w:sz="0" w:space="0"/>
-            <w:insideV w:val="none" w:color="auto" w:sz="0" w:space="0"/>
-          </w:tblBorders>
-          <w:tblCellMar>
-            <w:top w:w="0" w:type="dxa"/>
-            <w:left w:w="10" w:type="dxa"/>
-            <w:bottom w:w="0" w:type="dxa"/>
-            <w:right w:w="10" w:type="dxa"/>
-          </w:tblCellMar>
-        </w:tblPrEx>
-        <w:trPr>
-          <w:trHeight w:val="0" w:hRule="atLeast"/>
-          <w:tblHeader/>
-          <w:jc w:val="center"/>
-        </w:trPr>
-        <w:tc>
-          <w:tcPr>
-            <w:tcW w:w="1564" w:type="dxa"/>
-            <w:tcBorders>
-              <w:top w:val="single" w:color="auto" w:sz="12" w:space="0"/>
-              <w:left w:val="nil"/>
-              <w:bottom w:val="nil"/>
-              <w:right w:val="nil"/>
-            </w:tcBorders>
-            <w:shd w:val="clear" w:color="F2F2F2" w:fill="auto"/>
-            <w:noWrap w:val="0"/>
-            <w:tcMar>
-              <w:top w:w="-1" w:type="dxa"/>
-              <w:left w:w="-1" w:type="dxa"/>
-              <w:bottom w:w="-1" w:type="dxa"/>
-              <w:right w:w="-1" w:type="dxa"/>
-            </w:tcMar>
-            <w:vAlign w:val="center"/>
-          </w:tcPr>
-          <w:p>
-            <w:pPr>
-              <w:pStyle w:val="28"/>
-              <w:bidi w:val="0"/>
-            </w:pPr>
-            <w:r>
-              <w:t>接口名称</w:t>
-            </w:r>
-          </w:p>
-        </w:tc>
-        <w:tc>
-          <w:tcPr>
-            <w:tcW w:w="7096" w:type="dxa"/>
-            <w:tcBorders>
-              <w:top w:val="single" w:color="auto" w:sz="12" w:space="0"/>
-              <w:left w:val="nil"/>
-              <w:bottom w:val="nil"/>
-              <w:right w:val="nil"/>
-            </w:tcBorders>
-            <w:noWrap w:val="0"/>
-            <w:tcMar>
-              <w:top w:w="-1" w:type="dxa"/>
-              <w:left w:w="-1" w:type="dxa"/>
-              <w:bottom w:w="-1" w:type="dxa"/>
-              <w:right w:w="-1" w:type="dxa"/>
-            </w:tcMar>
-            <w:vAlign w:val="center"/>
-          </w:tcPr>
-          <w:p>
-            <w:pPr>
-              <w:pStyle w:val="28"/>
-              <w:bidi w:val="0"/>
-            </w:pPr>
-            <w:r>
-              <w:t>社区评论查询与发布</w:t>
-            </w:r>
-          </w:p>
-        </w:tc>
-      </w:tr>
-      <w:tr>
-        <w:tblPrEx>
-          <w:tblBorders>
-            <w:top w:val="none" w:color="auto" w:sz="0" w:space="0"/>
-            <w:left w:val="none" w:color="auto" w:sz="0" w:space="0"/>
-            <w:bottom w:val="none" w:color="auto" w:sz="0" w:space="0"/>
-            <w:right w:val="none" w:color="auto" w:sz="0" w:space="0"/>
-            <w:insideH w:val="none" w:color="auto" w:sz="0" w:space="0"/>
-            <w:insideV w:val="none" w:color="auto" w:sz="0" w:space="0"/>
-          </w:tblBorders>
-          <w:tblCellMar>
-            <w:top w:w="0" w:type="dxa"/>
-            <w:left w:w="10" w:type="dxa"/>
-            <w:bottom w:w="0" w:type="dxa"/>
-            <w:right w:w="10" w:type="dxa"/>
-          </w:tblCellMar>
-        </w:tblPrEx>
-        <w:trPr>
-          <w:trHeight w:val="0" w:hRule="atLeast"/>
-          <w:tblHeader/>
-          <w:jc w:val="center"/>
-        </w:trPr>
-        <w:tc>
-          <w:tcPr>
-            <w:tcW w:w="1564" w:type="dxa"/>
-            <w:tcBorders>
-              <w:top w:val="single" w:color="auto" w:sz="4" w:space="0"/>
-              <w:left w:val="nil"/>
-              <w:bottom w:val="nil"/>
-              <w:right w:val="nil"/>
-            </w:tcBorders>
-            <w:shd w:val="clear" w:color="F2F2F2" w:fill="auto"/>
-            <w:noWrap w:val="0"/>
-            <w:tcMar>
-              <w:top w:w="-1" w:type="dxa"/>
-              <w:left w:w="-1" w:type="dxa"/>
-              <w:bottom w:w="-1" w:type="dxa"/>
-              <w:right w:w="-1" w:type="dxa"/>
-            </w:tcMar>
-            <w:vAlign w:val="center"/>
-          </w:tcPr>
-          <w:p>
-            <w:pPr>
-              <w:pStyle w:val="28"/>
-              <w:bidi w:val="0"/>
-            </w:pPr>
-            <w:r>
-              <w:t>接口 URL</w:t>
-            </w:r>
-          </w:p>
-        </w:tc>
-        <w:tc>
-          <w:tcPr>
-            <w:tcW w:w="7096" w:type="dxa"/>
-            <w:tcBorders>
-              <w:top w:val="single" w:color="auto" w:sz="4" w:space="0"/>
-              <w:left w:val="nil"/>
-              <w:bottom w:val="nil"/>
-              <w:right w:val="nil"/>
-            </w:tcBorders>
-            <w:noWrap w:val="0"/>
-            <w:tcMar>
-              <w:top w:w="-1" w:type="dxa"/>
-              <w:left w:w="-1" w:type="dxa"/>
-              <w:bottom w:w="-1" w:type="dxa"/>
-              <w:right w:w="-1" w:type="dxa"/>
-            </w:tcMar>
-            <w:vAlign w:val="center"/>
-          </w:tcPr>
-          <w:p>
-            <w:pPr>
-              <w:pStyle w:val="27"/>
-              <w:bidi w:val="0"/>
-            </w:pPr>
-            <w:r>
-              <w:t>/api/community/posts/{postId}/comments（GET 查询）
-/api/community/comments（POST 发布）
-/api/community/comments/{id}（DELETE 删除 / PUT 状态变更）</w:t>
-            </w:r>
-          </w:p>
-        </w:tc>
-      </w:tr>
-      <w:tr>
-        <w:tblPrEx>
-          <w:tblBorders>
-            <w:top w:val="none" w:color="auto" w:sz="0" w:space="0"/>
-            <w:left w:val="none" w:color="auto" w:sz="0" w:space="0"/>
-            <w:bottom w:val="none" w:color="auto" w:sz="0" w:space="0"/>
-            <w:right w:val="none" w:color="auto" w:sz="0" w:space="0"/>
-            <w:insideH w:val="none" w:color="auto" w:sz="0" w:space="0"/>
-            <w:insideV w:val="none" w:color="auto" w:sz="0" w:space="0"/>
-          </w:tblBorders>
-          <w:tblCellMar>
-            <w:top w:w="0" w:type="dxa"/>
-            <w:left w:w="10" w:type="dxa"/>
-            <w:bottom w:w="0" w:type="dxa"/>
-            <w:right w:w="10" w:type="dxa"/>
-          </w:tblCellMar>
-        </w:tblPrEx>
-        <w:trPr>
-          <w:trHeight w:val="0" w:hRule="atLeast"/>
-          <w:tblHeader/>
-          <w:jc w:val="center"/>
-        </w:trPr>
-        <w:tc>
-          <w:tcPr>
-            <w:tcW w:w="1564" w:type="dxa"/>
-            <w:tcBorders>
-              <w:top w:val="nil"/>
-              <w:left w:val="nil"/>
-              <w:bottom w:val="nil"/>
-              <w:right w:val="nil"/>
-            </w:tcBorders>
-            <w:shd w:val="clear" w:color="F2F2F2" w:fill="auto"/>
-            <w:noWrap w:val="0"/>
-            <w:tcMar>
-              <w:top w:w="-1" w:type="dxa"/>
-              <w:left w:w="-1" w:type="dxa"/>
-              <w:bottom w:w="-1" w:type="dxa"/>
-              <w:right w:w="-1" w:type="dxa"/>
-            </w:tcMar>
-            <w:vAlign w:val="center"/>
-          </w:tcPr>
-          <w:p>
-            <w:pPr>
-              <w:pStyle w:val="28"/>
-              <w:bidi w:val="0"/>
-            </w:pPr>
-            <w:r>
-              <w:t>请求方式</w:t>
-            </w:r>
-          </w:p>
-        </w:tc>
-        <w:tc>
-          <w:tcPr>
-            <w:tcW w:w="7096" w:type="dxa"/>
-            <w:tcBorders>
-              <w:top w:val="nil"/>
-              <w:left w:val="nil"/>
-              <w:bottom w:val="nil"/>
-              <w:right w:val="nil"/>
-            </w:tcBorders>
-            <w:noWrap w:val="0"/>
-            <w:tcMar>
-              <w:top w:w="-1" w:type="dxa"/>
-              <w:left w:w="-1" w:type="dxa"/>
-              <w:bottom w:w="-1" w:type="dxa"/>
-              <w:right w:w="-1" w:type="dxa"/>
-            </w:tcMar>
-            <w:vAlign w:val="center"/>
-          </w:tcPr>
-          <w:p>
-            <w:pPr>
-              <w:pStyle w:val="27"/>
-              <w:bidi w:val="0"/>
-            </w:pPr>
-            <w:r>
-              <w:t>GET / POST / DELETE / PUT</w:t>
-            </w:r>
-          </w:p>
-        </w:tc>
-      </w:tr>
-      <w:tr>
-        <w:tblPrEx>
-          <w:tblBorders>
-            <w:top w:val="none" w:color="auto" w:sz="0" w:space="0"/>
-            <w:left w:val="none" w:color="auto" w:sz="0" w:space="0"/>
-            <w:bottom w:val="none" w:color="auto" w:sz="0" w:space="0"/>
-            <w:right w:val="none" w:color="auto" w:sz="0" w:space="0"/>
-            <w:insideH w:val="none" w:color="auto" w:sz="0" w:space="0"/>
-            <w:insideV w:val="none" w:color="auto" w:sz="0" w:space="0"/>
-          </w:tblBorders>
-          <w:tblCellMar>
-            <w:top w:w="0" w:type="dxa"/>
-            <w:left w:w="10" w:type="dxa"/>
-            <w:bottom w:w="0" w:type="dxa"/>
-            <w:right w:w="10" w:type="dxa"/>
-          </w:tblCellMar>
-        </w:tblPrEx>
-        <w:trPr>
-          <w:trHeight w:val="0" w:hRule="atLeast"/>
-          <w:tblHeader/>
-          <w:jc w:val="center"/>
-        </w:trPr>
-        <w:tc>
-          <w:tcPr>
-            <w:tcW w:w="1564" w:type="dxa"/>
-            <w:tcBorders>
-              <w:top w:val="nil"/>
-              <w:left w:val="nil"/>
-              <w:bottom w:val="nil"/>
-              <w:right w:val="nil"/>
-            </w:tcBorders>
-            <w:shd w:val="clear" w:color="F2F2F2" w:fill="auto"/>
-            <w:noWrap w:val="0"/>
-            <w:tcMar>
-              <w:top w:w="-1" w:type="dxa"/>
-              <w:left w:w="-1" w:type="dxa"/>
-              <w:bottom w:w="-1" w:type="dxa"/>
-              <w:right w:w="-1" w:type="dxa"/>
-            </w:tcMar>
-            <w:vAlign w:val="center"/>
-          </w:tcPr>
-          <w:p>
-            <w:pPr>
-              <w:pStyle w:val="28"/>
-              <w:bidi w:val="0"/>
-            </w:pPr>
-            <w:r>
-              <w:t>请求参数及主要字段（发布）</w:t>
-            </w:r>
-          </w:p>
-        </w:tc>
-        <w:tc>
-          <w:tcPr>
-            <w:tcW w:w="7096" w:type="dxa"/>
-            <w:tcBorders>
-              <w:top w:val="nil"/>
-              <w:left w:val="nil"/>
-              <w:bottom w:val="nil"/>
-              <w:right w:val="nil"/>
-            </w:tcBorders>
-            <w:noWrap w:val="0"/>
-            <w:tcMar>
-              <w:top w:w="-1" w:type="dxa"/>
-              <w:left w:w="-1" w:type="dxa"/>
-              <w:bottom w:w="-1" w:type="dxa"/>
-              <w:right w:w="-1" w:type="dxa"/>
-            </w:tcMar>
-            <w:vAlign w:val="center"/>
-          </w:tcPr>
-          <w:p>
-            <w:pPr>
-              <w:pStyle w:val="27"/>
-              <w:bidi w:val="0"/>
-            </w:pPr>
-            <w:r>
-              <w:t>postId（帖子 ID），Long 类型
-content（评论内容），String 类型
-image（图片 URL），String 类型，可选
-parentId（父评论 ID），Long 类型，可选</w:t>
-            </w:r>
-          </w:p>
-        </w:tc>
-      </w:tr>
-      <w:tr>
-        <w:tblPrEx>
-          <w:tblBorders>
-            <w:top w:val="none" w:color="auto" w:sz="0" w:space="0"/>
-            <w:left w:val="none" w:color="auto" w:sz="0" w:space="0"/>
-            <w:bottom w:val="none" w:color="auto" w:sz="0" w:space="0"/>
-            <w:right w:val="none" w:color="auto" w:sz="0" w:space="0"/>
-            <w:insideH w:val="none" w:color="auto" w:sz="0" w:space="0"/>
-            <w:insideV w:val="none" w:color="auto" w:sz="0" w:space="0"/>
-          </w:tblBorders>
-          <w:tblCellMar>
-            <w:top w:w="0" w:type="dxa"/>
-            <w:left w:w="10" w:type="dxa"/>
-            <w:bottom w:w="0" w:type="dxa"/>
-            <w:right w:w="10" w:type="dxa"/>
-          </w:tblCellMar>
-        </w:tblPrEx>
-        <w:trPr>
-          <w:trHeight w:val="0" w:hRule="atLeast"/>
-          <w:tblHeader/>
-          <w:jc w:val="center"/>
-        </w:trPr>
-        <w:tc>
-          <w:tcPr>
-            <w:tcW w:w="1564" w:type="dxa"/>
-            <w:tcBorders>
-              <w:top w:val="nil"/>
-              <w:left w:val="nil"/>
-              <w:bottom w:val="single" w:color="auto" w:sz="12" w:space="0"/>
-              <w:right w:val="nil"/>
-            </w:tcBorders>
-            <w:shd w:val="clear" w:color="F2F2F2" w:fill="auto"/>
-            <w:noWrap w:val="0"/>
-            <w:tcMar>
-              <w:top w:w="-1" w:type="dxa"/>
-              <w:left w:w="-1" w:type="dxa"/>
-              <w:bottom w:w="-1" w:type="dxa"/>
-              <w:right w:w="-1" w:type="dxa"/>
-            </w:tcMar>
-            <w:vAlign w:val="center"/>
-          </w:tcPr>
-          <w:p>
-            <w:pPr>
-              <w:pStyle w:val="28"/>
-              <w:bidi w:val="0"/>
-            </w:pPr>
-            <w:r>
-              <w:t>返回参数及主要字段</w:t>
-            </w:r>
-          </w:p>
-        </w:tc>
-        <w:tc>
-          <w:tcPr>
-            <w:tcW w:w="7096" w:type="dxa"/>
-            <w:tcBorders>
-              <w:top w:val="nil"/>
-              <w:left w:val="nil"/>
-              <w:bottom w:val="single" w:color="auto" w:sz="12" w:space="0"/>
-              <w:right w:val="nil"/>
-            </w:tcBorders>
-            <w:noWrap w:val="0"/>
-            <w:tcMar>
-              <w:top w:w="-1" w:type="dxa"/>
-              <w:left w:w="-1" w:type="dxa"/>
-              <w:bottom w:w="-1" w:type="dxa"/>
-              <w:right w:w="-1" w:type="dxa"/>
-            </w:tcMar>
-            <w:vAlign w:val="center"/>
-          </w:tcPr>
-          <w:p>
-            <w:pPr>
-              <w:pStyle w:val="27"/>
-              <w:bidi w:val="0"/>
-            </w:pPr>
-            <w:r>
-              <w:t>code（响应代码），整数类型
-msg（返回信息），String 类型
-data（评论列表），List&lt;Comment&gt;类型，每个评论包含用户信息</w:t>
-            </w:r>
-          </w:p>
-        </w:tc>
-      </w:tr>
-    </w:tbl>
-    <w:p>
-      <w:pPr>
-        <w:spacing w:before="60"/>
-      </w:pPr>
+        <w:drawing>
+          <wp:inline distT="0" distB="0" distL="114300" distR="114300">
+            <wp:extent cx="5469255" cy="2707005"/>
+            <wp:effectExtent l="0" t="0" r="17145" b="17145"/>
+            <wp:docPr id="11" name="图片 3"/>
+            <wp:cNvGraphicFramePr>
+              <a:graphicFrameLocks xmlns:a="http://schemas.openxmlformats.org/drawingml/2006/main" noChangeAspect="1"/>
+            </wp:cNvGraphicFramePr>
+            <a:graphic xmlns:a="http://schemas.openxmlformats.org/drawingml/2006/main">
+              <a:graphicData uri="http://schemas.openxmlformats.org/drawingml/2006/picture">
+                <pic:pic xmlns:pic="http://schemas.openxmlformats.org/drawingml/2006/picture">
+                  <pic:nvPicPr>
+                    <pic:cNvPr id="11" name="图片 3"/>
+                    <pic:cNvPicPr>
+                      <a:picLocks noChangeAspect="1"/>
+                    </pic:cNvPicPr>
+                  </pic:nvPicPr>
+                  <pic:blipFill>
+                    <a:blip r:embed="rId16"/>
+                    <a:stretch>
+                      <a:fillRect/>
+                    </a:stretch>
+                  </pic:blipFill>
+                  <pic:spPr>
+                    <a:xfrm>
+                      <a:off x="0" y="0"/>
+                      <a:ext cx="5469255" cy="2707005"/>
+                    </a:xfrm>
+                    <a:prstGeom prst="rect">
+                      <a:avLst/>
+                    </a:prstGeom>
+                    <a:noFill/>
+                    <a:ln>
+                      <a:noFill/>
+                    </a:ln>
+                  </pic:spPr>
+                </pic:pic>
+              </a:graphicData>
+            </a:graphic>
+          </wp:inline>
+        </w:drawing>
+      </w:r>
+    </w:p>
+    <w:p>
+      <w:pPr>
+        <w:pStyle w:val="4"/>
+        <w:bidi w:val="0"/>
+        <w:rPr>
+          <w:rFonts w:hint="default"/>
+          <w:lang w:val="en-US" w:eastAsia="zh-CN"/>
+        </w:rPr>
+      </w:pPr>
+      <w:bookmarkStart w:id="106" w:name="_Toc5986"/>
+      <w:bookmarkStart w:id="107" w:name="_Toc31"/>
+      <w:r>
+        <w:rPr>
+          <w:rFonts w:hint="default"/>
+          <w:lang w:val="en-US" w:eastAsia="zh-CN"/>
+        </w:rPr>
+        <w:t>5.4.2 社区评论管理模块设计与实现</w:t>
+      </w:r>
+      <w:bookmarkEnd w:id="106"/>
+      <w:bookmarkEnd w:id="107"/>
     </w:p>
     <w:p>
       <w:pPr>
@@ -17262,29 +15429,8 @@
           <w:szCs w:val="22"/>
           <w:lang w:val="en-US" w:eastAsia="zh-CN" w:bidi="ar-SA"/>
         </w:rPr>
-        <w:t>评论发布接口通过 HttpSession 获取当前登录用户的 ID 自动填充，默认 status 设置为 1。评论查询接口根据帖子 ID 获取该帖子下的所有可见评论。评论的删除和状态变更操作仅限管理员执行，用于内容审核和违规评论处理。评论表通过 post_id 外键与帖子表关联，设置了 ON DELETE CASCADE 级联删除策略，当管理员删除帖子时，该帖子下的所有评论将自动被清理，避免了数据残留问题。此外，评论表设计了 parent_id 字段用于支持评论的多级回复，为后续扩展社区互动功能（如回复通知、评论嵌套展示）预留了数据结构基础。</w:t>
-      </w:r>
-    </w:p>
-    <w:p>
-      <w:pPr>
-        <w:pStyle w:val="3"/>
-        <w:bidi w:val="0"/>
-        <w:rPr>
-          <w:rFonts w:hint="default"/>
-          <w:lang w:val="en-US" w:eastAsia="zh-Hans"/>
-        </w:rPr>
-      </w:pPr>
-      <w:bookmarkStart w:id="108" w:name="_Toc32120"/>
-      <w:bookmarkStart w:id="109" w:name="_Toc30436"/>
-      <w:r>
-        <w:rPr>
-          <w:rFonts w:hint="default"/>
-          <w:lang w:val="en-US" w:eastAsia="zh-Hans"/>
-        </w:rPr>
-        <w:t>5.5 捐赠与物资管理模块设计与实现</w:t>
-      </w:r>
-      <w:bookmarkEnd w:id="108"/>
-      <w:bookmarkEnd w:id="109"/>
+        <w:t>评论数据存储在 comment 表中，包含关联的帖子 ID（post_id，设置了 ON DELETE CASCADE 外键约束，删除帖子时自动级联删除评论）、评论用户 ID（user_id）、评论内容（content）、评论图片（image）、父评论 ID（parent_id，支持评论回复的多级嵌套结构）以及显示状态（status）。评论查询时同样通过 SQL JOIN 关联 sys_user 表获取评论用户的用户名、昵称和头像信息。</w:t>
+      </w:r>
     </w:p>
     <w:p>
       <w:pPr>
@@ -17294,7 +15440,7 @@
         <w:ind w:leftChars="0" w:firstLine="480" w:firstLineChars="200"/>
         <w:jc w:val="both"/>
         <w:rPr>
-          <w:rFonts w:hint="default" w:ascii="Times New Roman" w:hAnsi="Times New Roman" w:eastAsia="宋体" w:cstheme="minorBidi"/>
+          <w:rFonts w:hint="default" w:cstheme="minorBidi"/>
           <w:kern w:val="2"/>
           <w:sz w:val="24"/>
           <w:szCs w:val="22"/>
@@ -17303,35 +15449,35 @@
       </w:pPr>
       <w:r>
         <w:rPr>
-          <w:rFonts w:hint="default" w:ascii="Times New Roman" w:hAnsi="Times New Roman" w:eastAsia="宋体" w:cstheme="minorBidi"/>
+          <w:rFonts w:hint="eastAsia" w:ascii="Times New Roman" w:hAnsi="Times New Roman" w:eastAsia="宋体" w:cstheme="minorBidi"/>
           <w:kern w:val="2"/>
           <w:sz w:val="24"/>
           <w:szCs w:val="22"/>
           <w:lang w:val="en-US" w:eastAsia="zh-CN" w:bidi="ar-SA"/>
         </w:rPr>
-        <w:t>捐赠与物资管理模块旨在提升救助组织的透明度和公信力，同时为爱心人士提供便捷的物资捐赠和认领渠道。该模块包含四个子模块：捐赠公示模块、急需物资展示模块、物资认领模块以及后台内容排序管理机制。</w:t>
-      </w:r>
-    </w:p>
-    <w:p>
-      <w:pPr>
-        <w:pStyle w:val="4"/>
-        <w:bidi w:val="0"/>
-        <w:rPr>
-          <w:rFonts w:hint="default"/>
-          <w:lang w:val="en-US" w:eastAsia="zh-CN"/>
-        </w:rPr>
-      </w:pPr>
-      <w:bookmarkStart w:id="110" w:name="_Toc12974"/>
-      <w:bookmarkStart w:id="111" w:name="_Toc18604"/>
-      <w:r>
-        <w:rPr>
-          <w:rFonts w:hint="default"/>
-          <w:lang w:val="en-US" w:eastAsia="zh-CN"/>
-        </w:rPr>
-        <w:t>5.6.1 捐赠公示模块</w:t>
-      </w:r>
-      <w:bookmarkEnd w:id="110"/>
-      <w:bookmarkEnd w:id="111"/>
+        <w:t>评论发布接口通过 HttpSession 获取当前登录用户的 ID 自动填充，默认 status 设置为 1。评论查询接口根据帖子 ID 获取该帖子下的所有可见评论。评论的删除和状态变更操作仅限管理员执行，用于内容审核和违规评论处理。评论表通过 post_id 外键与帖子表关联，设置了 ON DELETE CASCADE 级联删除策略，当管理员删除帖子时，该帖子下的所有评论将自动被清理，避免了数据残留问题。</w:t>
+      </w:r>
+    </w:p>
+    <w:p>
+      <w:pPr>
+        <w:pStyle w:val="3"/>
+        <w:bidi w:val="0"/>
+        <w:rPr>
+          <w:rFonts w:hint="default"/>
+          <w:lang w:val="en-US" w:eastAsia="zh-Hans"/>
+        </w:rPr>
+      </w:pPr>
+      <w:bookmarkStart w:id="108" w:name="_Toc32120"/>
+      <w:bookmarkStart w:id="109" w:name="_Toc30436"/>
+      <w:r>
+        <w:rPr>
+          <w:rFonts w:hint="default"/>
+          <w:lang w:val="en-US" w:eastAsia="zh-Hans"/>
+        </w:rPr>
+        <w:t>5.5 捐赠与物资管理模块设计与实现</w:t>
+      </w:r>
+      <w:bookmarkEnd w:id="108"/>
+      <w:bookmarkEnd w:id="109"/>
     </w:p>
     <w:p>
       <w:pPr>
@@ -17341,7 +15487,7 @@
         <w:ind w:leftChars="0" w:firstLine="480" w:firstLineChars="200"/>
         <w:jc w:val="both"/>
         <w:rPr>
-          <w:rFonts w:hint="eastAsia" w:ascii="Times New Roman" w:hAnsi="Times New Roman" w:eastAsia="宋体" w:cstheme="minorBidi"/>
+          <w:rFonts w:hint="default" w:ascii="Times New Roman" w:hAnsi="Times New Roman" w:eastAsia="宋体" w:cstheme="minorBidi"/>
           <w:kern w:val="2"/>
           <w:sz w:val="24"/>
           <w:szCs w:val="22"/>
@@ -17350,13 +15496,13 @@
       </w:pPr>
       <w:r>
         <w:rPr>
-          <w:rFonts w:hint="eastAsia" w:ascii="Times New Roman" w:hAnsi="Times New Roman" w:eastAsia="宋体" w:cstheme="minorBidi"/>
+          <w:rFonts w:hint="default" w:ascii="Times New Roman" w:hAnsi="Times New Roman" w:eastAsia="宋体" w:cstheme="minorBidi"/>
           <w:kern w:val="2"/>
           <w:sz w:val="24"/>
           <w:szCs w:val="22"/>
           <w:lang w:val="en-US" w:eastAsia="zh-CN" w:bidi="ar-SA"/>
         </w:rPr>
-        <w:t>捐赠公示模块通过 donation_record 表存储每一笔捐赠的公示记录，包含展示日期（date）、捐赠人（donor，以脱敏形式展示，如张**）和捐赠物品（item）。前台通过 GET /api/donation/records 接口按 sort_order 升序排列返回所有公示记录，前端页面将后端返回的数据与本地硬编码的补充数据（donationPublicity.ts，包含 44 条历史捐赠记录）合并展示，以提供更丰富的公示内容。这种后端数据与前端补充数据相结合的设计，在保证核心数据可管理的同时，减轻了管理员批量导入历史数据的工作量。</w:t>
+        <w:t>捐赠与物资管理模块旨在提升救助组织的透明度和公信力，同时为爱心人士提供便捷的物资捐赠和认领渠道。该模块包含四个子模块：捐赠公示模块、急需物资展示模块、物资认领模块以及后台内容排序管理机制。</w:t>
       </w:r>
     </w:p>
     <w:p>
@@ -17368,17 +15514,17 @@
           <w:lang w:val="en-US" w:eastAsia="zh-CN"/>
         </w:rPr>
       </w:pPr>
-      <w:bookmarkStart w:id="112" w:name="_Toc22854"/>
-      <w:bookmarkStart w:id="113" w:name="_Toc23760"/>
-      <w:r>
-        <w:rPr>
-          <w:rFonts w:hint="default"/>
-          <w:lang w:val="en-US" w:eastAsia="zh-CN"/>
-        </w:rPr>
-        <w:t>5.6.2 急需物资与物资认领模块</w:t>
-      </w:r>
-      <w:bookmarkEnd w:id="112"/>
-      <w:bookmarkEnd w:id="113"/>
+      <w:bookmarkStart w:id="110" w:name="_Toc12974"/>
+      <w:bookmarkStart w:id="111" w:name="_Toc18604"/>
+      <w:r>
+        <w:rPr>
+          <w:rFonts w:hint="default"/>
+          <w:lang w:val="en-US" w:eastAsia="zh-CN"/>
+        </w:rPr>
+        <w:t>5.6.1 捐赠公示模块</w:t>
+      </w:r>
+      <w:bookmarkEnd w:id="110"/>
+      <w:bookmarkEnd w:id="111"/>
     </w:p>
     <w:p>
       <w:pPr>
@@ -17403,8 +15549,29 @@
           <w:szCs w:val="22"/>
           <w:lang w:val="en-US" w:eastAsia="zh-CN" w:bidi="ar-SA"/>
         </w:rPr>
-        <w:t>急需物资模块通过 urgent_need 表展示当前救助站急需的物资清单，包含物资名称（name）、需求缺口（gap）和更新时间（updated_at）。前台用户通过 GET /api/donation/urgent 接口获取急需物资列表，列表按 sort_order 升序排列。</w:t>
-      </w:r>
+        <w:t>捐赠公示模块通过 donation_record 表存储每一笔捐赠的公示记录，包含展示日期（date）、捐赠人（donor，以脱敏形式展示，如张**）和捐赠物品（item）。前台通过 GET /api/donation/records 接口按 sort_order 升序排列返回所有公示记录，前端页面将后端返回的数据与本地硬编码的补充数据（donationPublicity.ts，包含 44 条历史捐赠记录）合并展示，以提供更丰富的公示内容。这种后端数据与前端补充数据相结合的设计，在保证核心数据可管理的同时，减轻了管理员批量导入历史数据的工作量。</w:t>
+      </w:r>
+    </w:p>
+    <w:p>
+      <w:pPr>
+        <w:pStyle w:val="4"/>
+        <w:bidi w:val="0"/>
+        <w:rPr>
+          <w:rFonts w:hint="default"/>
+          <w:lang w:val="en-US" w:eastAsia="zh-CN"/>
+        </w:rPr>
+      </w:pPr>
+      <w:bookmarkStart w:id="112" w:name="_Toc22854"/>
+      <w:bookmarkStart w:id="113" w:name="_Toc23760"/>
+      <w:r>
+        <w:rPr>
+          <w:rFonts w:hint="default"/>
+          <w:lang w:val="en-US" w:eastAsia="zh-CN"/>
+        </w:rPr>
+        <w:t>5.6.2 急需物资与物资认领模块</w:t>
+      </w:r>
+      <w:bookmarkEnd w:id="112"/>
+      <w:bookmarkEnd w:id="113"/>
     </w:p>
     <w:p>
       <w:pPr>
@@ -17429,530 +15596,63 @@
           <w:szCs w:val="22"/>
           <w:lang w:val="en-US" w:eastAsia="zh-CN" w:bidi="ar-SA"/>
         </w:rPr>
-        <w:t>物资认领模块允许登录用户针对急需物资提交认领申请。认领申请数据存储在 donation_claim 表中，包含认领物资名称（need_name）、需求缺口（need_gap）、认领数量（quantity）、联系人姓名（contact_name）、联系电话（phone）、微信号（wechat）、预计领取日期（pickup_date）、备注（remark）、审核状态（status，0 待审核/1 已通过/2 已拒绝）以及审核备注（review_note）。物资认领接口详细信息见表 5-12。</w:t>
+        <w:t>急需物资模块通过 urgent_need 表展示当前救助站急需的物资清单，包含物资名称（name）、需求缺口（gap）和更新时间（updated_at）。前台用户通过 GET /api/donation/urgent 接口获取急需物资列表，列表按 sort_order 升序排列。</w:t>
+      </w:r>
+    </w:p>
+    <w:p>
+      <w:pPr>
+        <w:spacing w:before="60"/>
+      </w:pPr>
+      <w:r>
+        <w:rPr>
+          <w:rFonts w:hint="eastAsia" w:ascii="Times New Roman" w:hAnsi="Times New Roman" w:eastAsia="宋体" w:cstheme="minorBidi"/>
+          <w:kern w:val="2"/>
+          <w:sz w:val="24"/>
+          <w:szCs w:val="22"/>
+          <w:lang w:val="en-US" w:eastAsia="zh-CN" w:bidi="ar-SA"/>
+        </w:rPr>
+        <w:t>物资认领模块允许登录用户针对急需物资提交认领申请。认领申请数据存储在 donation_claim 表中，包含认领物资名称（need_name）、需求缺口（need_gap）、认领数量（quantity）、联系人姓名（contact_name）、联系电话（phone）、微信号（wechat）、预计领取日期（pickup_date）、备注（remark）、审核状态（status，0 待审核/1 已通过/2 已拒绝）以及审核备注（review_note）。</w:t>
       </w:r>
     </w:p>
     <w:p>
       <w:pPr>
         <w:widowControl w:val="0"/>
+        <w:bidi w:val="0"/>
         <w:spacing w:line="300" w:lineRule="auto"/>
-        <w:ind w:firstLine="422" w:firstLineChars="200"/>
-        <w:jc w:val="center"/>
-        <w:rPr>
-          <w:rFonts w:hint="default" w:ascii="Times New Roman" w:hAnsi="Times New Roman" w:eastAsia="宋体" w:cs="Times New Roman"/>
-          <w:b/>
-          <w:bCs/>
-          <w:kern w:val="2"/>
-          <w:sz w:val="21"/>
-          <w:szCs w:val="21"/>
-          <w:lang w:val="en-US" w:eastAsia="zh-CN" w:bidi="ar-SA"/>
-        </w:rPr>
-      </w:pPr>
-    </w:p>
-    <w:p>
-      <w:pPr>
-        <w:widowControl w:val="0"/>
-        <w:spacing w:line="300" w:lineRule="auto"/>
-        <w:ind w:firstLine="422" w:firstLineChars="200"/>
-        <w:jc w:val="center"/>
-        <w:rPr>
-          <w:rFonts w:hint="default" w:ascii="Times New Roman" w:hAnsi="Times New Roman" w:eastAsia="宋体" w:cs="Times New Roman"/>
-          <w:b/>
-          <w:bCs/>
-          <w:kern w:val="2"/>
-          <w:sz w:val="21"/>
-          <w:szCs w:val="21"/>
-          <w:lang w:val="en-US" w:eastAsia="zh-CN" w:bidi="ar-SA"/>
-        </w:rPr>
-      </w:pPr>
-      <w:r>
-        <w:rPr>
-          <w:rFonts w:hint="default" w:ascii="Times New Roman" w:hAnsi="Times New Roman" w:eastAsia="宋体" w:cs="Times New Roman"/>
-          <w:b/>
-          <w:bCs/>
-          <w:kern w:val="2"/>
-          <w:sz w:val="21"/>
-          <w:szCs w:val="21"/>
-          <w:lang w:val="en-US" w:eastAsia="zh-CN" w:bidi="ar-SA"/>
-        </w:rPr>
-        <w:t>表 5-12 物资认领管理接口</w:t>
-      </w:r>
-    </w:p>
-    <w:p>
-      <w:pPr>
-        <w:widowControl w:val="0"/>
-        <w:spacing w:line="300" w:lineRule="auto"/>
-        <w:ind w:firstLine="422" w:firstLineChars="200"/>
-        <w:jc w:val="center"/>
-        <w:rPr>
-          <w:rFonts w:hint="default" w:ascii="Times New Roman" w:hAnsi="Times New Roman" w:eastAsia="宋体" w:cs="Times New Roman"/>
-          <w:b/>
-          <w:bCs/>
-          <w:kern w:val="2"/>
-          <w:sz w:val="21"/>
-          <w:szCs w:val="21"/>
-          <w:lang w:val="en-US" w:eastAsia="zh-CN" w:bidi="ar-SA"/>
-        </w:rPr>
-      </w:pPr>
-      <w:r>
-        <w:rPr>
-          <w:rFonts w:hint="default" w:ascii="Times New Roman" w:hAnsi="Times New Roman" w:eastAsia="宋体" w:cs="Times New Roman"/>
-          <w:b/>
-          <w:bCs/>
-          <w:kern w:val="2"/>
-          <w:sz w:val="21"/>
-          <w:szCs w:val="21"/>
-          <w:lang w:val="en-US" w:eastAsia="zh-CN" w:bidi="ar-SA"/>
-        </w:rPr>
-        <w:t>Table 5-12 Material Claim Management Interface</w:t>
-      </w:r>
-    </w:p>
-    <w:tbl>
-      <w:tblPr>
-        <w:tblStyle w:val="19"/>
-        <w:tblW w:w="8660" w:type="dxa"/>
-        <w:jc w:val="center"/>
-        <w:tblBorders>
-          <w:top w:val="none" w:color="auto" w:sz="0" w:space="0"/>
-          <w:left w:val="none" w:color="auto" w:sz="0" w:space="0"/>
-          <w:bottom w:val="none" w:color="auto" w:sz="0" w:space="0"/>
-          <w:right w:val="none" w:color="auto" w:sz="0" w:space="0"/>
-          <w:insideH w:val="none" w:color="auto" w:sz="0" w:space="0"/>
-          <w:insideV w:val="none" w:color="auto" w:sz="0" w:space="0"/>
-        </w:tblBorders>
-        <w:tblLayout w:type="autofit"/>
-        <w:tblCellMar>
-          <w:top w:w="0" w:type="dxa"/>
-          <w:left w:w="10" w:type="dxa"/>
-          <w:bottom w:w="0" w:type="dxa"/>
-          <w:right w:w="10" w:type="dxa"/>
-        </w:tblCellMar>
-      </w:tblPr>
-      <w:tblGrid>
-        <w:gridCol w:w="1948"/>
-        <w:gridCol w:w="6712"/>
-      </w:tblGrid>
-      <w:tr>
-        <w:tblPrEx>
-          <w:tblBorders>
-            <w:top w:val="none" w:color="auto" w:sz="0" w:space="0"/>
-            <w:left w:val="none" w:color="auto" w:sz="0" w:space="0"/>
-            <w:bottom w:val="none" w:color="auto" w:sz="0" w:space="0"/>
-            <w:right w:val="none" w:color="auto" w:sz="0" w:space="0"/>
-            <w:insideH w:val="none" w:color="auto" w:sz="0" w:space="0"/>
-            <w:insideV w:val="none" w:color="auto" w:sz="0" w:space="0"/>
-          </w:tblBorders>
-          <w:tblCellMar>
-            <w:top w:w="0" w:type="dxa"/>
-            <w:left w:w="10" w:type="dxa"/>
-            <w:bottom w:w="0" w:type="dxa"/>
-            <w:right w:w="10" w:type="dxa"/>
-          </w:tblCellMar>
-        </w:tblPrEx>
-        <w:trPr>
-          <w:trHeight w:val="0" w:hRule="atLeast"/>
-          <w:tblHeader/>
-          <w:jc w:val="center"/>
-        </w:trPr>
-        <w:tc>
-          <w:tcPr>
-            <w:tcW w:w="1948" w:type="dxa"/>
-            <w:tcBorders>
-              <w:top w:val="single" w:color="auto" w:sz="12" w:space="0"/>
-              <w:left w:val="nil"/>
-              <w:bottom w:val="nil"/>
-              <w:right w:val="nil"/>
-            </w:tcBorders>
-            <w:shd w:val="clear" w:color="auto" w:fill="auto"/>
-            <w:noWrap w:val="0"/>
-            <w:tcMar>
-              <w:top w:w="-1" w:type="dxa"/>
-              <w:left w:w="-1" w:type="dxa"/>
-              <w:bottom w:w="-1" w:type="dxa"/>
-              <w:right w:w="-1" w:type="dxa"/>
-            </w:tcMar>
-            <w:vAlign w:val="center"/>
-          </w:tcPr>
-          <w:p>
-            <w:pPr>
-              <w:pStyle w:val="28"/>
-              <w:bidi w:val="0"/>
-            </w:pPr>
-            <w:r>
-              <w:t>接口名称</w:t>
-            </w:r>
-          </w:p>
-        </w:tc>
-        <w:tc>
-          <w:tcPr>
-            <w:tcW w:w="6712" w:type="dxa"/>
-            <w:tcBorders>
-              <w:top w:val="single" w:color="auto" w:sz="12" w:space="0"/>
-              <w:left w:val="nil"/>
-              <w:bottom w:val="nil"/>
-              <w:right w:val="nil"/>
-            </w:tcBorders>
-            <w:shd w:val="clear" w:color="auto" w:fill="auto"/>
-            <w:noWrap w:val="0"/>
-            <w:tcMar>
-              <w:top w:w="-1" w:type="dxa"/>
-              <w:left w:w="-1" w:type="dxa"/>
-              <w:bottom w:w="-1" w:type="dxa"/>
-              <w:right w:w="-1" w:type="dxa"/>
-            </w:tcMar>
-            <w:vAlign w:val="center"/>
-          </w:tcPr>
-          <w:p>
-            <w:pPr>
-              <w:pStyle w:val="28"/>
-              <w:bidi w:val="0"/>
-            </w:pPr>
-            <w:r>
-              <w:t>物资认领提交与审核</w:t>
-            </w:r>
-          </w:p>
-        </w:tc>
-      </w:tr>
-      <w:tr>
-        <w:tblPrEx>
-          <w:tblBorders>
-            <w:top w:val="none" w:color="auto" w:sz="0" w:space="0"/>
-            <w:left w:val="none" w:color="auto" w:sz="0" w:space="0"/>
-            <w:bottom w:val="none" w:color="auto" w:sz="0" w:space="0"/>
-            <w:right w:val="none" w:color="auto" w:sz="0" w:space="0"/>
-            <w:insideH w:val="none" w:color="auto" w:sz="0" w:space="0"/>
-            <w:insideV w:val="none" w:color="auto" w:sz="0" w:space="0"/>
-          </w:tblBorders>
-          <w:tblCellMar>
-            <w:top w:w="0" w:type="dxa"/>
-            <w:left w:w="10" w:type="dxa"/>
-            <w:bottom w:w="0" w:type="dxa"/>
-            <w:right w:w="10" w:type="dxa"/>
-          </w:tblCellMar>
-        </w:tblPrEx>
-        <w:trPr>
-          <w:trHeight w:val="0" w:hRule="atLeast"/>
-          <w:tblHeader/>
-          <w:jc w:val="center"/>
-        </w:trPr>
-        <w:tc>
-          <w:tcPr>
-            <w:tcW w:w="1948" w:type="dxa"/>
-            <w:tcBorders>
-              <w:top w:val="single" w:color="auto" w:sz="4" w:space="0"/>
-              <w:left w:val="nil"/>
-              <w:bottom w:val="nil"/>
-              <w:right w:val="nil"/>
-            </w:tcBorders>
-            <w:shd w:val="clear" w:color="auto" w:fill="auto"/>
-            <w:noWrap w:val="0"/>
-            <w:tcMar>
-              <w:top w:w="-1" w:type="dxa"/>
-              <w:left w:w="-1" w:type="dxa"/>
-              <w:bottom w:w="-1" w:type="dxa"/>
-              <w:right w:w="-1" w:type="dxa"/>
-            </w:tcMar>
-            <w:vAlign w:val="center"/>
-          </w:tcPr>
-          <w:p>
-            <w:pPr>
-              <w:pStyle w:val="28"/>
-              <w:bidi w:val="0"/>
-            </w:pPr>
-            <w:r>
-              <w:t>接口 URL</w:t>
-            </w:r>
-          </w:p>
-        </w:tc>
-        <w:tc>
-          <w:tcPr>
-            <w:tcW w:w="6712" w:type="dxa"/>
-            <w:tcBorders>
-              <w:top w:val="single" w:color="auto" w:sz="4" w:space="0"/>
-              <w:left w:val="nil"/>
-              <w:bottom w:val="nil"/>
-              <w:right w:val="nil"/>
-            </w:tcBorders>
-            <w:shd w:val="clear" w:color="auto" w:fill="auto"/>
-            <w:noWrap w:val="0"/>
-            <w:tcMar>
-              <w:top w:w="-1" w:type="dxa"/>
-              <w:left w:w="-1" w:type="dxa"/>
-              <w:bottom w:w="-1" w:type="dxa"/>
-              <w:right w:w="-1" w:type="dxa"/>
-            </w:tcMar>
-            <w:vAlign w:val="center"/>
-          </w:tcPr>
-          <w:p>
-            <w:pPr>
-              <w:pStyle w:val="27"/>
-              <w:bidi w:val="0"/>
-            </w:pPr>
-            <w:r>
-              <w:t>/api/donation/claims（POST 提交）
-/api/admin/donation-claims（GET 管理员查询）
-/api/admin/donation-claims/{id}/status（PUT 审核）
-/api/admin/donation-claims/{id}（DELETE 删除）</w:t>
-            </w:r>
-          </w:p>
-        </w:tc>
-      </w:tr>
-      <w:tr>
-        <w:tblPrEx>
-          <w:tblBorders>
-            <w:top w:val="none" w:color="auto" w:sz="0" w:space="0"/>
-            <w:left w:val="none" w:color="auto" w:sz="0" w:space="0"/>
-            <w:bottom w:val="none" w:color="auto" w:sz="0" w:space="0"/>
-            <w:right w:val="none" w:color="auto" w:sz="0" w:space="0"/>
-            <w:insideH w:val="none" w:color="auto" w:sz="0" w:space="0"/>
-            <w:insideV w:val="none" w:color="auto" w:sz="0" w:space="0"/>
-          </w:tblBorders>
-          <w:tblCellMar>
-            <w:top w:w="0" w:type="dxa"/>
-            <w:left w:w="10" w:type="dxa"/>
-            <w:bottom w:w="0" w:type="dxa"/>
-            <w:right w:w="10" w:type="dxa"/>
-          </w:tblCellMar>
-        </w:tblPrEx>
-        <w:trPr>
-          <w:trHeight w:val="0" w:hRule="atLeast"/>
-          <w:tblHeader/>
-          <w:jc w:val="center"/>
-        </w:trPr>
-        <w:tc>
-          <w:tcPr>
-            <w:tcW w:w="1948" w:type="dxa"/>
-            <w:tcBorders>
-              <w:top w:val="nil"/>
-              <w:left w:val="nil"/>
-              <w:bottom w:val="nil"/>
-              <w:right w:val="nil"/>
-            </w:tcBorders>
-            <w:shd w:val="clear" w:color="auto" w:fill="auto"/>
-            <w:noWrap w:val="0"/>
-            <w:tcMar>
-              <w:top w:w="-1" w:type="dxa"/>
-              <w:left w:w="-1" w:type="dxa"/>
-              <w:bottom w:w="-1" w:type="dxa"/>
-              <w:right w:w="-1" w:type="dxa"/>
-            </w:tcMar>
-            <w:vAlign w:val="center"/>
-          </w:tcPr>
-          <w:p>
-            <w:pPr>
-              <w:pStyle w:val="28"/>
-              <w:bidi w:val="0"/>
-            </w:pPr>
-            <w:r>
-              <w:t>请求方式</w:t>
-            </w:r>
-          </w:p>
-        </w:tc>
-        <w:tc>
-          <w:tcPr>
-            <w:tcW w:w="6712" w:type="dxa"/>
-            <w:tcBorders>
-              <w:top w:val="nil"/>
-              <w:left w:val="nil"/>
-              <w:bottom w:val="nil"/>
-              <w:right w:val="nil"/>
-            </w:tcBorders>
-            <w:shd w:val="clear" w:color="auto" w:fill="auto"/>
-            <w:noWrap w:val="0"/>
-            <w:tcMar>
-              <w:top w:w="-1" w:type="dxa"/>
-              <w:left w:w="-1" w:type="dxa"/>
-              <w:bottom w:w="-1" w:type="dxa"/>
-              <w:right w:w="-1" w:type="dxa"/>
-            </w:tcMar>
-            <w:vAlign w:val="center"/>
-          </w:tcPr>
-          <w:p>
-            <w:pPr>
-              <w:pStyle w:val="27"/>
-              <w:bidi w:val="0"/>
-            </w:pPr>
-            <w:r>
-              <w:t>POST / GET / PUT / DELETE</w:t>
-            </w:r>
-          </w:p>
-        </w:tc>
-      </w:tr>
-      <w:tr>
-        <w:tblPrEx>
-          <w:tblBorders>
-            <w:top w:val="none" w:color="auto" w:sz="0" w:space="0"/>
-            <w:left w:val="none" w:color="auto" w:sz="0" w:space="0"/>
-            <w:bottom w:val="none" w:color="auto" w:sz="0" w:space="0"/>
-            <w:right w:val="none" w:color="auto" w:sz="0" w:space="0"/>
-            <w:insideH w:val="none" w:color="auto" w:sz="0" w:space="0"/>
-            <w:insideV w:val="none" w:color="auto" w:sz="0" w:space="0"/>
-          </w:tblBorders>
-          <w:tblCellMar>
-            <w:top w:w="0" w:type="dxa"/>
-            <w:left w:w="10" w:type="dxa"/>
-            <w:bottom w:w="0" w:type="dxa"/>
-            <w:right w:w="10" w:type="dxa"/>
-          </w:tblCellMar>
-        </w:tblPrEx>
-        <w:trPr>
-          <w:trHeight w:val="0" w:hRule="atLeast"/>
-          <w:tblHeader/>
-          <w:jc w:val="center"/>
-        </w:trPr>
-        <w:tc>
-          <w:tcPr>
-            <w:tcW w:w="1948" w:type="dxa"/>
-            <w:tcBorders>
-              <w:top w:val="nil"/>
-              <w:left w:val="nil"/>
-              <w:bottom w:val="nil"/>
-              <w:right w:val="nil"/>
-            </w:tcBorders>
-            <w:shd w:val="clear" w:color="auto" w:fill="auto"/>
-            <w:noWrap w:val="0"/>
-            <w:tcMar>
-              <w:top w:w="-1" w:type="dxa"/>
-              <w:left w:w="-1" w:type="dxa"/>
-              <w:bottom w:w="-1" w:type="dxa"/>
-              <w:right w:w="-1" w:type="dxa"/>
-            </w:tcMar>
-            <w:vAlign w:val="center"/>
-          </w:tcPr>
-          <w:p>
-            <w:pPr>
-              <w:pStyle w:val="28"/>
-              <w:bidi w:val="0"/>
-            </w:pPr>
-            <w:r>
-              <w:t>请求参数及主要字段（提交）</w:t>
-            </w:r>
-          </w:p>
-        </w:tc>
-        <w:tc>
-          <w:tcPr>
-            <w:tcW w:w="6712" w:type="dxa"/>
-            <w:tcBorders>
-              <w:top w:val="nil"/>
-              <w:left w:val="nil"/>
-              <w:bottom w:val="nil"/>
-              <w:right w:val="nil"/>
-            </w:tcBorders>
-            <w:shd w:val="clear" w:color="auto" w:fill="auto"/>
-            <w:noWrap w:val="0"/>
-            <w:tcMar>
-              <w:top w:w="-1" w:type="dxa"/>
-              <w:left w:w="-1" w:type="dxa"/>
-              <w:bottom w:w="-1" w:type="dxa"/>
-              <w:right w:w="-1" w:type="dxa"/>
-            </w:tcMar>
-            <w:vAlign w:val="center"/>
-          </w:tcPr>
-          <w:p>
-            <w:pPr>
-              <w:pStyle w:val="27"/>
-              <w:bidi w:val="0"/>
-            </w:pPr>
-            <w:r>
-              <w:t>needName（物资名称），String 类型
-needGap（需求缺口），String 类型
-quantity（认领数量），String 类型
-contactName（联系人），String 类型
-phone（电话），String 类型
-wechat（微信），String 类型
-pickupDate（领取日期），String 类型
-remark（备注），String 类型</w:t>
-            </w:r>
-          </w:p>
-        </w:tc>
-      </w:tr>
-      <w:tr>
-        <w:tblPrEx>
-          <w:tblBorders>
-            <w:top w:val="none" w:color="auto" w:sz="0" w:space="0"/>
-            <w:left w:val="none" w:color="auto" w:sz="0" w:space="0"/>
-            <w:bottom w:val="none" w:color="auto" w:sz="0" w:space="0"/>
-            <w:right w:val="none" w:color="auto" w:sz="0" w:space="0"/>
-            <w:insideH w:val="none" w:color="auto" w:sz="0" w:space="0"/>
-            <w:insideV w:val="none" w:color="auto" w:sz="0" w:space="0"/>
-          </w:tblBorders>
-          <w:tblCellMar>
-            <w:top w:w="0" w:type="dxa"/>
-            <w:left w:w="10" w:type="dxa"/>
-            <w:bottom w:w="0" w:type="dxa"/>
-            <w:right w:w="10" w:type="dxa"/>
-          </w:tblCellMar>
-        </w:tblPrEx>
-        <w:trPr>
-          <w:trHeight w:val="0" w:hRule="atLeast"/>
-          <w:tblHeader/>
-          <w:jc w:val="center"/>
-        </w:trPr>
-        <w:tc>
-          <w:tcPr>
-            <w:tcW w:w="1948" w:type="dxa"/>
-            <w:tcBorders>
-              <w:top w:val="nil"/>
-              <w:left w:val="nil"/>
-              <w:bottom w:val="single" w:color="auto" w:sz="12" w:space="0"/>
-              <w:right w:val="nil"/>
-            </w:tcBorders>
-            <w:shd w:val="clear" w:color="auto" w:fill="auto"/>
-            <w:noWrap w:val="0"/>
-            <w:tcMar>
-              <w:top w:w="-1" w:type="dxa"/>
-              <w:left w:w="-1" w:type="dxa"/>
-              <w:bottom w:w="-1" w:type="dxa"/>
-              <w:right w:w="-1" w:type="dxa"/>
-            </w:tcMar>
-            <w:vAlign w:val="center"/>
-          </w:tcPr>
-          <w:p>
-            <w:pPr>
-              <w:pStyle w:val="28"/>
-              <w:bidi w:val="0"/>
-            </w:pPr>
-            <w:r>
-              <w:t>返回参数及主要字段</w:t>
-            </w:r>
-          </w:p>
-        </w:tc>
-        <w:tc>
-          <w:tcPr>
-            <w:tcW w:w="6712" w:type="dxa"/>
-            <w:tcBorders>
-              <w:top w:val="nil"/>
-              <w:left w:val="nil"/>
-              <w:bottom w:val="single" w:color="auto" w:sz="12" w:space="0"/>
-              <w:right w:val="nil"/>
-            </w:tcBorders>
-            <w:shd w:val="clear" w:color="auto" w:fill="auto"/>
-            <w:noWrap w:val="0"/>
-            <w:tcMar>
-              <w:top w:w="-1" w:type="dxa"/>
-              <w:left w:w="-1" w:type="dxa"/>
-              <w:bottom w:w="-1" w:type="dxa"/>
-              <w:right w:w="-1" w:type="dxa"/>
-            </w:tcMar>
-            <w:vAlign w:val="center"/>
-          </w:tcPr>
-          <w:p>
-            <w:pPr>
-              <w:pStyle w:val="27"/>
-              <w:bidi w:val="0"/>
-            </w:pPr>
-            <w:r>
-              <w:t>code（响应代码），整数类型
-msg（返回信息），String 类型</w:t>
-            </w:r>
-          </w:p>
-        </w:tc>
-      </w:tr>
-    </w:tbl>
-    <w:p>
-      <w:pPr>
-        <w:spacing w:before="60"/>
-      </w:pPr>
+        <w:ind w:left="0" w:leftChars="0" w:firstLine="0" w:firstLineChars="0"/>
+        <w:jc w:val="both"/>
+        <w:rPr>
+          <w:rFonts w:hint="eastAsia"/>
+          <w:lang w:val="en-US" w:eastAsia="zh-CN"/>
+        </w:rPr>
+      </w:pPr>
+      <w:r>
+        <w:rPr>
+          <w:rFonts w:hint="eastAsia" w:ascii="Times New Roman" w:hAnsi="Times New Roman" w:eastAsia="宋体" w:cstheme="minorBidi"/>
+          <w:kern w:val="2"/>
+          <w:sz w:val="24"/>
+          <w:szCs w:val="22"/>
+          <w:lang w:val="en-US" w:eastAsia="zh-CN" w:bidi="ar-SA"/>
+        </w:rPr>
+        <w:t>物资认领提交接口将申请状态默认设置为 0（待审核）。管理员后台通过分页查询接口查看所有认领申请，支持按状态和关键词（匹配物资名称、联系人、电话）进行筛选。审核接口的处理逻辑与领养审批模块类似，管理员可批准或拒绝认领申请并填写审核备注。</w:t>
+      </w:r>
+      <w:r>
+        <w:rPr>
+          <w:rFonts w:hint="eastAsia" w:cstheme="minorBidi"/>
+          <w:kern w:val="2"/>
+          <w:sz w:val="24"/>
+          <w:szCs w:val="22"/>
+          <w:lang w:val="en-US" w:eastAsia="zh-CN" w:bidi="ar-SA"/>
+        </w:rPr>
+        <w:t>前台捐赠页面如图5-7所示。</w:t>
+      </w:r>
+      <w:r>
+        <w:rPr>
+          <w:rFonts w:hint="eastAsia"/>
+          <w:lang w:val="en-US" w:eastAsia="zh-CN"/>
+        </w:rPr>
+        <w:t>后台物资认领审核页面如图5-8所示。</w:t>
+      </w:r>
     </w:p>
     <w:p>
       <w:pPr>
@@ -17962,23 +15662,136 @@
         <w:ind w:leftChars="0" w:firstLine="480" w:firstLineChars="200"/>
         <w:jc w:val="both"/>
         <w:rPr>
-          <w:rFonts w:hint="eastAsia" w:ascii="Times New Roman" w:hAnsi="Times New Roman" w:eastAsia="宋体" w:cstheme="minorBidi"/>
+          <w:rFonts w:hint="eastAsia" w:cstheme="minorBidi"/>
           <w:kern w:val="2"/>
           <w:sz w:val="24"/>
           <w:szCs w:val="22"/>
           <w:lang w:val="en-US" w:eastAsia="zh-CN" w:bidi="ar-SA"/>
         </w:rPr>
       </w:pPr>
-      <w:r>
-        <w:rPr>
-          <w:rFonts w:hint="eastAsia" w:ascii="Times New Roman" w:hAnsi="Times New Roman" w:eastAsia="宋体" w:cstheme="minorBidi"/>
-          <w:kern w:val="2"/>
-          <w:sz w:val="24"/>
-          <w:szCs w:val="22"/>
-          <w:lang w:val="en-US" w:eastAsia="zh-CN" w:bidi="ar-SA"/>
-        </w:rPr>
-        <w:t>物资认领提交接口将申请状态默认设置为 0（待审核）。管理员后台通过分页查询接口查看所有认领申请，支持按状态和关键词（匹配物资名称、联系人、电话）进行筛选。审核接口的处理逻辑与领养审批模块类似，管理员可批准或拒绝认领申请并填写审核备注。</w:t>
-      </w:r>
+    </w:p>
+    <w:p>
+      <w:pPr>
+        <w:widowControl w:val="0"/>
+        <w:bidi w:val="0"/>
+        <w:spacing w:line="300" w:lineRule="auto"/>
+        <w:ind w:left="0" w:leftChars="0" w:firstLine="0" w:firstLineChars="0"/>
+        <w:jc w:val="both"/>
+      </w:pPr>
+      <w:r>
+        <w:drawing>
+          <wp:inline distT="0" distB="0" distL="114300" distR="114300">
+            <wp:extent cx="5469255" cy="2707005"/>
+            <wp:effectExtent l="0" t="0" r="17145" b="17145"/>
+            <wp:docPr id="12" name="图片 4"/>
+            <wp:cNvGraphicFramePr>
+              <a:graphicFrameLocks xmlns:a="http://schemas.openxmlformats.org/drawingml/2006/main" noChangeAspect="1"/>
+            </wp:cNvGraphicFramePr>
+            <a:graphic xmlns:a="http://schemas.openxmlformats.org/drawingml/2006/main">
+              <a:graphicData uri="http://schemas.openxmlformats.org/drawingml/2006/picture">
+                <pic:pic xmlns:pic="http://schemas.openxmlformats.org/drawingml/2006/picture">
+                  <pic:nvPicPr>
+                    <pic:cNvPr id="12" name="图片 4"/>
+                    <pic:cNvPicPr>
+                      <a:picLocks noChangeAspect="1"/>
+                    </pic:cNvPicPr>
+                  </pic:nvPicPr>
+                  <pic:blipFill>
+                    <a:blip r:embed="rId17"/>
+                    <a:stretch>
+                      <a:fillRect/>
+                    </a:stretch>
+                  </pic:blipFill>
+                  <pic:spPr>
+                    <a:xfrm>
+                      <a:off x="0" y="0"/>
+                      <a:ext cx="5469255" cy="2707005"/>
+                    </a:xfrm>
+                    <a:prstGeom prst="rect">
+                      <a:avLst/>
+                    </a:prstGeom>
+                    <a:noFill/>
+                    <a:ln>
+                      <a:noFill/>
+                    </a:ln>
+                  </pic:spPr>
+                </pic:pic>
+              </a:graphicData>
+            </a:graphic>
+          </wp:inline>
+        </w:drawing>
+      </w:r>
+    </w:p>
+    <w:p>
+      <w:pPr>
+        <w:widowControl w:val="0"/>
+        <w:bidi w:val="0"/>
+        <w:spacing w:line="300" w:lineRule="auto"/>
+        <w:ind w:left="0" w:leftChars="0" w:firstLine="0" w:firstLineChars="0"/>
+        <w:jc w:val="both"/>
+        <w:rPr>
+          <w:rFonts w:hint="default"/>
+          <w:lang w:val="en-US" w:eastAsia="zh-CN"/>
+        </w:rPr>
+      </w:pPr>
+      <w:r>
+        <w:drawing>
+          <wp:inline distT="0" distB="0" distL="114300" distR="114300">
+            <wp:extent cx="5484495" cy="2713355"/>
+            <wp:effectExtent l="0" t="0" r="1905" b="10795"/>
+            <wp:docPr id="13" name="图片 5"/>
+            <wp:cNvGraphicFramePr>
+              <a:graphicFrameLocks xmlns:a="http://schemas.openxmlformats.org/drawingml/2006/main" noChangeAspect="1"/>
+            </wp:cNvGraphicFramePr>
+            <a:graphic xmlns:a="http://schemas.openxmlformats.org/drawingml/2006/main">
+              <a:graphicData uri="http://schemas.openxmlformats.org/drawingml/2006/picture">
+                <pic:pic xmlns:pic="http://schemas.openxmlformats.org/drawingml/2006/picture">
+                  <pic:nvPicPr>
+                    <pic:cNvPr id="13" name="图片 5"/>
+                    <pic:cNvPicPr>
+                      <a:picLocks noChangeAspect="1"/>
+                    </pic:cNvPicPr>
+                  </pic:nvPicPr>
+                  <pic:blipFill>
+                    <a:blip r:embed="rId18"/>
+                    <a:stretch>
+                      <a:fillRect/>
+                    </a:stretch>
+                  </pic:blipFill>
+                  <pic:spPr>
+                    <a:xfrm>
+                      <a:off x="0" y="0"/>
+                      <a:ext cx="5484495" cy="2713355"/>
+                    </a:xfrm>
+                    <a:prstGeom prst="rect">
+                      <a:avLst/>
+                    </a:prstGeom>
+                    <a:noFill/>
+                    <a:ln>
+                      <a:noFill/>
+                    </a:ln>
+                  </pic:spPr>
+                </pic:pic>
+              </a:graphicData>
+            </a:graphic>
+          </wp:inline>
+        </w:drawing>
+      </w:r>
+      <w:bookmarkStart w:id="168" w:name="_GoBack"/>
+      <w:bookmarkEnd w:id="168"/>
+    </w:p>
+    <w:p>
+      <w:pPr>
+        <w:widowControl w:val="0"/>
+        <w:bidi w:val="0"/>
+        <w:spacing w:line="300" w:lineRule="auto"/>
+        <w:ind w:left="0" w:leftChars="0" w:firstLine="0" w:firstLineChars="0"/>
+        <w:jc w:val="both"/>
+        <w:rPr>
+          <w:rFonts w:hint="default"/>
+          <w:lang w:val="en-US" w:eastAsia="zh-CN"/>
+        </w:rPr>
+      </w:pPr>
     </w:p>
     <w:p>
       <w:pPr>
@@ -18097,11 +15910,9 @@
     </w:p>
     <w:p>
       <w:pPr>
-        <w:widowControl w:val="0"/>
-        <w:bidi w:val="0"/>
-        <w:spacing w:line="300" w:lineRule="auto"/>
-        <w:ind w:leftChars="0" w:firstLine="480" w:firstLineChars="200"/>
-        <w:jc w:val="both"/>
+        <w:spacing w:before="60"/>
+      </w:pPr>
+      <w:r>
         <w:rPr>
           <w:rFonts w:hint="eastAsia" w:ascii="Times New Roman" w:hAnsi="Times New Roman" w:eastAsia="宋体" w:cstheme="minorBidi"/>
           <w:kern w:val="2"/>
@@ -18109,532 +15920,8 @@
           <w:szCs w:val="22"/>
           <w:lang w:val="en-US" w:eastAsia="zh-CN" w:bidi="ar-SA"/>
         </w:rPr>
-      </w:pPr>
-      <w:r>
-        <w:rPr>
-          <w:rFonts w:hint="eastAsia" w:ascii="Times New Roman" w:hAnsi="Times New Roman" w:eastAsia="宋体" w:cstheme="minorBidi"/>
-          <w:kern w:val="2"/>
-          <w:sz w:val="24"/>
-          <w:szCs w:val="22"/>
-          <w:lang w:val="en-US" w:eastAsia="zh-CN" w:bidi="ar-SA"/>
-        </w:rPr>
-        <w:t>资讯管理模块负责网站新闻和活动资讯的发布与管理。资讯数据存储在 news 表中，包含标题（title）、摘要（summary）、正文内容（content，支持 HTML 富文本格式）、封面图片（cover_image）和发布时间（publish_time）。前台用户通过 GET /api/news 接口按发布时间倒序获取资讯列表。管理员通过后台 POST、PUT、DELETE 接口进行资讯的创建、编辑和删除操作。资讯管理接口详细信息见表 5-13。</w:t>
-      </w:r>
-    </w:p>
-    <w:p>
-      <w:pPr>
-        <w:keepNext/>
-        <w:widowControl w:val="0"/>
-        <w:spacing w:line="300" w:lineRule="auto"/>
-        <w:ind w:firstLine="422" w:firstLineChars="200"/>
-        <w:jc w:val="center"/>
-        <w:rPr>
-          <w:rFonts w:hint="default" w:ascii="Times New Roman" w:hAnsi="Times New Roman" w:eastAsia="宋体" w:cs="Times New Roman"/>
-          <w:b/>
-          <w:bCs/>
-          <w:kern w:val="2"/>
-          <w:sz w:val="21"/>
-          <w:szCs w:val="21"/>
-          <w:lang w:val="en-US" w:eastAsia="zh-CN" w:bidi="ar-SA"/>
-        </w:rPr>
-      </w:pPr>
-    </w:p>
-    <w:p>
-      <w:pPr>
-        <w:keepNext/>
-        <w:widowControl w:val="0"/>
-        <w:spacing w:line="300" w:lineRule="auto"/>
-        <w:ind w:firstLine="422" w:firstLineChars="200"/>
-        <w:jc w:val="center"/>
-        <w:rPr>
-          <w:rFonts w:hint="default" w:ascii="Times New Roman" w:hAnsi="Times New Roman" w:eastAsia="宋体" w:cs="Times New Roman"/>
-          <w:b/>
-          <w:bCs/>
-          <w:kern w:val="2"/>
-          <w:sz w:val="21"/>
-          <w:szCs w:val="21"/>
-          <w:lang w:val="en-US" w:eastAsia="zh-CN" w:bidi="ar-SA"/>
-        </w:rPr>
-      </w:pPr>
-      <w:r>
-        <w:rPr>
-          <w:rFonts w:hint="default" w:ascii="Times New Roman" w:hAnsi="Times New Roman" w:eastAsia="宋体" w:cs="Times New Roman"/>
-          <w:b/>
-          <w:bCs/>
-          <w:kern w:val="2"/>
-          <w:sz w:val="21"/>
-          <w:szCs w:val="21"/>
-          <w:lang w:val="en-US" w:eastAsia="zh-CN" w:bidi="ar-SA"/>
-        </w:rPr>
-        <w:t>表 5-13 资讯管理接口</w:t>
-      </w:r>
-    </w:p>
-    <w:p>
-      <w:pPr>
-        <w:keepNext/>
-        <w:widowControl w:val="0"/>
-        <w:spacing w:line="300" w:lineRule="auto"/>
-        <w:ind w:firstLine="422" w:firstLineChars="200"/>
-        <w:jc w:val="center"/>
-        <w:rPr>
-          <w:rFonts w:hint="default" w:ascii="Times New Roman" w:hAnsi="Times New Roman" w:eastAsia="宋体" w:cs="Times New Roman"/>
-          <w:b/>
-          <w:bCs/>
-          <w:kern w:val="2"/>
-          <w:sz w:val="21"/>
-          <w:szCs w:val="21"/>
-          <w:lang w:val="en-US" w:eastAsia="zh-CN" w:bidi="ar-SA"/>
-        </w:rPr>
-      </w:pPr>
-      <w:r>
-        <w:rPr>
-          <w:rFonts w:hint="default" w:ascii="Times New Roman" w:hAnsi="Times New Roman" w:eastAsia="宋体" w:cs="Times New Roman"/>
-          <w:b/>
-          <w:bCs/>
-          <w:kern w:val="2"/>
-          <w:sz w:val="21"/>
-          <w:szCs w:val="21"/>
-          <w:lang w:val="en-US" w:eastAsia="zh-CN" w:bidi="ar-SA"/>
-        </w:rPr>
-        <w:t>Table 5-13 Information Management Interface</w:t>
-      </w:r>
-    </w:p>
-    <w:tbl>
-      <w:tblPr>
-        <w:tblStyle w:val="19"/>
-        <w:tblW w:w="8660" w:type="dxa"/>
-        <w:jc w:val="center"/>
-        <w:tblBorders>
-          <w:top w:val="none" w:color="auto" w:sz="0" w:space="0"/>
-          <w:left w:val="none" w:color="auto" w:sz="0" w:space="0"/>
-          <w:bottom w:val="none" w:color="auto" w:sz="0" w:space="0"/>
-          <w:right w:val="none" w:color="auto" w:sz="0" w:space="0"/>
-          <w:insideH w:val="none" w:color="auto" w:sz="0" w:space="0"/>
-          <w:insideV w:val="none" w:color="auto" w:sz="0" w:space="0"/>
-        </w:tblBorders>
-        <w:tblLayout w:type="autofit"/>
-        <w:tblCellMar>
-          <w:top w:w="0" w:type="dxa"/>
-          <w:left w:w="10" w:type="dxa"/>
-          <w:bottom w:w="0" w:type="dxa"/>
-          <w:right w:w="10" w:type="dxa"/>
-        </w:tblCellMar>
-      </w:tblPr>
-      <w:tblGrid>
-        <w:gridCol w:w="2752"/>
-        <w:gridCol w:w="5908"/>
-      </w:tblGrid>
-      <w:tr>
-        <w:tblPrEx>
-          <w:tblBorders>
-            <w:top w:val="none" w:color="auto" w:sz="0" w:space="0"/>
-            <w:left w:val="none" w:color="auto" w:sz="0" w:space="0"/>
-            <w:bottom w:val="none" w:color="auto" w:sz="0" w:space="0"/>
-            <w:right w:val="none" w:color="auto" w:sz="0" w:space="0"/>
-            <w:insideH w:val="none" w:color="auto" w:sz="0" w:space="0"/>
-            <w:insideV w:val="none" w:color="auto" w:sz="0" w:space="0"/>
-          </w:tblBorders>
-          <w:tblCellMar>
-            <w:top w:w="0" w:type="dxa"/>
-            <w:left w:w="10" w:type="dxa"/>
-            <w:bottom w:w="0" w:type="dxa"/>
-            <w:right w:w="10" w:type="dxa"/>
-          </w:tblCellMar>
-        </w:tblPrEx>
-        <w:trPr>
-          <w:trHeight w:val="0" w:hRule="atLeast"/>
-          <w:tblHeader/>
-          <w:jc w:val="center"/>
-        </w:trPr>
-        <w:tc>
-          <w:tcPr>
-            <w:tcW w:w="2752" w:type="dxa"/>
-            <w:tcBorders>
-              <w:top w:val="single" w:color="auto" w:sz="12" w:space="0"/>
-              <w:left w:val="nil"/>
-              <w:bottom w:val="nil"/>
-              <w:right w:val="nil"/>
-            </w:tcBorders>
-            <w:shd w:val="clear" w:color="F2F2F2" w:fill="auto"/>
-            <w:noWrap w:val="0"/>
-            <w:tcMar>
-              <w:top w:w="-1" w:type="dxa"/>
-              <w:left w:w="-1" w:type="dxa"/>
-              <w:bottom w:w="-1" w:type="dxa"/>
-              <w:right w:w="-1" w:type="dxa"/>
-            </w:tcMar>
-            <w:vAlign w:val="center"/>
-          </w:tcPr>
-          <w:p>
-            <w:pPr>
-              <w:pStyle w:val="28"/>
-              <w:bidi w:val="0"/>
-            </w:pPr>
-            <w:r>
-              <w:t>接口名称</w:t>
-            </w:r>
-          </w:p>
-        </w:tc>
-        <w:tc>
-          <w:tcPr>
-            <w:tcW w:w="5908" w:type="dxa"/>
-            <w:tcBorders>
-              <w:top w:val="single" w:color="auto" w:sz="12" w:space="0"/>
-              <w:left w:val="nil"/>
-              <w:bottom w:val="nil"/>
-              <w:right w:val="nil"/>
-            </w:tcBorders>
-            <w:noWrap w:val="0"/>
-            <w:tcMar>
-              <w:top w:w="-1" w:type="dxa"/>
-              <w:left w:w="-1" w:type="dxa"/>
-              <w:bottom w:w="-1" w:type="dxa"/>
-              <w:right w:w="-1" w:type="dxa"/>
-            </w:tcMar>
-            <w:vAlign w:val="center"/>
-          </w:tcPr>
-          <w:p>
-            <w:pPr>
-              <w:pStyle w:val="28"/>
-              <w:bidi w:val="0"/>
-            </w:pPr>
-            <w:r>
-              <w:t>资讯管理</w:t>
-            </w:r>
-          </w:p>
-        </w:tc>
-      </w:tr>
-      <w:tr>
-        <w:tblPrEx>
-          <w:tblBorders>
-            <w:top w:val="none" w:color="auto" w:sz="0" w:space="0"/>
-            <w:left w:val="none" w:color="auto" w:sz="0" w:space="0"/>
-            <w:bottom w:val="none" w:color="auto" w:sz="0" w:space="0"/>
-            <w:right w:val="none" w:color="auto" w:sz="0" w:space="0"/>
-            <w:insideH w:val="none" w:color="auto" w:sz="0" w:space="0"/>
-            <w:insideV w:val="none" w:color="auto" w:sz="0" w:space="0"/>
-          </w:tblBorders>
-          <w:tblCellMar>
-            <w:top w:w="0" w:type="dxa"/>
-            <w:left w:w="10" w:type="dxa"/>
-            <w:bottom w:w="0" w:type="dxa"/>
-            <w:right w:w="10" w:type="dxa"/>
-          </w:tblCellMar>
-        </w:tblPrEx>
-        <w:trPr>
-          <w:trHeight w:val="0" w:hRule="atLeast"/>
-          <w:tblHeader/>
-          <w:jc w:val="center"/>
-        </w:trPr>
-        <w:tc>
-          <w:tcPr>
-            <w:tcW w:w="2752" w:type="dxa"/>
-            <w:tcBorders>
-              <w:top w:val="single" w:color="auto" w:sz="4" w:space="0"/>
-              <w:left w:val="nil"/>
-              <w:bottom w:val="nil"/>
-              <w:right w:val="nil"/>
-            </w:tcBorders>
-            <w:shd w:val="clear" w:color="F2F2F2" w:fill="auto"/>
-            <w:noWrap w:val="0"/>
-            <w:tcMar>
-              <w:top w:w="-1" w:type="dxa"/>
-              <w:left w:w="-1" w:type="dxa"/>
-              <w:bottom w:w="-1" w:type="dxa"/>
-              <w:right w:w="-1" w:type="dxa"/>
-            </w:tcMar>
-            <w:vAlign w:val="center"/>
-          </w:tcPr>
-          <w:p>
-            <w:pPr>
-              <w:pStyle w:val="28"/>
-              <w:bidi w:val="0"/>
-            </w:pPr>
-            <w:r>
-              <w:t>接口 URL</w:t>
-            </w:r>
-          </w:p>
-        </w:tc>
-        <w:tc>
-          <w:tcPr>
-            <w:tcW w:w="5908" w:type="dxa"/>
-            <w:tcBorders>
-              <w:top w:val="single" w:color="auto" w:sz="4" w:space="0"/>
-              <w:left w:val="nil"/>
-              <w:bottom w:val="nil"/>
-              <w:right w:val="nil"/>
-            </w:tcBorders>
-            <w:noWrap w:val="0"/>
-            <w:tcMar>
-              <w:top w:w="-1" w:type="dxa"/>
-              <w:left w:w="-1" w:type="dxa"/>
-              <w:bottom w:w="-1" w:type="dxa"/>
-              <w:right w:w="-1" w:type="dxa"/>
-            </w:tcMar>
-            <w:vAlign w:val="center"/>
-          </w:tcPr>
-          <w:p>
-            <w:pPr>
-              <w:pStyle w:val="27"/>
-              <w:bidi w:val="0"/>
-            </w:pPr>
-            <w:r>
-              <w:t>/api/news（GET 查询 / POST 创建）
-/api/news/{id}（PUT 修改 / DELETE 删除）</w:t>
-            </w:r>
-          </w:p>
-        </w:tc>
-      </w:tr>
-      <w:tr>
-        <w:tblPrEx>
-          <w:tblBorders>
-            <w:top w:val="none" w:color="auto" w:sz="0" w:space="0"/>
-            <w:left w:val="none" w:color="auto" w:sz="0" w:space="0"/>
-            <w:bottom w:val="none" w:color="auto" w:sz="0" w:space="0"/>
-            <w:right w:val="none" w:color="auto" w:sz="0" w:space="0"/>
-            <w:insideH w:val="none" w:color="auto" w:sz="0" w:space="0"/>
-            <w:insideV w:val="none" w:color="auto" w:sz="0" w:space="0"/>
-          </w:tblBorders>
-          <w:tblCellMar>
-            <w:top w:w="0" w:type="dxa"/>
-            <w:left w:w="10" w:type="dxa"/>
-            <w:bottom w:w="0" w:type="dxa"/>
-            <w:right w:w="10" w:type="dxa"/>
-          </w:tblCellMar>
-        </w:tblPrEx>
-        <w:trPr>
-          <w:trHeight w:val="0" w:hRule="atLeast"/>
-          <w:tblHeader/>
-          <w:jc w:val="center"/>
-        </w:trPr>
-        <w:tc>
-          <w:tcPr>
-            <w:tcW w:w="2752" w:type="dxa"/>
-            <w:tcBorders>
-              <w:top w:val="nil"/>
-              <w:left w:val="nil"/>
-              <w:bottom w:val="nil"/>
-              <w:right w:val="nil"/>
-            </w:tcBorders>
-            <w:shd w:val="clear" w:color="F2F2F2" w:fill="auto"/>
-            <w:noWrap w:val="0"/>
-            <w:tcMar>
-              <w:top w:w="-1" w:type="dxa"/>
-              <w:left w:w="-1" w:type="dxa"/>
-              <w:bottom w:w="-1" w:type="dxa"/>
-              <w:right w:w="-1" w:type="dxa"/>
-            </w:tcMar>
-            <w:vAlign w:val="center"/>
-          </w:tcPr>
-          <w:p>
-            <w:pPr>
-              <w:pStyle w:val="28"/>
-              <w:bidi w:val="0"/>
-            </w:pPr>
-            <w:r>
-              <w:t>请求方式</w:t>
-            </w:r>
-          </w:p>
-        </w:tc>
-        <w:tc>
-          <w:tcPr>
-            <w:tcW w:w="5908" w:type="dxa"/>
-            <w:tcBorders>
-              <w:top w:val="nil"/>
-              <w:left w:val="nil"/>
-              <w:bottom w:val="nil"/>
-              <w:right w:val="nil"/>
-            </w:tcBorders>
-            <w:noWrap w:val="0"/>
-            <w:tcMar>
-              <w:top w:w="-1" w:type="dxa"/>
-              <w:left w:w="-1" w:type="dxa"/>
-              <w:bottom w:w="-1" w:type="dxa"/>
-              <w:right w:w="-1" w:type="dxa"/>
-            </w:tcMar>
-            <w:vAlign w:val="center"/>
-          </w:tcPr>
-          <w:p>
-            <w:pPr>
-              <w:pStyle w:val="27"/>
-              <w:bidi w:val="0"/>
-            </w:pPr>
-            <w:r>
-              <w:t>GET / POST / PUT / DELETE</w:t>
-            </w:r>
-          </w:p>
-        </w:tc>
-      </w:tr>
-      <w:tr>
-        <w:tblPrEx>
-          <w:tblBorders>
-            <w:top w:val="none" w:color="auto" w:sz="0" w:space="0"/>
-            <w:left w:val="none" w:color="auto" w:sz="0" w:space="0"/>
-            <w:bottom w:val="none" w:color="auto" w:sz="0" w:space="0"/>
-            <w:right w:val="none" w:color="auto" w:sz="0" w:space="0"/>
-            <w:insideH w:val="none" w:color="auto" w:sz="0" w:space="0"/>
-            <w:insideV w:val="none" w:color="auto" w:sz="0" w:space="0"/>
-          </w:tblBorders>
-          <w:tblCellMar>
-            <w:top w:w="0" w:type="dxa"/>
-            <w:left w:w="10" w:type="dxa"/>
-            <w:bottom w:w="0" w:type="dxa"/>
-            <w:right w:w="10" w:type="dxa"/>
-          </w:tblCellMar>
-        </w:tblPrEx>
-        <w:trPr>
-          <w:trHeight w:val="0" w:hRule="atLeast"/>
-          <w:tblHeader/>
-          <w:jc w:val="center"/>
-        </w:trPr>
-        <w:tc>
-          <w:tcPr>
-            <w:tcW w:w="2752" w:type="dxa"/>
-            <w:tcBorders>
-              <w:top w:val="nil"/>
-              <w:left w:val="nil"/>
-              <w:bottom w:val="nil"/>
-              <w:right w:val="nil"/>
-            </w:tcBorders>
-            <w:shd w:val="clear" w:color="F2F2F2" w:fill="auto"/>
-            <w:noWrap w:val="0"/>
-            <w:tcMar>
-              <w:top w:w="-1" w:type="dxa"/>
-              <w:left w:w="-1" w:type="dxa"/>
-              <w:bottom w:w="-1" w:type="dxa"/>
-              <w:right w:w="-1" w:type="dxa"/>
-            </w:tcMar>
-            <w:vAlign w:val="center"/>
-          </w:tcPr>
-          <w:p>
-            <w:pPr>
-              <w:pStyle w:val="28"/>
-              <w:bidi w:val="0"/>
-            </w:pPr>
-            <w:r>
-              <w:t>请求参数及主要字段</w:t>
-            </w:r>
-          </w:p>
-        </w:tc>
-        <w:tc>
-          <w:tcPr>
-            <w:tcW w:w="5908" w:type="dxa"/>
-            <w:tcBorders>
-              <w:top w:val="nil"/>
-              <w:left w:val="nil"/>
-              <w:bottom w:val="nil"/>
-              <w:right w:val="nil"/>
-            </w:tcBorders>
-            <w:noWrap w:val="0"/>
-            <w:tcMar>
-              <w:top w:w="-1" w:type="dxa"/>
-              <w:left w:w="-1" w:type="dxa"/>
-              <w:bottom w:w="-1" w:type="dxa"/>
-              <w:right w:w="-1" w:type="dxa"/>
-            </w:tcMar>
-            <w:vAlign w:val="center"/>
-          </w:tcPr>
-          <w:p>
-            <w:pPr>
-              <w:pStyle w:val="27"/>
-              <w:bidi w:val="0"/>
-            </w:pPr>
-            <w:r>
-              <w:t>title（标题），String 类型
-summary（摘要），String 类型
-content（正文），String 类型（HTML）
-coverImage（封面图 URL），String 类型
-publishTime（发布时间），DateTime 类型</w:t>
-            </w:r>
-          </w:p>
-        </w:tc>
-      </w:tr>
-      <w:tr>
-        <w:tblPrEx>
-          <w:tblBorders>
-            <w:top w:val="none" w:color="auto" w:sz="0" w:space="0"/>
-            <w:left w:val="none" w:color="auto" w:sz="0" w:space="0"/>
-            <w:bottom w:val="none" w:color="auto" w:sz="0" w:space="0"/>
-            <w:right w:val="none" w:color="auto" w:sz="0" w:space="0"/>
-            <w:insideH w:val="none" w:color="auto" w:sz="0" w:space="0"/>
-            <w:insideV w:val="none" w:color="auto" w:sz="0" w:space="0"/>
-          </w:tblBorders>
-          <w:tblCellMar>
-            <w:top w:w="0" w:type="dxa"/>
-            <w:left w:w="10" w:type="dxa"/>
-            <w:bottom w:w="0" w:type="dxa"/>
-            <w:right w:w="10" w:type="dxa"/>
-          </w:tblCellMar>
-        </w:tblPrEx>
-        <w:trPr>
-          <w:trHeight w:val="0" w:hRule="atLeast"/>
-          <w:tblHeader/>
-          <w:jc w:val="center"/>
-        </w:trPr>
-        <w:tc>
-          <w:tcPr>
-            <w:tcW w:w="2752" w:type="dxa"/>
-            <w:tcBorders>
-              <w:top w:val="nil"/>
-              <w:left w:val="nil"/>
-              <w:bottom w:val="single" w:color="auto" w:sz="12" w:space="0"/>
-              <w:right w:val="nil"/>
-            </w:tcBorders>
-            <w:shd w:val="clear" w:color="F2F2F2" w:fill="auto"/>
-            <w:noWrap w:val="0"/>
-            <w:tcMar>
-              <w:top w:w="-1" w:type="dxa"/>
-              <w:left w:w="-1" w:type="dxa"/>
-              <w:bottom w:w="-1" w:type="dxa"/>
-              <w:right w:w="-1" w:type="dxa"/>
-            </w:tcMar>
-            <w:vAlign w:val="center"/>
-          </w:tcPr>
-          <w:p>
-            <w:pPr>
-              <w:pStyle w:val="28"/>
-              <w:bidi w:val="0"/>
-            </w:pPr>
-            <w:r>
-              <w:t>返回参数及主要字段</w:t>
-            </w:r>
-          </w:p>
-        </w:tc>
-        <w:tc>
-          <w:tcPr>
-            <w:tcW w:w="5908" w:type="dxa"/>
-            <w:tcBorders>
-              <w:top w:val="nil"/>
-              <w:left w:val="nil"/>
-              <w:bottom w:val="single" w:color="auto" w:sz="12" w:space="0"/>
-              <w:right w:val="nil"/>
-            </w:tcBorders>
-            <w:noWrap w:val="0"/>
-            <w:tcMar>
-              <w:top w:w="-1" w:type="dxa"/>
-              <w:left w:w="-1" w:type="dxa"/>
-              <w:bottom w:w="-1" w:type="dxa"/>
-              <w:right w:w="-1" w:type="dxa"/>
-            </w:tcMar>
-            <w:vAlign w:val="center"/>
-          </w:tcPr>
-          <w:p>
-            <w:pPr>
-              <w:pStyle w:val="27"/>
-              <w:bidi w:val="0"/>
-            </w:pPr>
-            <w:r>
-              <w:t>code（响应代码），整数类型
-msg（返回信息），String 类型</w:t>
-            </w:r>
-          </w:p>
-        </w:tc>
-      </w:tr>
-    </w:tbl>
-    <w:p>
-      <w:pPr>
-        <w:spacing w:before="60"/>
-      </w:pPr>
+        <w:t>资讯管理模块负责网站新闻和活动资讯的发布与管理。资讯数据存储在 news 表中，包含标题（title）、摘要（summary）、正文内容（content，支持 HTML 富文本格式）、封面图片（cover_image）和发布时间（publish_time）。前台用户通过 GET /api/news 接口按发布时间倒序获取资讯列表。管理员通过后台 POST、PUT、DELETE 接口进行资讯的创建、编辑和删除操作。</w:t>
+      </w:r>
     </w:p>
     <w:p>
       <w:pPr>
@@ -19176,541 +16463,7 @@
           <w:szCs w:val="22"/>
           <w:lang w:val="en-US" w:eastAsia="zh-CN" w:bidi="ar-SA"/>
         </w:rPr>
-        <w:t>文件上传模块为系统提供了统一的文件上传功能，支持用户上传头像图片、帖子图片等。文件上传接口（POST /api/file/upload）的详细信息见表 5-14。</w:t>
-      </w:r>
-    </w:p>
-    <w:p>
-      <w:pPr>
-        <w:widowControl w:val="0"/>
-        <w:spacing w:line="300" w:lineRule="auto"/>
-        <w:ind w:firstLine="422" w:firstLineChars="200"/>
-        <w:jc w:val="center"/>
-        <w:rPr>
-          <w:rFonts w:hint="default" w:ascii="Times New Roman" w:hAnsi="Times New Roman" w:eastAsia="宋体" w:cs="Times New Roman"/>
-          <w:b/>
-          <w:bCs/>
-          <w:kern w:val="2"/>
-          <w:sz w:val="21"/>
-          <w:szCs w:val="21"/>
-          <w:lang w:val="en-US" w:eastAsia="zh-CN" w:bidi="ar-SA"/>
-        </w:rPr>
-      </w:pPr>
-    </w:p>
-    <w:p>
-      <w:pPr>
-        <w:widowControl w:val="0"/>
-        <w:spacing w:line="300" w:lineRule="auto"/>
-        <w:ind w:firstLine="422" w:firstLineChars="200"/>
-        <w:jc w:val="center"/>
-        <w:rPr>
-          <w:rFonts w:hint="default" w:ascii="Times New Roman" w:hAnsi="Times New Roman" w:eastAsia="宋体" w:cs="Times New Roman"/>
-          <w:b/>
-          <w:bCs/>
-          <w:kern w:val="2"/>
-          <w:sz w:val="21"/>
-          <w:szCs w:val="21"/>
-          <w:lang w:val="en-US" w:eastAsia="zh-CN" w:bidi="ar-SA"/>
-        </w:rPr>
-      </w:pPr>
-      <w:r>
-        <w:rPr>
-          <w:rFonts w:hint="default" w:ascii="Times New Roman" w:hAnsi="Times New Roman" w:eastAsia="宋体" w:cs="Times New Roman"/>
-          <w:b/>
-          <w:bCs/>
-          <w:kern w:val="2"/>
-          <w:sz w:val="21"/>
-          <w:szCs w:val="21"/>
-          <w:lang w:val="en-US" w:eastAsia="zh-CN" w:bidi="ar-SA"/>
-        </w:rPr>
-        <w:t>表 5-14 文件上传接口</w:t>
-      </w:r>
-    </w:p>
-    <w:p>
-      <w:pPr>
-        <w:widowControl w:val="0"/>
-        <w:spacing w:line="300" w:lineRule="auto"/>
-        <w:ind w:firstLine="422" w:firstLineChars="200"/>
-        <w:jc w:val="center"/>
-        <w:rPr>
-          <w:rFonts w:hint="default" w:ascii="Times New Roman" w:hAnsi="Times New Roman" w:eastAsia="宋体" w:cs="Times New Roman"/>
-          <w:b/>
-          <w:bCs/>
-          <w:kern w:val="2"/>
-          <w:sz w:val="21"/>
-          <w:szCs w:val="21"/>
-          <w:lang w:val="en-US" w:eastAsia="zh-CN" w:bidi="ar-SA"/>
-        </w:rPr>
-      </w:pPr>
-      <w:r>
-        <w:rPr>
-          <w:rFonts w:hint="default" w:ascii="Times New Roman" w:hAnsi="Times New Roman" w:eastAsia="宋体" w:cs="Times New Roman"/>
-          <w:b/>
-          <w:bCs/>
-          <w:kern w:val="2"/>
-          <w:sz w:val="21"/>
-          <w:szCs w:val="21"/>
-          <w:lang w:val="en-US" w:eastAsia="zh-CN" w:bidi="ar-SA"/>
-        </w:rPr>
-        <w:t>Table 5-14 File upload interface</w:t>
-      </w:r>
-    </w:p>
-    <w:tbl>
-      <w:tblPr>
-        <w:tblStyle w:val="19"/>
-        <w:tblW w:w="8660" w:type="dxa"/>
-        <w:jc w:val="center"/>
-        <w:tblBorders>
-          <w:top w:val="none" w:color="auto" w:sz="0" w:space="0"/>
-          <w:left w:val="none" w:color="auto" w:sz="0" w:space="0"/>
-          <w:bottom w:val="none" w:color="auto" w:sz="0" w:space="0"/>
-          <w:right w:val="none" w:color="auto" w:sz="0" w:space="0"/>
-          <w:insideH w:val="none" w:color="auto" w:sz="0" w:space="0"/>
-          <w:insideV w:val="none" w:color="auto" w:sz="0" w:space="0"/>
-        </w:tblBorders>
-        <w:tblLayout w:type="autofit"/>
-        <w:tblCellMar>
-          <w:top w:w="0" w:type="dxa"/>
-          <w:left w:w="10" w:type="dxa"/>
-          <w:bottom w:w="0" w:type="dxa"/>
-          <w:right w:w="10" w:type="dxa"/>
-        </w:tblCellMar>
-      </w:tblPr>
-      <w:tblGrid>
-        <w:gridCol w:w="2779"/>
-        <w:gridCol w:w="5881"/>
-      </w:tblGrid>
-      <w:tr>
-        <w:tblPrEx>
-          <w:tblBorders>
-            <w:top w:val="none" w:color="auto" w:sz="0" w:space="0"/>
-            <w:left w:val="none" w:color="auto" w:sz="0" w:space="0"/>
-            <w:bottom w:val="none" w:color="auto" w:sz="0" w:space="0"/>
-            <w:right w:val="none" w:color="auto" w:sz="0" w:space="0"/>
-            <w:insideH w:val="none" w:color="auto" w:sz="0" w:space="0"/>
-            <w:insideV w:val="none" w:color="auto" w:sz="0" w:space="0"/>
-          </w:tblBorders>
-          <w:tblCellMar>
-            <w:top w:w="0" w:type="dxa"/>
-            <w:left w:w="10" w:type="dxa"/>
-            <w:bottom w:w="0" w:type="dxa"/>
-            <w:right w:w="10" w:type="dxa"/>
-          </w:tblCellMar>
-        </w:tblPrEx>
-        <w:trPr>
-          <w:trHeight w:val="0" w:hRule="atLeast"/>
-          <w:tblHeader/>
-          <w:jc w:val="center"/>
-        </w:trPr>
-        <w:tc>
-          <w:tcPr>
-            <w:tcW w:w="2779" w:type="dxa"/>
-            <w:tcBorders>
-              <w:top w:val="single" w:color="auto" w:sz="12" w:space="0"/>
-              <w:left w:val="nil"/>
-              <w:bottom w:val="nil"/>
-              <w:right w:val="nil"/>
-            </w:tcBorders>
-            <w:shd w:val="clear" w:color="F2F2F2" w:fill="auto"/>
-            <w:noWrap w:val="0"/>
-            <w:tcMar>
-              <w:top w:w="-1" w:type="dxa"/>
-              <w:left w:w="-1" w:type="dxa"/>
-              <w:bottom w:w="-1" w:type="dxa"/>
-              <w:right w:w="-1" w:type="dxa"/>
-            </w:tcMar>
-            <w:vAlign w:val="center"/>
-          </w:tcPr>
-          <w:p>
-            <w:pPr>
-              <w:pStyle w:val="28"/>
-              <w:bidi w:val="0"/>
-            </w:pPr>
-            <w:r>
-              <w:t>接口名称</w:t>
-            </w:r>
-          </w:p>
-        </w:tc>
-        <w:tc>
-          <w:tcPr>
-            <w:tcW w:w="5881" w:type="dxa"/>
-            <w:tcBorders>
-              <w:top w:val="single" w:color="auto" w:sz="12" w:space="0"/>
-              <w:left w:val="nil"/>
-              <w:bottom w:val="nil"/>
-              <w:right w:val="nil"/>
-            </w:tcBorders>
-            <w:noWrap w:val="0"/>
-            <w:tcMar>
-              <w:top w:w="-1" w:type="dxa"/>
-              <w:left w:w="-1" w:type="dxa"/>
-              <w:bottom w:w="-1" w:type="dxa"/>
-              <w:right w:w="-1" w:type="dxa"/>
-            </w:tcMar>
-            <w:vAlign w:val="center"/>
-          </w:tcPr>
-          <w:p>
-            <w:pPr>
-              <w:pStyle w:val="28"/>
-              <w:bidi w:val="0"/>
-            </w:pPr>
-            <w:r>
-              <w:t>文件上传</w:t>
-            </w:r>
-          </w:p>
-        </w:tc>
-      </w:tr>
-      <w:tr>
-        <w:tblPrEx>
-          <w:tblBorders>
-            <w:top w:val="none" w:color="auto" w:sz="0" w:space="0"/>
-            <w:left w:val="none" w:color="auto" w:sz="0" w:space="0"/>
-            <w:bottom w:val="none" w:color="auto" w:sz="0" w:space="0"/>
-            <w:right w:val="none" w:color="auto" w:sz="0" w:space="0"/>
-            <w:insideH w:val="none" w:color="auto" w:sz="0" w:space="0"/>
-            <w:insideV w:val="none" w:color="auto" w:sz="0" w:space="0"/>
-          </w:tblBorders>
-          <w:tblCellMar>
-            <w:top w:w="0" w:type="dxa"/>
-            <w:left w:w="10" w:type="dxa"/>
-            <w:bottom w:w="0" w:type="dxa"/>
-            <w:right w:w="10" w:type="dxa"/>
-          </w:tblCellMar>
-        </w:tblPrEx>
-        <w:trPr>
-          <w:trHeight w:val="0" w:hRule="atLeast"/>
-          <w:tblHeader/>
-          <w:jc w:val="center"/>
-        </w:trPr>
-        <w:tc>
-          <w:tcPr>
-            <w:tcW w:w="2779" w:type="dxa"/>
-            <w:tcBorders>
-              <w:top w:val="single" w:color="auto" w:sz="4" w:space="0"/>
-              <w:left w:val="nil"/>
-              <w:bottom w:val="nil"/>
-              <w:right w:val="nil"/>
-            </w:tcBorders>
-            <w:shd w:val="clear" w:color="F2F2F2" w:fill="auto"/>
-            <w:noWrap w:val="0"/>
-            <w:tcMar>
-              <w:top w:w="-1" w:type="dxa"/>
-              <w:left w:w="-1" w:type="dxa"/>
-              <w:bottom w:w="-1" w:type="dxa"/>
-              <w:right w:w="-1" w:type="dxa"/>
-            </w:tcMar>
-            <w:vAlign w:val="center"/>
-          </w:tcPr>
-          <w:p>
-            <w:pPr>
-              <w:pStyle w:val="28"/>
-              <w:bidi w:val="0"/>
-            </w:pPr>
-            <w:r>
-              <w:t>接口 URL</w:t>
-            </w:r>
-          </w:p>
-        </w:tc>
-        <w:tc>
-          <w:tcPr>
-            <w:tcW w:w="5881" w:type="dxa"/>
-            <w:tcBorders>
-              <w:top w:val="single" w:color="auto" w:sz="4" w:space="0"/>
-              <w:left w:val="nil"/>
-              <w:bottom w:val="nil"/>
-              <w:right w:val="nil"/>
-            </w:tcBorders>
-            <w:noWrap w:val="0"/>
-            <w:tcMar>
-              <w:top w:w="-1" w:type="dxa"/>
-              <w:left w:w="-1" w:type="dxa"/>
-              <w:bottom w:w="-1" w:type="dxa"/>
-              <w:right w:w="-1" w:type="dxa"/>
-            </w:tcMar>
-            <w:vAlign w:val="center"/>
-          </w:tcPr>
-          <w:p>
-            <w:pPr>
-              <w:pStyle w:val="27"/>
-              <w:bidi w:val="0"/>
-            </w:pPr>
-            <w:r>
-              <w:t>/api/file/upload</w:t>
-            </w:r>
-          </w:p>
-        </w:tc>
-      </w:tr>
-      <w:tr>
-        <w:tblPrEx>
-          <w:tblBorders>
-            <w:top w:val="none" w:color="auto" w:sz="0" w:space="0"/>
-            <w:left w:val="none" w:color="auto" w:sz="0" w:space="0"/>
-            <w:bottom w:val="none" w:color="auto" w:sz="0" w:space="0"/>
-            <w:right w:val="none" w:color="auto" w:sz="0" w:space="0"/>
-            <w:insideH w:val="none" w:color="auto" w:sz="0" w:space="0"/>
-            <w:insideV w:val="none" w:color="auto" w:sz="0" w:space="0"/>
-          </w:tblBorders>
-          <w:tblCellMar>
-            <w:top w:w="0" w:type="dxa"/>
-            <w:left w:w="10" w:type="dxa"/>
-            <w:bottom w:w="0" w:type="dxa"/>
-            <w:right w:w="10" w:type="dxa"/>
-          </w:tblCellMar>
-        </w:tblPrEx>
-        <w:trPr>
-          <w:trHeight w:val="0" w:hRule="atLeast"/>
-          <w:tblHeader/>
-          <w:jc w:val="center"/>
-        </w:trPr>
-        <w:tc>
-          <w:tcPr>
-            <w:tcW w:w="2779" w:type="dxa"/>
-            <w:tcBorders>
-              <w:top w:val="nil"/>
-              <w:left w:val="nil"/>
-              <w:bottom w:val="nil"/>
-              <w:right w:val="nil"/>
-            </w:tcBorders>
-            <w:shd w:val="clear" w:color="F2F2F2" w:fill="auto"/>
-            <w:noWrap w:val="0"/>
-            <w:tcMar>
-              <w:top w:w="-1" w:type="dxa"/>
-              <w:left w:w="-1" w:type="dxa"/>
-              <w:bottom w:w="-1" w:type="dxa"/>
-              <w:right w:w="-1" w:type="dxa"/>
-            </w:tcMar>
-            <w:vAlign w:val="center"/>
-          </w:tcPr>
-          <w:p>
-            <w:pPr>
-              <w:pStyle w:val="28"/>
-              <w:bidi w:val="0"/>
-            </w:pPr>
-            <w:r>
-              <w:t>请求方式</w:t>
-            </w:r>
-          </w:p>
-        </w:tc>
-        <w:tc>
-          <w:tcPr>
-            <w:tcW w:w="5881" w:type="dxa"/>
-            <w:tcBorders>
-              <w:top w:val="nil"/>
-              <w:left w:val="nil"/>
-              <w:bottom w:val="nil"/>
-              <w:right w:val="nil"/>
-            </w:tcBorders>
-            <w:noWrap w:val="0"/>
-            <w:tcMar>
-              <w:top w:w="-1" w:type="dxa"/>
-              <w:left w:w="-1" w:type="dxa"/>
-              <w:bottom w:w="-1" w:type="dxa"/>
-              <w:right w:w="-1" w:type="dxa"/>
-            </w:tcMar>
-            <w:vAlign w:val="center"/>
-          </w:tcPr>
-          <w:p>
-            <w:pPr>
-              <w:pStyle w:val="27"/>
-              <w:bidi w:val="0"/>
-            </w:pPr>
-            <w:r>
-              <w:t>POST</w:t>
-            </w:r>
-          </w:p>
-        </w:tc>
-      </w:tr>
-      <w:tr>
-        <w:tblPrEx>
-          <w:tblBorders>
-            <w:top w:val="none" w:color="auto" w:sz="0" w:space="0"/>
-            <w:left w:val="none" w:color="auto" w:sz="0" w:space="0"/>
-            <w:bottom w:val="none" w:color="auto" w:sz="0" w:space="0"/>
-            <w:right w:val="none" w:color="auto" w:sz="0" w:space="0"/>
-            <w:insideH w:val="none" w:color="auto" w:sz="0" w:space="0"/>
-            <w:insideV w:val="none" w:color="auto" w:sz="0" w:space="0"/>
-          </w:tblBorders>
-          <w:tblCellMar>
-            <w:top w:w="0" w:type="dxa"/>
-            <w:left w:w="10" w:type="dxa"/>
-            <w:bottom w:w="0" w:type="dxa"/>
-            <w:right w:w="10" w:type="dxa"/>
-          </w:tblCellMar>
-        </w:tblPrEx>
-        <w:trPr>
-          <w:trHeight w:val="0" w:hRule="atLeast"/>
-          <w:tblHeader/>
-          <w:jc w:val="center"/>
-        </w:trPr>
-        <w:tc>
-          <w:tcPr>
-            <w:tcW w:w="2779" w:type="dxa"/>
-            <w:tcBorders>
-              <w:top w:val="nil"/>
-              <w:left w:val="nil"/>
-              <w:bottom w:val="nil"/>
-              <w:right w:val="nil"/>
-            </w:tcBorders>
-            <w:shd w:val="clear" w:color="F2F2F2" w:fill="auto"/>
-            <w:noWrap w:val="0"/>
-            <w:tcMar>
-              <w:top w:w="-1" w:type="dxa"/>
-              <w:left w:w="-1" w:type="dxa"/>
-              <w:bottom w:w="-1" w:type="dxa"/>
-              <w:right w:w="-1" w:type="dxa"/>
-            </w:tcMar>
-            <w:vAlign w:val="center"/>
-          </w:tcPr>
-          <w:p>
-            <w:pPr>
-              <w:pStyle w:val="28"/>
-              <w:bidi w:val="0"/>
-            </w:pPr>
-            <w:r>
-              <w:t>请求参数及主要字段</w:t>
-            </w:r>
-          </w:p>
-        </w:tc>
-        <w:tc>
-          <w:tcPr>
-            <w:tcW w:w="5881" w:type="dxa"/>
-            <w:tcBorders>
-              <w:top w:val="nil"/>
-              <w:left w:val="nil"/>
-              <w:bottom w:val="nil"/>
-              <w:right w:val="nil"/>
-            </w:tcBorders>
-            <w:noWrap w:val="0"/>
-            <w:tcMar>
-              <w:top w:w="-1" w:type="dxa"/>
-              <w:left w:w="-1" w:type="dxa"/>
-              <w:bottom w:w="-1" w:type="dxa"/>
-              <w:right w:w="-1" w:type="dxa"/>
-            </w:tcMar>
-            <w:vAlign w:val="center"/>
-          </w:tcPr>
-          <w:p>
-            <w:pPr>
-              <w:pStyle w:val="27"/>
-              <w:bidi w:val="0"/>
-            </w:pPr>
-            <w:r>
-              <w:t>file（上传文件），MultipartFile 类型</w:t>
-            </w:r>
-          </w:p>
-        </w:tc>
-      </w:tr>
-      <w:tr>
-        <w:tblPrEx>
-          <w:tblBorders>
-            <w:top w:val="none" w:color="auto" w:sz="0" w:space="0"/>
-            <w:left w:val="none" w:color="auto" w:sz="0" w:space="0"/>
-            <w:bottom w:val="none" w:color="auto" w:sz="0" w:space="0"/>
-            <w:right w:val="none" w:color="auto" w:sz="0" w:space="0"/>
-            <w:insideH w:val="none" w:color="auto" w:sz="0" w:space="0"/>
-            <w:insideV w:val="none" w:color="auto" w:sz="0" w:space="0"/>
-          </w:tblBorders>
-          <w:tblCellMar>
-            <w:top w:w="0" w:type="dxa"/>
-            <w:left w:w="10" w:type="dxa"/>
-            <w:bottom w:w="0" w:type="dxa"/>
-            <w:right w:w="10" w:type="dxa"/>
-          </w:tblCellMar>
-        </w:tblPrEx>
-        <w:trPr>
-          <w:trHeight w:val="0" w:hRule="atLeast"/>
-          <w:tblHeader/>
-          <w:jc w:val="center"/>
-        </w:trPr>
-        <w:tc>
-          <w:tcPr>
-            <w:tcW w:w="2779" w:type="dxa"/>
-            <w:tcBorders>
-              <w:top w:val="nil"/>
-              <w:left w:val="nil"/>
-              <w:bottom w:val="single" w:color="auto" w:sz="12" w:space="0"/>
-              <w:right w:val="nil"/>
-            </w:tcBorders>
-            <w:shd w:val="clear" w:color="F2F2F2" w:fill="auto"/>
-            <w:noWrap w:val="0"/>
-            <w:tcMar>
-              <w:top w:w="-1" w:type="dxa"/>
-              <w:left w:w="-1" w:type="dxa"/>
-              <w:bottom w:w="-1" w:type="dxa"/>
-              <w:right w:w="-1" w:type="dxa"/>
-            </w:tcMar>
-            <w:vAlign w:val="center"/>
-          </w:tcPr>
-          <w:p>
-            <w:pPr>
-              <w:pStyle w:val="28"/>
-              <w:bidi w:val="0"/>
-            </w:pPr>
-            <w:r>
-              <w:t>返回参数及主要字段</w:t>
-            </w:r>
-          </w:p>
-        </w:tc>
-        <w:tc>
-          <w:tcPr>
-            <w:tcW w:w="5881" w:type="dxa"/>
-            <w:tcBorders>
-              <w:top w:val="nil"/>
-              <w:left w:val="nil"/>
-              <w:bottom w:val="single" w:color="auto" w:sz="12" w:space="0"/>
-              <w:right w:val="nil"/>
-            </w:tcBorders>
-            <w:noWrap w:val="0"/>
-            <w:tcMar>
-              <w:top w:w="-1" w:type="dxa"/>
-              <w:left w:w="-1" w:type="dxa"/>
-              <w:bottom w:w="-1" w:type="dxa"/>
-              <w:right w:w="-1" w:type="dxa"/>
-            </w:tcMar>
-            <w:vAlign w:val="center"/>
-          </w:tcPr>
-          <w:p>
-            <w:pPr>
-              <w:pStyle w:val="27"/>
-              <w:bidi w:val="0"/>
-            </w:pPr>
-            <w:r>
-              <w:t>code（响应代码），整数类型
-msg（返回信息），String 类型
-data（文件访问 URL），String 类型，格式为 /uploads/{uuid}.{ext}</w:t>
-            </w:r>
-          </w:p>
-        </w:tc>
-      </w:tr>
-    </w:tbl>
-    <w:p>
-      <w:pPr>
-        <w:spacing w:before="60"/>
-      </w:pPr>
-    </w:p>
-    <w:p>
-      <w:pPr>
-        <w:widowControl w:val="0"/>
-        <w:bidi w:val="0"/>
-        <w:spacing w:line="300" w:lineRule="auto"/>
-        <w:ind w:leftChars="0" w:firstLine="480" w:firstLineChars="200"/>
-        <w:jc w:val="both"/>
-        <w:rPr>
-          <w:rFonts w:hint="eastAsia" w:ascii="Times New Roman" w:hAnsi="Times New Roman" w:eastAsia="宋体" w:cstheme="minorBidi"/>
-          <w:kern w:val="2"/>
-          <w:sz w:val="24"/>
-          <w:szCs w:val="22"/>
-          <w:lang w:val="en-US" w:eastAsia="zh-CN" w:bidi="ar-SA"/>
-        </w:rPr>
-      </w:pPr>
-      <w:r>
-        <w:rPr>
-          <w:rFonts w:hint="eastAsia" w:ascii="Times New Roman" w:hAnsi="Times New Roman" w:eastAsia="宋体" w:cstheme="minorBidi"/>
-          <w:kern w:val="2"/>
-          <w:sz w:val="24"/>
-          <w:szCs w:val="22"/>
-          <w:lang w:val="en-US" w:eastAsia="zh-CN" w:bidi="ar-SA"/>
-        </w:rPr>
-        <w:t>文件上传接口的实现流程如下：首先，校验上传文件是否为空，若为空则返回文件为空的错误信息。然后，从原始文件名中提取文件扩展名（如 .jpg、.png），使用 Java 的 UUID.randomUUID() 方法生成一个全局唯一的文件名，将扩展名追加到 UUID 后组成新的文件名。这种命名策略有效避免了文件名冲突问题，同时不暴露用户的原始文件信息。接着，系统将上传文件保存到项目运行目录下的 uploads/ 子目录中，如果目录不存在则通过 mkdirs() 方法自动创建。最后，返回格式为 /uploads/{uuid}.{ext} 的文件访问 URL。</w:t>
+        <w:t>文件上传模块为系统提供了统一的文件上传功能，支持用户上传头像图片、帖子图片等。文件上传接口的实现流程如下：首先，校验上传文件是否为空，若为空则返回文件为空的错误信息。然后，从原始文件名中提取文件扩展名（如 .jpg、.png），使用 Java 的 UUID.randomUUID() 方法生成一个全局唯一的文件名，将扩展名追加到 UUID 后组成新的文件名。这种命名策略有效避免了文件名冲突问题，同时不暴露用户的原始文件信息。接着，系统将上传文件保存到项目运行目录下的 uploads/ 子目录中，如果目录不存在则通过 mkdirs() 方法自动创建。最后，返回格式为 /uploads/{uuid}.{ext} 的文件访问 URL。</w:t>
       </w:r>
     </w:p>
     <w:p>
@@ -25341,12 +22094,6 @@
             <w:insideH w:val="single" w:color="auto" w:sz="4" w:space="0"/>
             <w:insideV w:val="single" w:color="auto" w:sz="4" w:space="0"/>
           </w:tblBorders>
-          <w:tblCellMar>
-            <w:top w:w="0" w:type="dxa"/>
-            <w:left w:w="10" w:type="dxa"/>
-            <w:bottom w:w="0" w:type="dxa"/>
-            <w:right w:w="10" w:type="dxa"/>
-          </w:tblCellMar>
         </w:tblPrEx>
         <w:tc>
           <w:tcPr>
@@ -26272,12 +23019,6 @@
             <w:insideH w:val="single" w:color="auto" w:sz="4" w:space="0"/>
             <w:insideV w:val="single" w:color="auto" w:sz="4" w:space="0"/>
           </w:tblBorders>
-          <w:tblCellMar>
-            <w:top w:w="0" w:type="dxa"/>
-            <w:left w:w="10" w:type="dxa"/>
-            <w:bottom w:w="0" w:type="dxa"/>
-            <w:right w:w="10" w:type="dxa"/>
-          </w:tblCellMar>
         </w:tblPrEx>
         <w:tc>
           <w:tcPr>
@@ -27073,12 +23814,6 @@
             <w:insideH w:val="single" w:color="auto" w:sz="4" w:space="0"/>
             <w:insideV w:val="single" w:color="auto" w:sz="4" w:space="0"/>
           </w:tblBorders>
-          <w:tblCellMar>
-            <w:top w:w="0" w:type="dxa"/>
-            <w:left w:w="10" w:type="dxa"/>
-            <w:bottom w:w="0" w:type="dxa"/>
-            <w:right w:w="10" w:type="dxa"/>
-          </w:tblCellMar>
         </w:tblPrEx>
         <w:tc>
           <w:tcPr>
@@ -28505,18 +25240,7 @@
           <w:szCs w:val="21"/>
           <w:lang w:val="en-US" w:eastAsia="zh-CN"/>
         </w:rPr>
-        <w:t xml:space="preserve"> J. Stray </w:t>
-      </w:r>
-      <w:bookmarkStart w:id="168" w:name="_GoBack"/>
-      <w:bookmarkEnd w:id="168"/>
-      <w:r>
-        <w:rPr>
-          <w:rFonts w:hint="default" w:ascii="Times New Roman" w:hAnsi="Times New Roman" w:cs="Times New Roman"/>
-          <w:sz w:val="21"/>
-          <w:szCs w:val="21"/>
-          <w:lang w:val="en-US" w:eastAsia="zh-CN"/>
-        </w:rPr>
-        <w:t>and owner-relinquished cats in Australia—Estimation of numbers entering municipal pounds, shelters and rescue groups and their outcomes[J]. Animals, 2023, 13(11).</w:t>
+        <w:t xml:space="preserve"> J. Stray and owner-relinquished cats in Australia—Estimation of numbers entering municipal pounds, shelters and rescue groups and their outcomes[J]. Animals, 2023, 13(11).</w:t>
       </w:r>
     </w:p>
     <w:p>

</xml_diff>

<commit_message>
fix: remove 可编辑 text from admin dashboard core stats header
</commit_message>
<xml_diff>
--- a/浙江工业大学本科毕业论文-孔泽宇.docx
+++ b/浙江工业大学本科毕业论文-孔泽宇.docx
@@ -9529,6 +9529,12 @@
             <w:insideH w:val="none" w:color="auto" w:sz="4" w:space="0"/>
             <w:insideV w:val="none" w:color="auto" w:sz="4" w:space="0"/>
           </w:tblBorders>
+          <w:tblCellMar>
+            <w:top w:w="0" w:type="dxa"/>
+            <w:left w:w="108" w:type="dxa"/>
+            <w:bottom w:w="0" w:type="dxa"/>
+            <w:right w:w="108" w:type="dxa"/>
+          </w:tblCellMar>
         </w:tblPrEx>
         <w:trPr>
           <w:trHeight w:val="397" w:hRule="atLeast"/>
@@ -10630,6 +10636,7 @@
             <w:insideH w:val="single" w:color="auto" w:sz="4" w:space="0"/>
             <w:insideV w:val="none" w:color="auto" w:sz="0" w:space="0"/>
           </w:tblBorders>
+          <w:shd w:val="clear" w:color="auto" w:fill="auto"/>
           <w:tblCellMar>
             <w:top w:w="0" w:type="dxa"/>
             <w:left w:w="108" w:type="dxa"/>
@@ -15777,8 +15784,6 @@
           </wp:inline>
         </w:drawing>
       </w:r>
-      <w:bookmarkStart w:id="168" w:name="_GoBack"/>
-      <w:bookmarkEnd w:id="168"/>
     </w:p>
     <w:p>
       <w:pPr>
@@ -15993,7 +15998,7 @@
           <w:szCs w:val="22"/>
           <w:lang w:val="en-US" w:eastAsia="zh-CN" w:bidi="ar-SA"/>
         </w:rPr>
-        <w:t>宠物养护知识库模块通过 knowledge 表存储与救助组织相关的实用信息，如工作时间、联系方式、救助站地址、QQ 群号等。knowledge 表结构简洁，包含标题（title）、内容（content）和排序字段（sort_order）。前台用户通过 GET /api/knowledge 接口按 sort_order 升序获取所有知识条目，通过 GET /api/knowledge/{id} 接口查看单条知识的详细内容。该模块为纯展示型模块，数据由管理员在数据库初始化时通过 init.sql 脚本预设。</w:t>
+        <w:t>宠物养护知识库模块通过 knowledge 表存储与救助组织相关的实用信息，如工作时间、联系方式、救助站地址等。knowledge 表结构简洁，包含标题（title）、内容（content）和排序字段（sort_order）。前台用户通过 GET /api/knowledge 接口按 sort_order 升序获取所有知识条目，通过 GET /api/knowledge/{id} 接口查看单条知识的详细内容。该模块为纯展示型模块，数据由管理员在数据库初始化时通过 init.sql 脚本预设。</w:t>
       </w:r>
     </w:p>
     <w:p>
@@ -16145,44 +16150,33 @@
         <w:ind w:leftChars="0" w:firstLine="480" w:firstLineChars="200"/>
         <w:jc w:val="both"/>
         <w:rPr>
+          <w:rFonts w:hint="eastAsia" w:cstheme="minorBidi"/>
+          <w:kern w:val="2"/>
+          <w:sz w:val="24"/>
+          <w:szCs w:val="22"/>
+          <w:lang w:val="en-US" w:eastAsia="zh-CN" w:bidi="ar-SA"/>
+        </w:rPr>
+      </w:pPr>
+      <w:r>
+        <w:rPr>
           <w:rFonts w:hint="eastAsia" w:ascii="Times New Roman" w:hAnsi="Times New Roman" w:eastAsia="宋体" w:cstheme="minorBidi"/>
           <w:kern w:val="2"/>
           <w:sz w:val="24"/>
           <w:szCs w:val="22"/>
           <w:lang w:val="en-US" w:eastAsia="zh-CN" w:bidi="ar-SA"/>
         </w:rPr>
-      </w:pPr>
-      <w:r>
-        <w:rPr>
-          <w:rFonts w:hint="eastAsia" w:ascii="Times New Roman" w:hAnsi="Times New Roman" w:eastAsia="宋体" w:cstheme="minorBidi"/>
+        <w:t>首页汇总看板接口（GET /api/dashboard/summary）为网站首页提供关键运营指标的聚合数据。该接口的实现流程如下：首先，系统统计当前状态为可领养（status=1）的动物数量作为待领养动物数；统计 animal 表中的总记录数作为动物档案总数。然后，系统从 transparency_record 表中查询 sort_order 最大的记录（即最新的一条财务公示），提取其 expense 字段作为当月运营支出的展示值。最后，从 system_config 表中读取配置的累计救助总数（dashboard.totalRescueCount，默认值 2680）和成功领养总数（dashboard.adoptionSuccessCount，默认值 1930），结合动态统计数据组成包含 totalRescueCount、adoptionSuccessCount、activeAnimals、totalProfiles 和 monthlyPublicBudget 五个指标的完整汇总数据返回。这种静态配置与动态统计相结合的混合口径，既允许管理员灵活调整历史累计指标，又保证了实时数据的准确性。</w:t>
+      </w:r>
+      <w:r>
+        <w:rPr>
+          <w:rFonts w:hint="eastAsia" w:cstheme="minorBidi"/>
           <w:kern w:val="2"/>
           <w:sz w:val="24"/>
           <w:szCs w:val="22"/>
           <w:lang w:val="en-US" w:eastAsia="zh-CN" w:bidi="ar-SA"/>
         </w:rPr>
-        <w:t>首页汇总看板接口（GET /api/dashboard/summary）为网站首页提供关键运营指标的聚合数据。该接口的实现流程如下：首先，系统统计当前状态为可领养（status=1）的动物数量作为待领养动物数；统计 animal 表中的总记录数作为动物档案总数。然后，系统从 transparency_record 表中查询 sort_order 最大的记录（即最新的一条财务公示），提取其 expense 字段作为当月运营支出的展示值。最后，从 system_config 表中读取配置的累计救助总数（dashboard.totalRescueCount，默认值 2680）和成功领养总数（dashboard.adoptionSuccessCount，默认值 1930），结合动态统计数据组成包含 totalRescueCount、adoptionSuccessCount、activeAnimals、totalProfiles 和 monthlyPublicBudget 五个指标的完整汇总数据返回。这种静态配置与动态统计相结合的混合口径，既允许管理员灵活调整历史累计指标，又保证了实时数据的准确性。</w:t>
-      </w:r>
-    </w:p>
-    <w:p>
-      <w:pPr>
-        <w:pStyle w:val="4"/>
-        <w:bidi w:val="0"/>
-        <w:rPr>
-          <w:rFonts w:hint="default"/>
-          <w:lang w:val="en-US" w:eastAsia="zh-CN"/>
-        </w:rPr>
-      </w:pPr>
-      <w:bookmarkStart w:id="128" w:name="_Toc5467"/>
-      <w:bookmarkStart w:id="129" w:name="_Toc9547"/>
-      <w:r>
-        <w:rPr>
-          <w:rFonts w:hint="default"/>
-          <w:lang w:val="en-US" w:eastAsia="zh-CN"/>
-        </w:rPr>
-        <w:t>5.7.2 管理后台图表看板</w:t>
-      </w:r>
-      <w:bookmarkEnd w:id="128"/>
-      <w:bookmarkEnd w:id="129"/>
+        <w:t>后台仪表盘界面如图5-9所示。</w:t>
+      </w:r>
     </w:p>
     <w:p>
       <w:pPr>
@@ -16192,22 +16186,322 @@
         <w:ind w:leftChars="0" w:firstLine="480" w:firstLineChars="200"/>
         <w:jc w:val="both"/>
         <w:rPr>
+          <w:rFonts w:hint="default" w:cstheme="minorBidi"/>
+          <w:kern w:val="2"/>
+          <w:sz w:val="24"/>
+          <w:szCs w:val="22"/>
+          <w:lang w:val="en-US" w:eastAsia="zh-CN" w:bidi="ar-SA"/>
+        </w:rPr>
+      </w:pPr>
+      <w:r>
+        <w:drawing>
+          <wp:inline distT="0" distB="0" distL="114300" distR="114300">
+            <wp:extent cx="5481955" cy="2719705"/>
+            <wp:effectExtent l="0" t="0" r="4445" b="4445"/>
+            <wp:docPr id="14" name="图片 6"/>
+            <wp:cNvGraphicFramePr>
+              <a:graphicFrameLocks xmlns:a="http://schemas.openxmlformats.org/drawingml/2006/main" noChangeAspect="1"/>
+            </wp:cNvGraphicFramePr>
+            <a:graphic xmlns:a="http://schemas.openxmlformats.org/drawingml/2006/main">
+              <a:graphicData uri="http://schemas.openxmlformats.org/drawingml/2006/picture">
+                <pic:pic xmlns:pic="http://schemas.openxmlformats.org/drawingml/2006/picture">
+                  <pic:nvPicPr>
+                    <pic:cNvPr id="14" name="图片 6"/>
+                    <pic:cNvPicPr>
+                      <a:picLocks noChangeAspect="1"/>
+                    </pic:cNvPicPr>
+                  </pic:nvPicPr>
+                  <pic:blipFill>
+                    <a:blip r:embed="rId19"/>
+                    <a:stretch>
+                      <a:fillRect/>
+                    </a:stretch>
+                  </pic:blipFill>
+                  <pic:spPr>
+                    <a:xfrm>
+                      <a:off x="0" y="0"/>
+                      <a:ext cx="5481955" cy="2719705"/>
+                    </a:xfrm>
+                    <a:prstGeom prst="rect">
+                      <a:avLst/>
+                    </a:prstGeom>
+                    <a:noFill/>
+                    <a:ln>
+                      <a:noFill/>
+                    </a:ln>
+                  </pic:spPr>
+                </pic:pic>
+              </a:graphicData>
+            </a:graphic>
+          </wp:inline>
+        </w:drawing>
+      </w:r>
+    </w:p>
+    <w:p>
+      <w:pPr>
+        <w:pStyle w:val="4"/>
+        <w:bidi w:val="0"/>
+        <w:rPr>
+          <w:rFonts w:hint="default"/>
+          <w:lang w:val="en-US" w:eastAsia="zh-CN"/>
+        </w:rPr>
+      </w:pPr>
+      <w:bookmarkStart w:id="128" w:name="_Toc5467"/>
+      <w:bookmarkStart w:id="129" w:name="_Toc9547"/>
+      <w:r>
+        <w:rPr>
+          <w:rFonts w:hint="default"/>
+          <w:lang w:val="en-US" w:eastAsia="zh-CN"/>
+        </w:rPr>
+        <w:t>5.7.2 管理后台图表看板</w:t>
+      </w:r>
+      <w:bookmarkEnd w:id="128"/>
+      <w:bookmarkEnd w:id="129"/>
+    </w:p>
+    <w:p>
+      <w:pPr>
+        <w:widowControl w:val="0"/>
+        <w:bidi w:val="0"/>
+        <w:spacing w:line="300" w:lineRule="auto"/>
+        <w:ind w:leftChars="0" w:firstLine="480" w:firstLineChars="200"/>
+        <w:jc w:val="both"/>
+        <w:rPr>
+          <w:rFonts w:hint="default" w:ascii="Times New Roman" w:hAnsi="Times New Roman" w:eastAsia="宋体" w:cs="Times New Roman"/>
+          <w:b w:val="0"/>
+          <w:kern w:val="2"/>
+          <w:sz w:val="24"/>
+          <w:szCs w:val="22"/>
+          <w:lang w:val="en-US" w:eastAsia="zh-CN" w:bidi="ar-SA"/>
+        </w:rPr>
+      </w:pPr>
+      <w:r>
+        <w:rPr>
           <w:rFonts w:hint="eastAsia" w:ascii="Times New Roman" w:hAnsi="Times New Roman" w:eastAsia="宋体" w:cstheme="minorBidi"/>
           <w:kern w:val="2"/>
           <w:sz w:val="24"/>
           <w:szCs w:val="22"/>
           <w:lang w:val="en-US" w:eastAsia="zh-CN" w:bidi="ar-SA"/>
         </w:rPr>
-      </w:pPr>
-      <w:r>
-        <w:rPr>
-          <w:rFonts w:hint="eastAsia" w:ascii="Times New Roman" w:hAnsi="Times New Roman" w:eastAsia="宋体" w:cstheme="minorBidi"/>
+        <w:t>管理后台图表看板接口（GET /api/dashboard）为管理员提供五类统计维度的图表数据</w:t>
+      </w:r>
+      <w:r>
+        <w:rPr>
+          <w:rFonts w:hint="eastAsia" w:cstheme="minorBidi"/>
           <w:kern w:val="2"/>
           <w:sz w:val="24"/>
           <w:szCs w:val="22"/>
           <w:lang w:val="en-US" w:eastAsia="zh-CN" w:bidi="ar-SA"/>
         </w:rPr>
-        <w:t>管理后台图表看板接口（GET /api/dashboard/charts）为管理员提供五类统计维度的图表数据：</w:t>
+        <w:t>，第一个是</w:t>
+      </w:r>
+      <w:r>
+        <w:rPr>
+          <w:rFonts w:hint="default" w:ascii="Times New Roman" w:hAnsi="Times New Roman" w:eastAsia="宋体" w:cs="Times New Roman"/>
+          <w:b w:val="0"/>
+          <w:kern w:val="2"/>
+          <w:sz w:val="24"/>
+          <w:szCs w:val="22"/>
+          <w:lang w:val="en-US" w:eastAsia="zh-CN" w:bidi="ar-SA"/>
+        </w:rPr>
+        <w:t>动物类别统计</w:t>
+      </w:r>
+      <w:r>
+        <w:rPr>
+          <w:rFonts w:hint="eastAsia" w:cs="Times New Roman"/>
+          <w:b w:val="0"/>
+          <w:kern w:val="2"/>
+          <w:sz w:val="24"/>
+          <w:szCs w:val="22"/>
+          <w:lang w:val="en-US" w:eastAsia="zh-CN" w:bidi="ar-SA"/>
+        </w:rPr>
+        <w:t>。</w:t>
+      </w:r>
+      <w:r>
+        <w:rPr>
+          <w:rFonts w:hint="default" w:ascii="Times New Roman" w:hAnsi="Times New Roman" w:eastAsia="宋体" w:cs="Times New Roman"/>
+          <w:b w:val="0"/>
+          <w:kern w:val="2"/>
+          <w:sz w:val="24"/>
+          <w:szCs w:val="22"/>
+          <w:lang w:val="en-US" w:eastAsia="zh-CN" w:bidi="ar-SA"/>
+        </w:rPr>
+        <w:t>分别统计猫类别和狗类别的动物数量，以柱状图展示救助动物的种类分布。</w:t>
+      </w:r>
+      <w:r>
+        <w:rPr>
+          <w:rFonts w:hint="eastAsia" w:cs="Times New Roman"/>
+          <w:b w:val="0"/>
+          <w:kern w:val="2"/>
+          <w:sz w:val="24"/>
+          <w:szCs w:val="22"/>
+          <w:lang w:val="en-US" w:eastAsia="zh-CN" w:bidi="ar-SA"/>
+        </w:rPr>
+        <w:t>第二个是</w:t>
+      </w:r>
+      <w:r>
+        <w:rPr>
+          <w:rFonts w:hint="default" w:ascii="Times New Roman" w:hAnsi="Times New Roman" w:eastAsia="宋体" w:cs="Times New Roman"/>
+          <w:b w:val="0"/>
+          <w:kern w:val="2"/>
+          <w:sz w:val="24"/>
+          <w:szCs w:val="22"/>
+          <w:lang w:val="en-US" w:eastAsia="zh-CN" w:bidi="ar-SA"/>
+        </w:rPr>
+        <w:t>动物状态统计</w:t>
+      </w:r>
+      <w:r>
+        <w:rPr>
+          <w:rFonts w:hint="eastAsia" w:cs="Times New Roman"/>
+          <w:b w:val="0"/>
+          <w:kern w:val="2"/>
+          <w:sz w:val="24"/>
+          <w:szCs w:val="22"/>
+          <w:lang w:val="en-US" w:eastAsia="zh-CN" w:bidi="ar-SA"/>
+        </w:rPr>
+        <w:t>。</w:t>
+      </w:r>
+      <w:r>
+        <w:rPr>
+          <w:rFonts w:hint="default" w:ascii="Times New Roman" w:hAnsi="Times New Roman" w:eastAsia="宋体" w:cs="Times New Roman"/>
+          <w:b w:val="0"/>
+          <w:kern w:val="2"/>
+          <w:sz w:val="24"/>
+          <w:szCs w:val="22"/>
+          <w:lang w:val="en-US" w:eastAsia="zh-CN" w:bidi="ar-SA"/>
+        </w:rPr>
+        <w:t>统计当前可领养和已领养的动物数量，反映救助站的整体领养进度。</w:t>
+      </w:r>
+      <w:r>
+        <w:rPr>
+          <w:rFonts w:hint="eastAsia" w:cs="Times New Roman"/>
+          <w:b w:val="0"/>
+          <w:kern w:val="2"/>
+          <w:sz w:val="24"/>
+          <w:szCs w:val="22"/>
+          <w:lang w:val="en-US" w:eastAsia="zh-CN" w:bidi="ar-SA"/>
+        </w:rPr>
+        <w:t>第三个是</w:t>
+      </w:r>
+      <w:r>
+        <w:rPr>
+          <w:rFonts w:hint="default" w:ascii="Times New Roman" w:hAnsi="Times New Roman" w:eastAsia="宋体" w:cs="Times New Roman"/>
+          <w:b w:val="0"/>
+          <w:kern w:val="2"/>
+          <w:sz w:val="24"/>
+          <w:szCs w:val="22"/>
+          <w:lang w:val="en-US" w:eastAsia="zh-CN" w:bidi="ar-SA"/>
+        </w:rPr>
+        <w:t>领养申请状态统计</w:t>
+      </w:r>
+      <w:r>
+        <w:rPr>
+          <w:rFonts w:hint="eastAsia" w:cs="Times New Roman"/>
+          <w:b w:val="0"/>
+          <w:kern w:val="2"/>
+          <w:sz w:val="24"/>
+          <w:szCs w:val="22"/>
+          <w:lang w:val="en-US" w:eastAsia="zh-CN" w:bidi="ar-SA"/>
+        </w:rPr>
+        <w:t>。</w:t>
+      </w:r>
+      <w:r>
+        <w:rPr>
+          <w:rFonts w:hint="default" w:ascii="Times New Roman" w:hAnsi="Times New Roman" w:eastAsia="宋体" w:cs="Times New Roman"/>
+          <w:b w:val="0"/>
+          <w:kern w:val="2"/>
+          <w:sz w:val="24"/>
+          <w:szCs w:val="22"/>
+          <w:lang w:val="en-US" w:eastAsia="zh-CN" w:bidi="ar-SA"/>
+        </w:rPr>
+        <w:t>分别统计待审核、已通过和已拒绝的领养申请数量，帮助管理员掌握领养审批工作负载</w:t>
+      </w:r>
+      <w:r>
+        <w:rPr>
+          <w:rFonts w:hint="eastAsia" w:cs="Times New Roman"/>
+          <w:b w:val="0"/>
+          <w:kern w:val="2"/>
+          <w:sz w:val="24"/>
+          <w:szCs w:val="22"/>
+          <w:lang w:val="en-US" w:eastAsia="zh-CN" w:bidi="ar-SA"/>
+        </w:rPr>
+        <w:t>。第四是</w:t>
+      </w:r>
+      <w:r>
+        <w:rPr>
+          <w:rFonts w:hint="default" w:ascii="Times New Roman" w:hAnsi="Times New Roman" w:eastAsia="宋体" w:cs="Times New Roman"/>
+          <w:b w:val="0"/>
+          <w:kern w:val="2"/>
+          <w:sz w:val="24"/>
+          <w:szCs w:val="22"/>
+          <w:lang w:val="en-US" w:eastAsia="zh-CN" w:bidi="ar-SA"/>
+        </w:rPr>
+        <w:t>物资认领状态统计</w:t>
+      </w:r>
+      <w:r>
+        <w:rPr>
+          <w:rFonts w:hint="eastAsia" w:cs="Times New Roman"/>
+          <w:b w:val="0"/>
+          <w:kern w:val="2"/>
+          <w:sz w:val="24"/>
+          <w:szCs w:val="22"/>
+          <w:lang w:val="en-US" w:eastAsia="zh-CN" w:bidi="ar-SA"/>
+        </w:rPr>
+        <w:t>。</w:t>
+      </w:r>
+      <w:r>
+        <w:rPr>
+          <w:rFonts w:hint="default" w:ascii="Times New Roman" w:hAnsi="Times New Roman" w:eastAsia="宋体" w:cs="Times New Roman"/>
+          <w:b w:val="0"/>
+          <w:kern w:val="2"/>
+          <w:sz w:val="24"/>
+          <w:szCs w:val="22"/>
+          <w:lang w:val="en-US" w:eastAsia="zh-CN" w:bidi="ar-SA"/>
+        </w:rPr>
+        <w:t>分别统计待审核、已通过和已拒绝的认领申请数量，监控物资认领的处理效率。</w:t>
+      </w:r>
+      <w:r>
+        <w:rPr>
+          <w:rFonts w:hint="eastAsia" w:cs="Times New Roman"/>
+          <w:b w:val="0"/>
+          <w:kern w:val="2"/>
+          <w:sz w:val="24"/>
+          <w:szCs w:val="22"/>
+          <w:lang w:val="en-US" w:eastAsia="zh-CN" w:bidi="ar-SA"/>
+        </w:rPr>
+        <w:t>第五个是</w:t>
+      </w:r>
+      <w:r>
+        <w:rPr>
+          <w:rFonts w:hint="default" w:ascii="Times New Roman" w:hAnsi="Times New Roman" w:eastAsia="宋体" w:cs="Times New Roman"/>
+          <w:b w:val="0"/>
+          <w:kern w:val="2"/>
+          <w:sz w:val="24"/>
+          <w:szCs w:val="22"/>
+          <w:lang w:val="en-US" w:eastAsia="zh-CN" w:bidi="ar-SA"/>
+        </w:rPr>
+        <w:t>平台总览统计</w:t>
+      </w:r>
+      <w:r>
+        <w:rPr>
+          <w:rFonts w:hint="eastAsia" w:cs="Times New Roman"/>
+          <w:b w:val="0"/>
+          <w:kern w:val="2"/>
+          <w:sz w:val="24"/>
+          <w:szCs w:val="22"/>
+          <w:lang w:val="en-US" w:eastAsia="zh-CN" w:bidi="ar-SA"/>
+        </w:rPr>
+        <w:t>。</w:t>
+      </w:r>
+      <w:r>
+        <w:rPr>
+          <w:rFonts w:hint="default" w:ascii="Times New Roman" w:hAnsi="Times New Roman" w:eastAsia="宋体" w:cs="Times New Roman"/>
+          <w:b w:val="0"/>
+          <w:kern w:val="2"/>
+          <w:sz w:val="24"/>
+          <w:szCs w:val="22"/>
+          <w:lang w:val="en-US" w:eastAsia="zh-CN" w:bidi="ar-SA"/>
+        </w:rPr>
+        <w:t>聚合资讯总数、每周更新条数、领养申请总量和物资认领总量等全局指标，为管理员提供一站式的运营数据视图。</w:t>
       </w:r>
     </w:p>
     <w:p>
@@ -16234,15 +16528,11 @@
           <w:szCs w:val="22"/>
           <w:lang w:val="en-US" w:eastAsia="zh-CN" w:bidi="ar-SA"/>
         </w:rPr>
-        <w:t>（1）动物类别统计：分别统计猫类别（CAT）和狗类别（DOG）的动物数量，以饼图或柱状图展示救助动物的种类分布。</w:t>
-      </w:r>
-    </w:p>
-    <w:p>
-      <w:pPr>
-        <w:widowControl w:val="0"/>
-        <w:spacing w:line="300" w:lineRule="auto"/>
-        <w:ind w:left="0" w:leftChars="0" w:firstLine="480" w:firstLineChars="200"/>
-        <w:jc w:val="both"/>
+        <w:t xml:space="preserve">图表看板接口中所有的统计查询均使用 MyBatis-Plus 的 </w:t>
+      </w:r>
+      <w:bookmarkStart w:id="168" w:name="_GoBack"/>
+      <w:bookmarkEnd w:id="168"/>
+      <w:r>
         <w:rPr>
           <w:rFonts w:hint="default" w:ascii="Times New Roman" w:hAnsi="Times New Roman" w:eastAsia="宋体" w:cs="Times New Roman"/>
           <w:b w:val="0"/>
@@ -16251,125 +16541,7 @@
           <w:szCs w:val="22"/>
           <w:lang w:val="en-US" w:eastAsia="zh-CN" w:bidi="ar-SA"/>
         </w:rPr>
-      </w:pPr>
-      <w:r>
-        <w:rPr>
-          <w:rFonts w:hint="default" w:ascii="Times New Roman" w:hAnsi="Times New Roman" w:eastAsia="宋体" w:cs="Times New Roman"/>
-          <w:b w:val="0"/>
-          <w:kern w:val="2"/>
-          <w:sz w:val="24"/>
-          <w:szCs w:val="22"/>
-          <w:lang w:val="en-US" w:eastAsia="zh-CN" w:bidi="ar-SA"/>
-        </w:rPr>
-        <w:t>（2）动物状态统计：统计当前可领养（status=1）和已领养（status=0）的动物数量，反映救助站的整体领养进度。</w:t>
-      </w:r>
-    </w:p>
-    <w:p>
-      <w:pPr>
-        <w:widowControl w:val="0"/>
-        <w:spacing w:line="300" w:lineRule="auto"/>
-        <w:ind w:left="0" w:leftChars="0" w:firstLine="480" w:firstLineChars="200"/>
-        <w:jc w:val="both"/>
-        <w:rPr>
-          <w:rFonts w:hint="default" w:ascii="Times New Roman" w:hAnsi="Times New Roman" w:eastAsia="宋体" w:cs="Times New Roman"/>
-          <w:b w:val="0"/>
-          <w:kern w:val="2"/>
-          <w:sz w:val="24"/>
-          <w:szCs w:val="22"/>
-          <w:lang w:val="en-US" w:eastAsia="zh-CN" w:bidi="ar-SA"/>
-        </w:rPr>
-      </w:pPr>
-      <w:r>
-        <w:rPr>
-          <w:rFonts w:hint="default" w:ascii="Times New Roman" w:hAnsi="Times New Roman" w:eastAsia="宋体" w:cs="Times New Roman"/>
-          <w:b w:val="0"/>
-          <w:kern w:val="2"/>
-          <w:sz w:val="24"/>
-          <w:szCs w:val="22"/>
-          <w:lang w:val="en-US" w:eastAsia="zh-CN" w:bidi="ar-SA"/>
-        </w:rPr>
-        <w:t>（3）领养申请状态统计：分别统计待审核（status=0）、已通过（status=1）和已拒绝（status=2）的领养申请数量，帮助管理员掌握领养审批工作负载。</w:t>
-      </w:r>
-    </w:p>
-    <w:p>
-      <w:pPr>
-        <w:widowControl w:val="0"/>
-        <w:spacing w:line="300" w:lineRule="auto"/>
-        <w:ind w:left="0" w:leftChars="0" w:firstLine="480" w:firstLineChars="200"/>
-        <w:jc w:val="both"/>
-        <w:rPr>
-          <w:rFonts w:hint="default" w:ascii="Times New Roman" w:hAnsi="Times New Roman" w:eastAsia="宋体" w:cs="Times New Roman"/>
-          <w:b w:val="0"/>
-          <w:kern w:val="2"/>
-          <w:sz w:val="24"/>
-          <w:szCs w:val="22"/>
-          <w:lang w:val="en-US" w:eastAsia="zh-CN" w:bidi="ar-SA"/>
-        </w:rPr>
-      </w:pPr>
-      <w:r>
-        <w:rPr>
-          <w:rFonts w:hint="default" w:ascii="Times New Roman" w:hAnsi="Times New Roman" w:eastAsia="宋体" w:cs="Times New Roman"/>
-          <w:b w:val="0"/>
-          <w:kern w:val="2"/>
-          <w:sz w:val="24"/>
-          <w:szCs w:val="22"/>
-          <w:lang w:val="en-US" w:eastAsia="zh-CN" w:bidi="ar-SA"/>
-        </w:rPr>
-        <w:t>（4）物资认领状态统计：分别统计待审核、已通过和已拒绝的认领申请数量，监控物资认领的处理效率。</w:t>
-      </w:r>
-    </w:p>
-    <w:p>
-      <w:pPr>
-        <w:widowControl w:val="0"/>
-        <w:spacing w:line="300" w:lineRule="auto"/>
-        <w:ind w:left="0" w:leftChars="0" w:firstLine="480" w:firstLineChars="200"/>
-        <w:jc w:val="both"/>
-        <w:rPr>
-          <w:rFonts w:hint="default" w:ascii="Times New Roman" w:hAnsi="Times New Roman" w:eastAsia="宋体" w:cs="Times New Roman"/>
-          <w:b w:val="0"/>
-          <w:kern w:val="2"/>
-          <w:sz w:val="24"/>
-          <w:szCs w:val="22"/>
-          <w:lang w:val="en-US" w:eastAsia="zh-CN" w:bidi="ar-SA"/>
-        </w:rPr>
-      </w:pPr>
-      <w:r>
-        <w:rPr>
-          <w:rFonts w:hint="default" w:ascii="Times New Roman" w:hAnsi="Times New Roman" w:eastAsia="宋体" w:cs="Times New Roman"/>
-          <w:b w:val="0"/>
-          <w:kern w:val="2"/>
-          <w:sz w:val="24"/>
-          <w:szCs w:val="22"/>
-          <w:lang w:val="en-US" w:eastAsia="zh-CN" w:bidi="ar-SA"/>
-        </w:rPr>
-        <w:t>（5）平台总览统计：聚合资讯总数、每周更新条数、领养申请总量和物资认领总量等全局指标，为管理员提供一站式的运营数据视图。</w:t>
-      </w:r>
-    </w:p>
-    <w:p>
-      <w:pPr>
-        <w:widowControl w:val="0"/>
-        <w:spacing w:line="300" w:lineRule="auto"/>
-        <w:ind w:leftChars="0" w:firstLine="480" w:firstLineChars="200"/>
-        <w:jc w:val="both"/>
-        <w:rPr>
-          <w:rFonts w:hint="default" w:ascii="Times New Roman" w:hAnsi="Times New Roman" w:eastAsia="宋体" w:cs="Times New Roman"/>
-          <w:b w:val="0"/>
-          <w:kern w:val="2"/>
-          <w:sz w:val="24"/>
-          <w:szCs w:val="22"/>
-          <w:lang w:val="en-US" w:eastAsia="zh-CN" w:bidi="ar-SA"/>
-        </w:rPr>
-      </w:pPr>
-      <w:r>
-        <w:rPr>
-          <w:rFonts w:hint="default" w:ascii="Times New Roman" w:hAnsi="Times New Roman" w:eastAsia="宋体" w:cs="Times New Roman"/>
-          <w:b w:val="0"/>
-          <w:kern w:val="2"/>
-          <w:sz w:val="24"/>
-          <w:szCs w:val="22"/>
-          <w:lang w:val="en-US" w:eastAsia="zh-CN" w:bidi="ar-SA"/>
-        </w:rPr>
-        <w:t>图表看板接口中所有的统计查询均使用 MyBatis-Plus 的 LambdaQueryWrapper 构造等值查询条件，调用 count 方法进行计数。这种基于 MyBatis-Plus 条件构造器的统计方式避免了编写原生 SQL，查询效率高且代码可读性强，充分利用了 MyBatis-Plus 框架的便捷特性。</w:t>
+        <w:t>LambdaQueryWrapper 构造等值查询条件，调用 count 方法进行计数。这种基于 MyBatis-Plus 条件构造器的统计方式避免了编写原生 SQL，查询效率高且代码可读性强，充分利用了 MyBatis-Plus 框架的便捷特性。</w:t>
       </w:r>
     </w:p>
     <w:p>
@@ -22094,6 +22266,12 @@
             <w:insideH w:val="single" w:color="auto" w:sz="4" w:space="0"/>
             <w:insideV w:val="single" w:color="auto" w:sz="4" w:space="0"/>
           </w:tblBorders>
+          <w:tblCellMar>
+            <w:top w:w="0" w:type="dxa"/>
+            <w:left w:w="10" w:type="dxa"/>
+            <w:bottom w:w="0" w:type="dxa"/>
+            <w:right w:w="10" w:type="dxa"/>
+          </w:tblCellMar>
         </w:tblPrEx>
         <w:tc>
           <w:tcPr>
@@ -23019,6 +23197,12 @@
             <w:insideH w:val="single" w:color="auto" w:sz="4" w:space="0"/>
             <w:insideV w:val="single" w:color="auto" w:sz="4" w:space="0"/>
           </w:tblBorders>
+          <w:tblCellMar>
+            <w:top w:w="0" w:type="dxa"/>
+            <w:left w:w="10" w:type="dxa"/>
+            <w:bottom w:w="0" w:type="dxa"/>
+            <w:right w:w="10" w:type="dxa"/>
+          </w:tblCellMar>
         </w:tblPrEx>
         <w:tc>
           <w:tcPr>
@@ -23814,6 +23998,12 @@
             <w:insideH w:val="single" w:color="auto" w:sz="4" w:space="0"/>
             <w:insideV w:val="single" w:color="auto" w:sz="4" w:space="0"/>
           </w:tblBorders>
+          <w:tblCellMar>
+            <w:top w:w="0" w:type="dxa"/>
+            <w:left w:w="10" w:type="dxa"/>
+            <w:bottom w:w="0" w:type="dxa"/>
+            <w:right w:w="10" w:type="dxa"/>
+          </w:tblCellMar>
         </w:tblPrEx>
         <w:tc>
           <w:tcPr>

</xml_diff>